<commit_message>
(FEAT: livre de bord)Ajout des contrats et des voiles par allures a revoir
</commit_message>
<xml_diff>
--- a/ProjetXLS/JournalDeBord/LivreDeBord-PageGarde.docx
+++ b/ProjetXLS/JournalDeBord/LivreDeBord-PageGarde.docx
@@ -1,11 +1,12 @@
 
 <file path=word/document.xml><?xml version="1.0" encoding="utf-8"?>
-<w:document xmlns:wpc="http://schemas.microsoft.com/office/word/2010/wordprocessingCanvas" xmlns:cx="http://schemas.microsoft.com/office/drawing/2014/chartex" xmlns:cx1="http://schemas.microsoft.com/office/drawing/2015/9/8/chartex" xmlns:cx2="http://schemas.microsoft.com/office/drawing/2015/10/21/chartex" xmlns:cx3="http://schemas.microsoft.com/office/drawing/2016/5/9/chartex" xmlns:cx4="http://schemas.microsoft.com/office/drawing/2016/5/10/chartex" xmlns:cx5="http://schemas.microsoft.com/office/drawing/2016/5/11/chartex" xmlns:cx6="http://schemas.microsoft.com/office/drawing/2016/5/12/chartex" xmlns:cx7="http://schemas.microsoft.com/office/drawing/2016/5/13/chartex" xmlns:cx8="http://schemas.microsoft.com/office/drawing/2016/5/14/chartex" xmlns:mc="http://schemas.openxmlformats.org/markup-compatibility/2006" xmlns:aink="http://schemas.microsoft.com/office/drawing/2016/ink" xmlns:am3d="http://schemas.microsoft.com/office/drawing/2017/model3d" xmlns:o="urn:schemas-microsoft-com:office:office" xmlns:r="http://schemas.openxmlformats.org/officeDocument/2006/relationships" xmlns:m="http://schemas.openxmlformats.org/officeDocument/2006/math" xmlns:v="urn:schemas-microsoft-com:vml" xmlns:wp14="http://schemas.microsoft.com/office/word/2010/wordprocessingDrawing" xmlns:wp="http://schemas.openxmlformats.org/drawingml/2006/wordprocessingDrawing" xmlns:w10="urn:schemas-microsoft-com:office:word" xmlns:w="http://schemas.openxmlformats.org/wordprocessingml/2006/main" xmlns:w14="http://schemas.microsoft.com/office/word/2010/wordml" xmlns:w15="http://schemas.microsoft.com/office/word/2012/wordml" xmlns:w16cex="http://schemas.microsoft.com/office/word/2018/wordml/cex" xmlns:w16cid="http://schemas.microsoft.com/office/word/2016/wordml/cid" xmlns:w16="http://schemas.microsoft.com/office/word/2018/wordml" xmlns:w16sdtdh="http://schemas.microsoft.com/office/word/2020/wordml/sdtdatahash" xmlns:w16se="http://schemas.microsoft.com/office/word/2015/wordml/symex" xmlns:wpg="http://schemas.microsoft.com/office/word/2010/wordprocessingGroup" xmlns:wpi="http://schemas.microsoft.com/office/word/2010/wordprocessingInk" xmlns:wne="http://schemas.microsoft.com/office/word/2006/wordml" xmlns:wps="http://schemas.microsoft.com/office/word/2010/wordprocessingShape" mc:Ignorable="w14 w15 w16se w16cid w16 w16cex w16sdtdh wp14">
+<w:document xmlns:wpc="http://schemas.microsoft.com/office/word/2010/wordprocessingCanvas" xmlns:cx="http://schemas.microsoft.com/office/drawing/2014/chartex" xmlns:cx1="http://schemas.microsoft.com/office/drawing/2015/9/8/chartex" xmlns:cx2="http://schemas.microsoft.com/office/drawing/2015/10/21/chartex" xmlns:cx3="http://schemas.microsoft.com/office/drawing/2016/5/9/chartex" xmlns:cx4="http://schemas.microsoft.com/office/drawing/2016/5/10/chartex" xmlns:cx5="http://schemas.microsoft.com/office/drawing/2016/5/11/chartex" xmlns:cx6="http://schemas.microsoft.com/office/drawing/2016/5/12/chartex" xmlns:cx7="http://schemas.microsoft.com/office/drawing/2016/5/13/chartex" xmlns:cx8="http://schemas.microsoft.com/office/drawing/2016/5/14/chartex" xmlns:mc="http://schemas.openxmlformats.org/markup-compatibility/2006" xmlns:aink="http://schemas.microsoft.com/office/drawing/2016/ink" xmlns:am3d="http://schemas.microsoft.com/office/drawing/2017/model3d" xmlns:o="urn:schemas-microsoft-com:office:office" xmlns:oel="http://schemas.microsoft.com/office/2019/extlst" xmlns:r="http://schemas.openxmlformats.org/officeDocument/2006/relationships" xmlns:m="http://schemas.openxmlformats.org/officeDocument/2006/math" xmlns:v="urn:schemas-microsoft-com:vml" xmlns:wp14="http://schemas.microsoft.com/office/word/2010/wordprocessingDrawing" xmlns:wp="http://schemas.openxmlformats.org/drawingml/2006/wordprocessingDrawing" xmlns:w10="urn:schemas-microsoft-com:office:word" xmlns:w="http://schemas.openxmlformats.org/wordprocessingml/2006/main" xmlns:w14="http://schemas.microsoft.com/office/word/2010/wordml" xmlns:w15="http://schemas.microsoft.com/office/word/2012/wordml" xmlns:w16cex="http://schemas.microsoft.com/office/word/2018/wordml/cex" xmlns:w16cid="http://schemas.microsoft.com/office/word/2016/wordml/cid" xmlns:w16="http://schemas.microsoft.com/office/word/2018/wordml" xmlns:w16du="http://schemas.microsoft.com/office/word/2023/wordml/word16du" xmlns:w16sdtdh="http://schemas.microsoft.com/office/word/2020/wordml/sdtdatahash" xmlns:w16sdtfl="http://schemas.microsoft.com/office/word/2024/wordml/sdtformatlock" xmlns:w16se="http://schemas.microsoft.com/office/word/2015/wordml/symex" xmlns:wpg="http://schemas.microsoft.com/office/word/2010/wordprocessingGroup" xmlns:wpi="http://schemas.microsoft.com/office/word/2010/wordprocessingInk" xmlns:wne="http://schemas.microsoft.com/office/word/2006/wordml" xmlns:wps="http://schemas.microsoft.com/office/word/2010/wordprocessingShape" mc:Ignorable="w14 w15 w16se w16cid w16 w16cex w16sdtdh w16sdtfl w16du wp14">
   <w:body>
     <w:p>
       <w:pPr>
         <w:jc w:val="center"/>
         <w:rPr>
+          <w:rFonts w:ascii="Roboto" w:hAnsi="Roboto"/>
           <w:lang w:val="fr-FR"/>
         </w:rPr>
       </w:pPr>
@@ -14,11 +15,13 @@
       <w:pPr>
         <w:jc w:val="center"/>
         <w:rPr>
-          <w:lang w:val="fr-FR"/>
-        </w:rPr>
-      </w:pPr>
-      <w:r>
-        <w:rPr>
+          <w:rFonts w:ascii="Roboto" w:hAnsi="Roboto"/>
+          <w:lang w:val="fr-FR"/>
+        </w:rPr>
+      </w:pPr>
+      <w:r>
+        <w:rPr>
+          <w:rFonts w:ascii="Roboto" w:hAnsi="Roboto"/>
           <w:noProof/>
           <w:lang w:val="fr-FR"/>
         </w:rPr>
@@ -76,13 +79,14 @@
       <w:pPr>
         <w:jc w:val="center"/>
         <w:rPr>
+          <w:rFonts w:ascii="Roboto" w:hAnsi="Roboto"/>
           <w:lang w:val="fr-FR"/>
         </w:rPr>
       </w:pPr>
     </w:p>
     <w:tbl>
       <w:tblPr>
-        <w:tblStyle w:val="TableGrid"/>
+        <w:tblStyle w:val="Grilledutableau"/>
         <w:tblW w:w="11074" w:type="dxa"/>
         <w:tblLook w:val="04A0" w:firstRow="1" w:lastRow="0" w:firstColumn="1" w:lastColumn="0" w:noHBand="0" w:noVBand="1"/>
       </w:tblPr>
@@ -116,6 +120,7 @@
             <w:pPr>
               <w:jc w:val="center"/>
               <w:rPr>
+                <w:rFonts w:ascii="Roboto" w:hAnsi="Roboto"/>
                 <w:b/>
                 <w:bCs/>
                 <w:color w:val="2E74B5" w:themeColor="accent5" w:themeShade="BF"/>
@@ -126,6 +131,7 @@
             </w:pPr>
             <w:r>
               <w:rPr>
+                <w:rFonts w:ascii="Roboto" w:hAnsi="Roboto"/>
                 <w:b/>
                 <w:bCs/>
                 <w:color w:val="2E74B5" w:themeColor="accent5" w:themeShade="BF"/>
@@ -140,6 +146,7 @@
             <w:pPr>
               <w:jc w:val="center"/>
               <w:rPr>
+                <w:rFonts w:ascii="Roboto" w:hAnsi="Roboto"/>
                 <w:b/>
                 <w:bCs/>
                 <w:lang w:val="fr-FR"/>
@@ -170,7 +177,7 @@
             <w:pPr>
               <w:jc w:val="center"/>
               <w:rPr>
-                <w:rFonts w:ascii="Times New Roman" w:hAnsi="Times New Roman" w:cs="Times New Roman"/>
+                <w:rFonts w:ascii="Roboto" w:hAnsi="Roboto" w:cs="Times New Roman"/>
                 <w:b/>
                 <w:bCs/>
                 <w:color w:val="2E74B5" w:themeColor="accent5" w:themeShade="BF"/>
@@ -182,7 +189,7 @@
             <w:pPr>
               <w:jc w:val="center"/>
               <w:rPr>
-                <w:rFonts w:ascii="Times New Roman" w:hAnsi="Times New Roman" w:cs="Times New Roman"/>
+                <w:rFonts w:ascii="Roboto" w:hAnsi="Roboto" w:cs="Times New Roman"/>
                 <w:b/>
                 <w:bCs/>
                 <w:color w:val="2E74B5" w:themeColor="accent5" w:themeShade="BF"/>
@@ -194,7 +201,7 @@
             <w:pPr>
               <w:jc w:val="center"/>
               <w:rPr>
-                <w:rFonts w:ascii="Times New Roman" w:hAnsi="Times New Roman" w:cs="Times New Roman"/>
+                <w:rFonts w:ascii="Roboto" w:hAnsi="Roboto" w:cs="Times New Roman"/>
                 <w:b/>
                 <w:bCs/>
                 <w:color w:val="2E74B5" w:themeColor="accent5" w:themeShade="BF"/>
@@ -206,7 +213,7 @@
             <w:pPr>
               <w:jc w:val="center"/>
               <w:rPr>
-                <w:rFonts w:ascii="Times New Roman" w:hAnsi="Times New Roman" w:cs="Times New Roman"/>
+                <w:rFonts w:ascii="Roboto" w:hAnsi="Roboto" w:cs="Times New Roman"/>
                 <w:b/>
                 <w:bCs/>
                 <w:color w:val="2E74B5" w:themeColor="accent5" w:themeShade="BF"/>
@@ -218,7 +225,7 @@
             <w:pPr>
               <w:jc w:val="center"/>
               <w:rPr>
-                <w:rFonts w:ascii="Times New Roman" w:hAnsi="Times New Roman" w:cs="Times New Roman"/>
+                <w:rFonts w:ascii="Roboto" w:hAnsi="Roboto" w:cs="Times New Roman"/>
                 <w:b/>
                 <w:bCs/>
                 <w:color w:val="2E74B5" w:themeColor="accent5" w:themeShade="BF"/>
@@ -230,7 +237,7 @@
             <w:pPr>
               <w:jc w:val="center"/>
               <w:rPr>
-                <w:rFonts w:ascii="Times New Roman" w:hAnsi="Times New Roman" w:cs="Times New Roman"/>
+                <w:rFonts w:ascii="Roboto" w:hAnsi="Roboto" w:cs="Times New Roman"/>
                 <w:b/>
                 <w:bCs/>
                 <w:color w:val="2E74B5" w:themeColor="accent5" w:themeShade="BF"/>
@@ -242,7 +249,7 @@
             <w:pPr>
               <w:jc w:val="center"/>
               <w:rPr>
-                <w:rFonts w:ascii="Times New Roman" w:hAnsi="Times New Roman" w:cs="Times New Roman"/>
+                <w:rFonts w:ascii="Roboto" w:hAnsi="Roboto" w:cs="Times New Roman"/>
                 <w:b/>
                 <w:bCs/>
                 <w:color w:val="2E74B5" w:themeColor="accent5" w:themeShade="BF"/>
@@ -271,29 +278,35 @@
             <w:pPr>
               <w:jc w:val="right"/>
               <w:rPr>
-                <w:rFonts w:ascii="Times New Roman" w:hAnsi="Times New Roman" w:cs="Times New Roman"/>
-                <w:color w:val="2E74B5" w:themeColor="accent5" w:themeShade="BF"/>
-                <w:sz w:val="28"/>
-                <w:szCs w:val="28"/>
-                <w:lang w:val="fr-FR"/>
-              </w:rPr>
-            </w:pPr>
-            <w:r>
-              <w:rPr>
-                <w:rFonts w:ascii="Times New Roman" w:hAnsi="Times New Roman" w:cs="Times New Roman"/>
-                <w:color w:val="2E74B5" w:themeColor="accent5" w:themeShade="BF"/>
-                <w:sz w:val="28"/>
-                <w:szCs w:val="28"/>
+                <w:rFonts w:ascii="Roboto" w:hAnsi="Roboto" w:cs="Times New Roman"/>
+                <w:b/>
+                <w:bCs/>
+                <w:color w:val="2E74B5" w:themeColor="accent5" w:themeShade="BF"/>
+                <w:sz w:val="24"/>
+                <w:szCs w:val="24"/>
+                <w:lang w:val="fr-FR"/>
+              </w:rPr>
+            </w:pPr>
+            <w:r>
+              <w:rPr>
+                <w:rFonts w:ascii="Roboto" w:hAnsi="Roboto" w:cs="Times New Roman"/>
+                <w:b/>
+                <w:bCs/>
+                <w:color w:val="2E74B5" w:themeColor="accent5" w:themeShade="BF"/>
+                <w:sz w:val="24"/>
+                <w:szCs w:val="24"/>
                 <w:lang w:val="fr-FR"/>
               </w:rPr>
               <w:t xml:space="preserve">Nom du </w:t>
             </w:r>
             <w:r>
               <w:rPr>
-                <w:rFonts w:ascii="Times New Roman" w:hAnsi="Times New Roman" w:cs="Times New Roman"/>
-                <w:color w:val="2E74B5" w:themeColor="accent5" w:themeShade="BF"/>
-                <w:sz w:val="28"/>
-                <w:szCs w:val="28"/>
+                <w:rFonts w:ascii="Roboto" w:hAnsi="Roboto" w:cs="Times New Roman"/>
+                <w:b/>
+                <w:bCs/>
+                <w:color w:val="2E74B5" w:themeColor="accent5" w:themeShade="BF"/>
+                <w:sz w:val="24"/>
+                <w:szCs w:val="24"/>
                 <w:lang w:val="fr-FR"/>
               </w:rPr>
               <w:t>bateau :</w:t>
@@ -316,20 +329,24 @@
                 <w:tab w:val="left" w:leader="dot" w:pos="2355"/>
               </w:tabs>
               <w:rPr>
-                <w:rFonts w:ascii="Times New Roman" w:hAnsi="Times New Roman" w:cs="Times New Roman"/>
-                <w:color w:val="2E74B5" w:themeColor="accent5" w:themeShade="BF"/>
-                <w:sz w:val="28"/>
-                <w:szCs w:val="28"/>
+                <w:rFonts w:ascii="Roboto" w:hAnsi="Roboto" w:cs="Times New Roman"/>
+                <w:b/>
+                <w:bCs/>
+                <w:color w:val="2E74B5" w:themeColor="accent5" w:themeShade="BF"/>
+                <w:sz w:val="24"/>
+                <w:szCs w:val="24"/>
                 <w:vertAlign w:val="subscript"/>
                 <w:lang w:val="fr-FR"/>
               </w:rPr>
             </w:pPr>
             <w:r>
               <w:rPr>
-                <w:rFonts w:ascii="Times New Roman" w:hAnsi="Times New Roman" w:cs="Times New Roman"/>
+                <w:rFonts w:ascii="Roboto" w:hAnsi="Roboto" w:cs="Times New Roman"/>
+                <w:b/>
+                <w:bCs/>
                 <w:color w:val="DEEAF6" w:themeColor="accent5" w:themeTint="33"/>
-                <w:sz w:val="28"/>
-                <w:szCs w:val="28"/>
+                <w:sz w:val="24"/>
+                <w:szCs w:val="24"/>
                 <w:vertAlign w:val="subscript"/>
                 <w:lang w:val="fr-FR"/>
               </w:rPr>
@@ -351,19 +368,23 @@
             <w:pPr>
               <w:jc w:val="right"/>
               <w:rPr>
-                <w:rFonts w:ascii="Times New Roman" w:hAnsi="Times New Roman" w:cs="Times New Roman"/>
-                <w:color w:val="2E74B5" w:themeColor="accent5" w:themeShade="BF"/>
-                <w:sz w:val="28"/>
-                <w:szCs w:val="28"/>
-                <w:lang w:val="fr-FR"/>
-              </w:rPr>
-            </w:pPr>
-            <w:r>
-              <w:rPr>
-                <w:rFonts w:ascii="Times New Roman" w:hAnsi="Times New Roman" w:cs="Times New Roman"/>
-                <w:color w:val="2E74B5" w:themeColor="accent5" w:themeShade="BF"/>
-                <w:sz w:val="28"/>
-                <w:szCs w:val="28"/>
+                <w:rFonts w:ascii="Roboto" w:hAnsi="Roboto" w:cs="Times New Roman"/>
+                <w:b/>
+                <w:bCs/>
+                <w:color w:val="2E74B5" w:themeColor="accent5" w:themeShade="BF"/>
+                <w:sz w:val="24"/>
+                <w:szCs w:val="24"/>
+                <w:lang w:val="fr-FR"/>
+              </w:rPr>
+            </w:pPr>
+            <w:r>
+              <w:rPr>
+                <w:rFonts w:ascii="Roboto" w:hAnsi="Roboto" w:cs="Times New Roman"/>
+                <w:b/>
+                <w:bCs/>
+                <w:color w:val="2E74B5" w:themeColor="accent5" w:themeShade="BF"/>
+                <w:sz w:val="24"/>
+                <w:szCs w:val="24"/>
                 <w:lang w:val="fr-FR"/>
               </w:rPr>
               <w:t>Propriétaire :</w:t>
@@ -385,19 +406,23 @@
             <w:pPr>
               <w:jc w:val="center"/>
               <w:rPr>
-                <w:rFonts w:ascii="Times New Roman" w:hAnsi="Times New Roman" w:cs="Times New Roman"/>
-                <w:color w:val="2E74B5" w:themeColor="accent5" w:themeShade="BF"/>
-                <w:sz w:val="28"/>
-                <w:szCs w:val="28"/>
-                <w:lang w:val="fr-FR"/>
-              </w:rPr>
-            </w:pPr>
-            <w:r>
-              <w:rPr>
-                <w:rFonts w:ascii="Times New Roman" w:hAnsi="Times New Roman" w:cs="Times New Roman"/>
+                <w:rFonts w:ascii="Roboto" w:hAnsi="Roboto" w:cs="Times New Roman"/>
+                <w:b/>
+                <w:bCs/>
+                <w:color w:val="2E74B5" w:themeColor="accent5" w:themeShade="BF"/>
+                <w:sz w:val="24"/>
+                <w:szCs w:val="24"/>
+                <w:lang w:val="fr-FR"/>
+              </w:rPr>
+            </w:pPr>
+            <w:r>
+              <w:rPr>
+                <w:rFonts w:ascii="Roboto" w:hAnsi="Roboto" w:cs="Times New Roman"/>
+                <w:b/>
+                <w:bCs/>
                 <w:color w:val="DEEAF6" w:themeColor="accent5" w:themeTint="33"/>
-                <w:sz w:val="28"/>
-                <w:szCs w:val="28"/>
+                <w:sz w:val="24"/>
+                <w:szCs w:val="24"/>
                 <w:vertAlign w:val="subscript"/>
                 <w:lang w:val="fr-FR"/>
               </w:rPr>
@@ -425,29 +450,35 @@
             <w:pPr>
               <w:jc w:val="right"/>
               <w:rPr>
-                <w:rFonts w:ascii="Times New Roman" w:hAnsi="Times New Roman" w:cs="Times New Roman"/>
-                <w:color w:val="2E74B5" w:themeColor="accent5" w:themeShade="BF"/>
-                <w:sz w:val="28"/>
-                <w:szCs w:val="28"/>
-                <w:lang w:val="fr-FR"/>
-              </w:rPr>
-            </w:pPr>
-            <w:r>
-              <w:rPr>
-                <w:rFonts w:ascii="Times New Roman" w:hAnsi="Times New Roman" w:cs="Times New Roman"/>
-                <w:color w:val="2E74B5" w:themeColor="accent5" w:themeShade="BF"/>
-                <w:sz w:val="28"/>
-                <w:szCs w:val="28"/>
+                <w:rFonts w:ascii="Roboto" w:hAnsi="Roboto" w:cs="Times New Roman"/>
+                <w:b/>
+                <w:bCs/>
+                <w:color w:val="2E74B5" w:themeColor="accent5" w:themeShade="BF"/>
+                <w:sz w:val="24"/>
+                <w:szCs w:val="24"/>
+                <w:lang w:val="fr-FR"/>
+              </w:rPr>
+            </w:pPr>
+            <w:r>
+              <w:rPr>
+                <w:rFonts w:ascii="Roboto" w:hAnsi="Roboto" w:cs="Times New Roman"/>
+                <w:b/>
+                <w:bCs/>
+                <w:color w:val="2E74B5" w:themeColor="accent5" w:themeShade="BF"/>
+                <w:sz w:val="24"/>
+                <w:szCs w:val="24"/>
                 <w:lang w:val="fr-FR"/>
               </w:rPr>
               <w:t xml:space="preserve">Port </w:t>
             </w:r>
             <w:r>
               <w:rPr>
-                <w:rFonts w:ascii="Times New Roman" w:hAnsi="Times New Roman" w:cs="Times New Roman"/>
-                <w:color w:val="2E74B5" w:themeColor="accent5" w:themeShade="BF"/>
-                <w:sz w:val="28"/>
-                <w:szCs w:val="28"/>
+                <w:rFonts w:ascii="Roboto" w:hAnsi="Roboto" w:cs="Times New Roman"/>
+                <w:b/>
+                <w:bCs/>
+                <w:color w:val="2E74B5" w:themeColor="accent5" w:themeShade="BF"/>
+                <w:sz w:val="24"/>
+                <w:szCs w:val="24"/>
                 <w:lang w:val="fr-FR"/>
               </w:rPr>
               <w:t>d’attache :</w:t>
@@ -471,19 +502,23 @@
               </w:tabs>
               <w:jc w:val="center"/>
               <w:rPr>
-                <w:rFonts w:ascii="Times New Roman" w:hAnsi="Times New Roman" w:cs="Times New Roman"/>
-                <w:color w:val="2E74B5" w:themeColor="accent5" w:themeShade="BF"/>
-                <w:sz w:val="28"/>
-                <w:szCs w:val="28"/>
-                <w:lang w:val="fr-FR"/>
-              </w:rPr>
-            </w:pPr>
-            <w:r>
-              <w:rPr>
-                <w:rFonts w:ascii="Times New Roman" w:hAnsi="Times New Roman" w:cs="Times New Roman"/>
+                <w:rFonts w:ascii="Roboto" w:hAnsi="Roboto" w:cs="Times New Roman"/>
+                <w:b/>
+                <w:bCs/>
+                <w:color w:val="2E74B5" w:themeColor="accent5" w:themeShade="BF"/>
+                <w:sz w:val="24"/>
+                <w:szCs w:val="24"/>
+                <w:lang w:val="fr-FR"/>
+              </w:rPr>
+            </w:pPr>
+            <w:r>
+              <w:rPr>
+                <w:rFonts w:ascii="Roboto" w:hAnsi="Roboto" w:cs="Times New Roman"/>
+                <w:b/>
+                <w:bCs/>
                 <w:color w:val="DEEAF6" w:themeColor="accent5" w:themeTint="33"/>
-                <w:sz w:val="28"/>
-                <w:szCs w:val="28"/>
+                <w:sz w:val="24"/>
+                <w:szCs w:val="24"/>
                 <w:vertAlign w:val="subscript"/>
                 <w:lang w:val="fr-FR"/>
               </w:rPr>
@@ -505,19 +540,23 @@
             <w:pPr>
               <w:jc w:val="right"/>
               <w:rPr>
-                <w:rFonts w:ascii="Times New Roman" w:hAnsi="Times New Roman" w:cs="Times New Roman"/>
-                <w:color w:val="2E74B5" w:themeColor="accent5" w:themeShade="BF"/>
-                <w:sz w:val="28"/>
-                <w:szCs w:val="28"/>
-                <w:lang w:val="fr-FR"/>
-              </w:rPr>
-            </w:pPr>
-            <w:r>
-              <w:rPr>
-                <w:rFonts w:ascii="Times New Roman" w:hAnsi="Times New Roman" w:cs="Times New Roman"/>
-                <w:color w:val="2E74B5" w:themeColor="accent5" w:themeShade="BF"/>
-                <w:sz w:val="28"/>
-                <w:szCs w:val="28"/>
+                <w:rFonts w:ascii="Roboto" w:hAnsi="Roboto" w:cs="Times New Roman"/>
+                <w:b/>
+                <w:bCs/>
+                <w:color w:val="2E74B5" w:themeColor="accent5" w:themeShade="BF"/>
+                <w:sz w:val="24"/>
+                <w:szCs w:val="24"/>
+                <w:lang w:val="fr-FR"/>
+              </w:rPr>
+            </w:pPr>
+            <w:r>
+              <w:rPr>
+                <w:rFonts w:ascii="Roboto" w:hAnsi="Roboto" w:cs="Times New Roman"/>
+                <w:b/>
+                <w:bCs/>
+                <w:color w:val="2E74B5" w:themeColor="accent5" w:themeShade="BF"/>
+                <w:sz w:val="24"/>
+                <w:szCs w:val="24"/>
                 <w:lang w:val="fr-FR"/>
               </w:rPr>
               <w:t>Téléphone :</w:t>
@@ -539,19 +578,23 @@
             <w:pPr>
               <w:jc w:val="center"/>
               <w:rPr>
-                <w:rFonts w:ascii="Times New Roman" w:hAnsi="Times New Roman" w:cs="Times New Roman"/>
-                <w:color w:val="2E74B5" w:themeColor="accent5" w:themeShade="BF"/>
-                <w:sz w:val="28"/>
-                <w:szCs w:val="28"/>
-                <w:lang w:val="fr-FR"/>
-              </w:rPr>
-            </w:pPr>
-            <w:r>
-              <w:rPr>
-                <w:rFonts w:ascii="Times New Roman" w:hAnsi="Times New Roman" w:cs="Times New Roman"/>
+                <w:rFonts w:ascii="Roboto" w:hAnsi="Roboto" w:cs="Times New Roman"/>
+                <w:b/>
+                <w:bCs/>
+                <w:color w:val="2E74B5" w:themeColor="accent5" w:themeShade="BF"/>
+                <w:sz w:val="24"/>
+                <w:szCs w:val="24"/>
+                <w:lang w:val="fr-FR"/>
+              </w:rPr>
+            </w:pPr>
+            <w:r>
+              <w:rPr>
+                <w:rFonts w:ascii="Roboto" w:hAnsi="Roboto" w:cs="Times New Roman"/>
+                <w:b/>
+                <w:bCs/>
                 <w:color w:val="DEEAF6" w:themeColor="accent5" w:themeTint="33"/>
-                <w:sz w:val="28"/>
-                <w:szCs w:val="28"/>
+                <w:sz w:val="24"/>
+                <w:szCs w:val="24"/>
                 <w:vertAlign w:val="subscript"/>
                 <w:lang w:val="fr-FR"/>
               </w:rPr>
@@ -579,29 +622,35 @@
             <w:pPr>
               <w:jc w:val="right"/>
               <w:rPr>
-                <w:rFonts w:ascii="Times New Roman" w:hAnsi="Times New Roman" w:cs="Times New Roman"/>
-                <w:color w:val="2E74B5" w:themeColor="accent5" w:themeShade="BF"/>
-                <w:sz w:val="28"/>
-                <w:szCs w:val="28"/>
-                <w:lang w:val="fr-FR"/>
-              </w:rPr>
-            </w:pPr>
-            <w:r>
-              <w:rPr>
-                <w:rFonts w:ascii="Times New Roman" w:hAnsi="Times New Roman" w:cs="Times New Roman"/>
-                <w:color w:val="2E74B5" w:themeColor="accent5" w:themeShade="BF"/>
-                <w:sz w:val="28"/>
-                <w:szCs w:val="28"/>
+                <w:rFonts w:ascii="Roboto" w:hAnsi="Roboto" w:cs="Times New Roman"/>
+                <w:b/>
+                <w:bCs/>
+                <w:color w:val="2E74B5" w:themeColor="accent5" w:themeShade="BF"/>
+                <w:sz w:val="24"/>
+                <w:szCs w:val="24"/>
+                <w:lang w:val="fr-FR"/>
+              </w:rPr>
+            </w:pPr>
+            <w:r>
+              <w:rPr>
+                <w:rFonts w:ascii="Roboto" w:hAnsi="Roboto" w:cs="Times New Roman"/>
+                <w:b/>
+                <w:bCs/>
+                <w:color w:val="2E74B5" w:themeColor="accent5" w:themeShade="BF"/>
+                <w:sz w:val="24"/>
+                <w:szCs w:val="24"/>
                 <w:lang w:val="fr-FR"/>
               </w:rPr>
               <w:t>N° immatriculation</w:t>
             </w:r>
             <w:r>
               <w:rPr>
-                <w:rFonts w:ascii="Times New Roman" w:hAnsi="Times New Roman" w:cs="Times New Roman"/>
-                <w:color w:val="2E74B5" w:themeColor="accent5" w:themeShade="BF"/>
-                <w:sz w:val="28"/>
-                <w:szCs w:val="28"/>
+                <w:rFonts w:ascii="Roboto" w:hAnsi="Roboto" w:cs="Times New Roman"/>
+                <w:b/>
+                <w:bCs/>
+                <w:color w:val="2E74B5" w:themeColor="accent5" w:themeShade="BF"/>
+                <w:sz w:val="24"/>
+                <w:szCs w:val="24"/>
                 <w:lang w:val="fr-FR"/>
               </w:rPr>
               <w:t> :</w:t>
@@ -625,19 +674,23 @@
               </w:tabs>
               <w:jc w:val="center"/>
               <w:rPr>
-                <w:rFonts w:ascii="Times New Roman" w:hAnsi="Times New Roman" w:cs="Times New Roman"/>
-                <w:color w:val="2E74B5" w:themeColor="accent5" w:themeShade="BF"/>
-                <w:sz w:val="28"/>
-                <w:szCs w:val="28"/>
-                <w:lang w:val="fr-FR"/>
-              </w:rPr>
-            </w:pPr>
-            <w:r>
-              <w:rPr>
-                <w:rFonts w:ascii="Times New Roman" w:hAnsi="Times New Roman" w:cs="Times New Roman"/>
+                <w:rFonts w:ascii="Roboto" w:hAnsi="Roboto" w:cs="Times New Roman"/>
+                <w:b/>
+                <w:bCs/>
+                <w:color w:val="2E74B5" w:themeColor="accent5" w:themeShade="BF"/>
+                <w:sz w:val="24"/>
+                <w:szCs w:val="24"/>
+                <w:lang w:val="fr-FR"/>
+              </w:rPr>
+            </w:pPr>
+            <w:r>
+              <w:rPr>
+                <w:rFonts w:ascii="Roboto" w:hAnsi="Roboto" w:cs="Times New Roman"/>
+                <w:b/>
+                <w:bCs/>
                 <w:color w:val="DEEAF6" w:themeColor="accent5" w:themeTint="33"/>
-                <w:sz w:val="28"/>
-                <w:szCs w:val="28"/>
+                <w:sz w:val="24"/>
+                <w:szCs w:val="24"/>
                 <w:vertAlign w:val="subscript"/>
                 <w:lang w:val="fr-FR"/>
               </w:rPr>
@@ -659,19 +712,23 @@
             <w:pPr>
               <w:jc w:val="right"/>
               <w:rPr>
-                <w:rFonts w:ascii="Times New Roman" w:hAnsi="Times New Roman" w:cs="Times New Roman"/>
-                <w:color w:val="2E74B5" w:themeColor="accent5" w:themeShade="BF"/>
-                <w:sz w:val="28"/>
-                <w:szCs w:val="28"/>
-                <w:lang w:val="fr-FR"/>
-              </w:rPr>
-            </w:pPr>
-            <w:r>
-              <w:rPr>
-                <w:rFonts w:ascii="Times New Roman" w:hAnsi="Times New Roman" w:cs="Times New Roman"/>
-                <w:color w:val="2E74B5" w:themeColor="accent5" w:themeShade="BF"/>
-                <w:sz w:val="28"/>
-                <w:szCs w:val="28"/>
+                <w:rFonts w:ascii="Roboto" w:hAnsi="Roboto" w:cs="Times New Roman"/>
+                <w:b/>
+                <w:bCs/>
+                <w:color w:val="2E74B5" w:themeColor="accent5" w:themeShade="BF"/>
+                <w:sz w:val="24"/>
+                <w:szCs w:val="24"/>
+                <w:lang w:val="fr-FR"/>
+              </w:rPr>
+            </w:pPr>
+            <w:r>
+              <w:rPr>
+                <w:rFonts w:ascii="Roboto" w:hAnsi="Roboto" w:cs="Times New Roman"/>
+                <w:b/>
+                <w:bCs/>
+                <w:color w:val="2E74B5" w:themeColor="accent5" w:themeShade="BF"/>
+                <w:sz w:val="24"/>
+                <w:szCs w:val="24"/>
                 <w:lang w:val="fr-FR"/>
               </w:rPr>
               <w:t>Assurance :</w:t>
@@ -693,19 +750,23 @@
             <w:pPr>
               <w:jc w:val="center"/>
               <w:rPr>
-                <w:rFonts w:ascii="Times New Roman" w:hAnsi="Times New Roman" w:cs="Times New Roman"/>
-                <w:color w:val="2E74B5" w:themeColor="accent5" w:themeShade="BF"/>
-                <w:sz w:val="28"/>
-                <w:szCs w:val="28"/>
-                <w:lang w:val="fr-FR"/>
-              </w:rPr>
-            </w:pPr>
-            <w:r>
-              <w:rPr>
-                <w:rFonts w:ascii="Times New Roman" w:hAnsi="Times New Roman" w:cs="Times New Roman"/>
+                <w:rFonts w:ascii="Roboto" w:hAnsi="Roboto" w:cs="Times New Roman"/>
+                <w:b/>
+                <w:bCs/>
+                <w:color w:val="2E74B5" w:themeColor="accent5" w:themeShade="BF"/>
+                <w:sz w:val="24"/>
+                <w:szCs w:val="24"/>
+                <w:lang w:val="fr-FR"/>
+              </w:rPr>
+            </w:pPr>
+            <w:r>
+              <w:rPr>
+                <w:rFonts w:ascii="Roboto" w:hAnsi="Roboto" w:cs="Times New Roman"/>
+                <w:b/>
+                <w:bCs/>
                 <w:color w:val="DEEAF6" w:themeColor="accent5" w:themeTint="33"/>
-                <w:sz w:val="28"/>
-                <w:szCs w:val="28"/>
+                <w:sz w:val="24"/>
+                <w:szCs w:val="24"/>
                 <w:vertAlign w:val="subscript"/>
                 <w:lang w:val="fr-FR"/>
               </w:rPr>
@@ -733,29 +794,35 @@
             <w:pPr>
               <w:jc w:val="right"/>
               <w:rPr>
-                <w:rFonts w:ascii="Times New Roman" w:hAnsi="Times New Roman" w:cs="Times New Roman"/>
-                <w:color w:val="2E74B5" w:themeColor="accent5" w:themeShade="BF"/>
-                <w:sz w:val="28"/>
-                <w:szCs w:val="28"/>
-                <w:lang w:val="fr-FR"/>
-              </w:rPr>
-            </w:pPr>
-            <w:r>
-              <w:rPr>
-                <w:rFonts w:ascii="Times New Roman" w:hAnsi="Times New Roman" w:cs="Times New Roman"/>
-                <w:color w:val="2E74B5" w:themeColor="accent5" w:themeShade="BF"/>
-                <w:sz w:val="28"/>
-                <w:szCs w:val="28"/>
+                <w:rFonts w:ascii="Roboto" w:hAnsi="Roboto" w:cs="Times New Roman"/>
+                <w:b/>
+                <w:bCs/>
+                <w:color w:val="2E74B5" w:themeColor="accent5" w:themeShade="BF"/>
+                <w:sz w:val="24"/>
+                <w:szCs w:val="24"/>
+                <w:lang w:val="fr-FR"/>
+              </w:rPr>
+            </w:pPr>
+            <w:r>
+              <w:rPr>
+                <w:rFonts w:ascii="Roboto" w:hAnsi="Roboto" w:cs="Times New Roman"/>
+                <w:b/>
+                <w:bCs/>
+                <w:color w:val="2E74B5" w:themeColor="accent5" w:themeShade="BF"/>
+                <w:sz w:val="24"/>
+                <w:szCs w:val="24"/>
                 <w:lang w:val="fr-FR"/>
               </w:rPr>
               <w:t>Indicatif VHF</w:t>
             </w:r>
             <w:r>
               <w:rPr>
-                <w:rFonts w:ascii="Times New Roman" w:hAnsi="Times New Roman" w:cs="Times New Roman"/>
-                <w:color w:val="2E74B5" w:themeColor="accent5" w:themeShade="BF"/>
-                <w:sz w:val="28"/>
-                <w:szCs w:val="28"/>
+                <w:rFonts w:ascii="Roboto" w:hAnsi="Roboto" w:cs="Times New Roman"/>
+                <w:b/>
+                <w:bCs/>
+                <w:color w:val="2E74B5" w:themeColor="accent5" w:themeShade="BF"/>
+                <w:sz w:val="24"/>
+                <w:szCs w:val="24"/>
                 <w:lang w:val="fr-FR"/>
               </w:rPr>
               <w:t> :</w:t>
@@ -779,19 +846,23 @@
               </w:tabs>
               <w:jc w:val="center"/>
               <w:rPr>
-                <w:rFonts w:ascii="Times New Roman" w:hAnsi="Times New Roman" w:cs="Times New Roman"/>
-                <w:color w:val="2E74B5" w:themeColor="accent5" w:themeShade="BF"/>
-                <w:sz w:val="28"/>
-                <w:szCs w:val="28"/>
-                <w:lang w:val="fr-FR"/>
-              </w:rPr>
-            </w:pPr>
-            <w:r>
-              <w:rPr>
-                <w:rFonts w:ascii="Times New Roman" w:hAnsi="Times New Roman" w:cs="Times New Roman"/>
+                <w:rFonts w:ascii="Roboto" w:hAnsi="Roboto" w:cs="Times New Roman"/>
+                <w:b/>
+                <w:bCs/>
+                <w:color w:val="2E74B5" w:themeColor="accent5" w:themeShade="BF"/>
+                <w:sz w:val="24"/>
+                <w:szCs w:val="24"/>
+                <w:lang w:val="fr-FR"/>
+              </w:rPr>
+            </w:pPr>
+            <w:r>
+              <w:rPr>
+                <w:rFonts w:ascii="Roboto" w:hAnsi="Roboto" w:cs="Times New Roman"/>
+                <w:b/>
+                <w:bCs/>
                 <w:color w:val="DEEAF6" w:themeColor="accent5" w:themeTint="33"/>
-                <w:sz w:val="28"/>
-                <w:szCs w:val="28"/>
+                <w:sz w:val="24"/>
+                <w:szCs w:val="24"/>
                 <w:vertAlign w:val="subscript"/>
                 <w:lang w:val="fr-FR"/>
               </w:rPr>
@@ -813,29 +884,35 @@
             <w:pPr>
               <w:jc w:val="right"/>
               <w:rPr>
-                <w:rFonts w:ascii="Times New Roman" w:hAnsi="Times New Roman" w:cs="Times New Roman"/>
-                <w:color w:val="2E74B5" w:themeColor="accent5" w:themeShade="BF"/>
-                <w:sz w:val="28"/>
-                <w:szCs w:val="28"/>
-                <w:lang w:val="fr-FR"/>
-              </w:rPr>
-            </w:pPr>
-            <w:r>
-              <w:rPr>
-                <w:rFonts w:ascii="Times New Roman" w:hAnsi="Times New Roman" w:cs="Times New Roman"/>
-                <w:color w:val="2E74B5" w:themeColor="accent5" w:themeShade="BF"/>
-                <w:sz w:val="28"/>
-                <w:szCs w:val="28"/>
+                <w:rFonts w:ascii="Roboto" w:hAnsi="Roboto" w:cs="Times New Roman"/>
+                <w:b/>
+                <w:bCs/>
+                <w:color w:val="2E74B5" w:themeColor="accent5" w:themeShade="BF"/>
+                <w:sz w:val="24"/>
+                <w:szCs w:val="24"/>
+                <w:lang w:val="fr-FR"/>
+              </w:rPr>
+            </w:pPr>
+            <w:r>
+              <w:rPr>
+                <w:rFonts w:ascii="Roboto" w:hAnsi="Roboto" w:cs="Times New Roman"/>
+                <w:b/>
+                <w:bCs/>
+                <w:color w:val="2E74B5" w:themeColor="accent5" w:themeShade="BF"/>
+                <w:sz w:val="24"/>
+                <w:szCs w:val="24"/>
                 <w:lang w:val="fr-FR"/>
               </w:rPr>
               <w:t xml:space="preserve">Longueur </w:t>
             </w:r>
             <w:r>
               <w:rPr>
-                <w:rFonts w:ascii="Times New Roman" w:hAnsi="Times New Roman" w:cs="Times New Roman"/>
-                <w:color w:val="2E74B5" w:themeColor="accent5" w:themeShade="BF"/>
-                <w:sz w:val="28"/>
-                <w:szCs w:val="28"/>
+                <w:rFonts w:ascii="Roboto" w:hAnsi="Roboto" w:cs="Times New Roman"/>
+                <w:b/>
+                <w:bCs/>
+                <w:color w:val="2E74B5" w:themeColor="accent5" w:themeShade="BF"/>
+                <w:sz w:val="24"/>
+                <w:szCs w:val="24"/>
                 <w:lang w:val="fr-FR"/>
               </w:rPr>
               <w:t>H.T. :</w:t>
@@ -857,19 +934,23 @@
             <w:pPr>
               <w:jc w:val="center"/>
               <w:rPr>
-                <w:rFonts w:ascii="Times New Roman" w:hAnsi="Times New Roman" w:cs="Times New Roman"/>
-                <w:color w:val="2E74B5" w:themeColor="accent5" w:themeShade="BF"/>
-                <w:sz w:val="28"/>
-                <w:szCs w:val="28"/>
-                <w:lang w:val="fr-FR"/>
-              </w:rPr>
-            </w:pPr>
-            <w:r>
-              <w:rPr>
-                <w:rFonts w:ascii="Times New Roman" w:hAnsi="Times New Roman" w:cs="Times New Roman"/>
+                <w:rFonts w:ascii="Roboto" w:hAnsi="Roboto" w:cs="Times New Roman"/>
+                <w:b/>
+                <w:bCs/>
+                <w:color w:val="2E74B5" w:themeColor="accent5" w:themeShade="BF"/>
+                <w:sz w:val="24"/>
+                <w:szCs w:val="24"/>
+                <w:lang w:val="fr-FR"/>
+              </w:rPr>
+            </w:pPr>
+            <w:r>
+              <w:rPr>
+                <w:rFonts w:ascii="Roboto" w:hAnsi="Roboto" w:cs="Times New Roman"/>
+                <w:b/>
+                <w:bCs/>
                 <w:color w:val="DEEAF6" w:themeColor="accent5" w:themeTint="33"/>
-                <w:sz w:val="28"/>
-                <w:szCs w:val="28"/>
+                <w:sz w:val="24"/>
+                <w:szCs w:val="24"/>
                 <w:vertAlign w:val="subscript"/>
                 <w:lang w:val="fr-FR"/>
               </w:rPr>
@@ -897,29 +978,35 @@
             <w:pPr>
               <w:jc w:val="right"/>
               <w:rPr>
-                <w:rFonts w:ascii="Times New Roman" w:hAnsi="Times New Roman" w:cs="Times New Roman"/>
-                <w:color w:val="2E74B5" w:themeColor="accent5" w:themeShade="BF"/>
-                <w:sz w:val="28"/>
-                <w:szCs w:val="28"/>
-                <w:lang w:val="fr-FR"/>
-              </w:rPr>
-            </w:pPr>
-            <w:r>
-              <w:rPr>
-                <w:rFonts w:ascii="Times New Roman" w:hAnsi="Times New Roman" w:cs="Times New Roman"/>
-                <w:color w:val="2E74B5" w:themeColor="accent5" w:themeShade="BF"/>
-                <w:sz w:val="28"/>
-                <w:szCs w:val="28"/>
+                <w:rFonts w:ascii="Roboto" w:hAnsi="Roboto" w:cs="Times New Roman"/>
+                <w:b/>
+                <w:bCs/>
+                <w:color w:val="2E74B5" w:themeColor="accent5" w:themeShade="BF"/>
+                <w:sz w:val="24"/>
+                <w:szCs w:val="24"/>
+                <w:lang w:val="fr-FR"/>
+              </w:rPr>
+            </w:pPr>
+            <w:r>
+              <w:rPr>
+                <w:rFonts w:ascii="Roboto" w:hAnsi="Roboto" w:cs="Times New Roman"/>
+                <w:b/>
+                <w:bCs/>
+                <w:color w:val="2E74B5" w:themeColor="accent5" w:themeShade="BF"/>
+                <w:sz w:val="24"/>
+                <w:szCs w:val="24"/>
                 <w:lang w:val="fr-FR"/>
               </w:rPr>
               <w:t>MMSI</w:t>
             </w:r>
             <w:r>
               <w:rPr>
-                <w:rFonts w:ascii="Times New Roman" w:hAnsi="Times New Roman" w:cs="Times New Roman"/>
-                <w:color w:val="2E74B5" w:themeColor="accent5" w:themeShade="BF"/>
-                <w:sz w:val="28"/>
-                <w:szCs w:val="28"/>
+                <w:rFonts w:ascii="Roboto" w:hAnsi="Roboto" w:cs="Times New Roman"/>
+                <w:b/>
+                <w:bCs/>
+                <w:color w:val="2E74B5" w:themeColor="accent5" w:themeShade="BF"/>
+                <w:sz w:val="24"/>
+                <w:szCs w:val="24"/>
                 <w:lang w:val="fr-FR"/>
               </w:rPr>
               <w:t> :</w:t>
@@ -943,19 +1030,23 @@
               </w:tabs>
               <w:jc w:val="center"/>
               <w:rPr>
-                <w:rFonts w:ascii="Times New Roman" w:hAnsi="Times New Roman" w:cs="Times New Roman"/>
-                <w:color w:val="2E74B5" w:themeColor="accent5" w:themeShade="BF"/>
-                <w:sz w:val="28"/>
-                <w:szCs w:val="28"/>
-                <w:lang w:val="fr-FR"/>
-              </w:rPr>
-            </w:pPr>
-            <w:r>
-              <w:rPr>
-                <w:rFonts w:ascii="Times New Roman" w:hAnsi="Times New Roman" w:cs="Times New Roman"/>
+                <w:rFonts w:ascii="Roboto" w:hAnsi="Roboto" w:cs="Times New Roman"/>
+                <w:b/>
+                <w:bCs/>
+                <w:color w:val="2E74B5" w:themeColor="accent5" w:themeShade="BF"/>
+                <w:sz w:val="24"/>
+                <w:szCs w:val="24"/>
+                <w:lang w:val="fr-FR"/>
+              </w:rPr>
+            </w:pPr>
+            <w:r>
+              <w:rPr>
+                <w:rFonts w:ascii="Roboto" w:hAnsi="Roboto" w:cs="Times New Roman"/>
+                <w:b/>
+                <w:bCs/>
                 <w:color w:val="DEEAF6" w:themeColor="accent5" w:themeTint="33"/>
-                <w:sz w:val="28"/>
-                <w:szCs w:val="28"/>
+                <w:sz w:val="24"/>
+                <w:szCs w:val="24"/>
                 <w:vertAlign w:val="subscript"/>
                 <w:lang w:val="fr-FR"/>
               </w:rPr>
@@ -977,29 +1068,35 @@
             <w:pPr>
               <w:jc w:val="right"/>
               <w:rPr>
-                <w:rFonts w:ascii="Times New Roman" w:hAnsi="Times New Roman" w:cs="Times New Roman"/>
-                <w:color w:val="2E74B5" w:themeColor="accent5" w:themeShade="BF"/>
-                <w:sz w:val="28"/>
-                <w:szCs w:val="28"/>
-                <w:lang w:val="fr-FR"/>
-              </w:rPr>
-            </w:pPr>
-            <w:r>
-              <w:rPr>
-                <w:rFonts w:ascii="Times New Roman" w:hAnsi="Times New Roman" w:cs="Times New Roman"/>
-                <w:color w:val="2E74B5" w:themeColor="accent5" w:themeShade="BF"/>
-                <w:sz w:val="28"/>
-                <w:szCs w:val="28"/>
+                <w:rFonts w:ascii="Roboto" w:hAnsi="Roboto" w:cs="Times New Roman"/>
+                <w:b/>
+                <w:bCs/>
+                <w:color w:val="2E74B5" w:themeColor="accent5" w:themeShade="BF"/>
+                <w:sz w:val="24"/>
+                <w:szCs w:val="24"/>
+                <w:lang w:val="fr-FR"/>
+              </w:rPr>
+            </w:pPr>
+            <w:r>
+              <w:rPr>
+                <w:rFonts w:ascii="Roboto" w:hAnsi="Roboto" w:cs="Times New Roman"/>
+                <w:b/>
+                <w:bCs/>
+                <w:color w:val="2E74B5" w:themeColor="accent5" w:themeShade="BF"/>
+                <w:sz w:val="24"/>
+                <w:szCs w:val="24"/>
                 <w:lang w:val="fr-FR"/>
               </w:rPr>
               <w:t>Maître</w:t>
             </w:r>
             <w:r>
               <w:rPr>
-                <w:rFonts w:ascii="Times New Roman" w:hAnsi="Times New Roman" w:cs="Times New Roman"/>
-                <w:color w:val="2E74B5" w:themeColor="accent5" w:themeShade="BF"/>
-                <w:sz w:val="28"/>
-                <w:szCs w:val="28"/>
+                <w:rFonts w:ascii="Roboto" w:hAnsi="Roboto" w:cs="Times New Roman"/>
+                <w:b/>
+                <w:bCs/>
+                <w:color w:val="2E74B5" w:themeColor="accent5" w:themeShade="BF"/>
+                <w:sz w:val="24"/>
+                <w:szCs w:val="24"/>
                 <w:lang w:val="fr-FR"/>
               </w:rPr>
               <w:t>-bau :</w:t>
@@ -1021,19 +1118,23 @@
             <w:pPr>
               <w:jc w:val="center"/>
               <w:rPr>
-                <w:rFonts w:ascii="Times New Roman" w:hAnsi="Times New Roman" w:cs="Times New Roman"/>
-                <w:color w:val="2E74B5" w:themeColor="accent5" w:themeShade="BF"/>
-                <w:sz w:val="28"/>
-                <w:szCs w:val="28"/>
-                <w:lang w:val="fr-FR"/>
-              </w:rPr>
-            </w:pPr>
-            <w:r>
-              <w:rPr>
-                <w:rFonts w:ascii="Times New Roman" w:hAnsi="Times New Roman" w:cs="Times New Roman"/>
+                <w:rFonts w:ascii="Roboto" w:hAnsi="Roboto" w:cs="Times New Roman"/>
+                <w:b/>
+                <w:bCs/>
+                <w:color w:val="2E74B5" w:themeColor="accent5" w:themeShade="BF"/>
+                <w:sz w:val="24"/>
+                <w:szCs w:val="24"/>
+                <w:lang w:val="fr-FR"/>
+              </w:rPr>
+            </w:pPr>
+            <w:r>
+              <w:rPr>
+                <w:rFonts w:ascii="Roboto" w:hAnsi="Roboto" w:cs="Times New Roman"/>
+                <w:b/>
+                <w:bCs/>
                 <w:color w:val="DEEAF6" w:themeColor="accent5" w:themeTint="33"/>
-                <w:sz w:val="28"/>
-                <w:szCs w:val="28"/>
+                <w:sz w:val="24"/>
+                <w:szCs w:val="24"/>
                 <w:vertAlign w:val="subscript"/>
                 <w:lang w:val="fr-FR"/>
               </w:rPr>
@@ -1061,10 +1162,12 @@
             <w:pPr>
               <w:jc w:val="center"/>
               <w:rPr>
-                <w:rFonts w:ascii="Times New Roman" w:hAnsi="Times New Roman" w:cs="Times New Roman"/>
-                <w:color w:val="2E74B5" w:themeColor="accent5" w:themeShade="BF"/>
-                <w:sz w:val="28"/>
-                <w:szCs w:val="28"/>
+                <w:rFonts w:ascii="Roboto" w:hAnsi="Roboto" w:cs="Times New Roman"/>
+                <w:b/>
+                <w:bCs/>
+                <w:color w:val="2E74B5" w:themeColor="accent5" w:themeShade="BF"/>
+                <w:sz w:val="24"/>
+                <w:szCs w:val="24"/>
                 <w:lang w:val="fr-FR"/>
               </w:rPr>
             </w:pPr>
@@ -1084,10 +1187,12 @@
             <w:pPr>
               <w:jc w:val="center"/>
               <w:rPr>
-                <w:rFonts w:ascii="Times New Roman" w:hAnsi="Times New Roman" w:cs="Times New Roman"/>
-                <w:color w:val="2E74B5" w:themeColor="accent5" w:themeShade="BF"/>
-                <w:sz w:val="28"/>
-                <w:szCs w:val="28"/>
+                <w:rFonts w:ascii="Roboto" w:hAnsi="Roboto" w:cs="Times New Roman"/>
+                <w:b/>
+                <w:bCs/>
+                <w:color w:val="2E74B5" w:themeColor="accent5" w:themeShade="BF"/>
+                <w:sz w:val="24"/>
+                <w:szCs w:val="24"/>
                 <w:lang w:val="fr-FR"/>
               </w:rPr>
             </w:pPr>
@@ -1107,29 +1212,35 @@
             <w:pPr>
               <w:jc w:val="right"/>
               <w:rPr>
-                <w:rFonts w:ascii="Times New Roman" w:hAnsi="Times New Roman" w:cs="Times New Roman"/>
-                <w:color w:val="2E74B5" w:themeColor="accent5" w:themeShade="BF"/>
-                <w:sz w:val="28"/>
-                <w:szCs w:val="28"/>
-                <w:lang w:val="fr-FR"/>
-              </w:rPr>
-            </w:pPr>
-            <w:r>
-              <w:rPr>
-                <w:rFonts w:ascii="Times New Roman" w:hAnsi="Times New Roman" w:cs="Times New Roman"/>
-                <w:color w:val="2E74B5" w:themeColor="accent5" w:themeShade="BF"/>
-                <w:sz w:val="28"/>
-                <w:szCs w:val="28"/>
+                <w:rFonts w:ascii="Roboto" w:hAnsi="Roboto" w:cs="Times New Roman"/>
+                <w:b/>
+                <w:bCs/>
+                <w:color w:val="2E74B5" w:themeColor="accent5" w:themeShade="BF"/>
+                <w:sz w:val="24"/>
+                <w:szCs w:val="24"/>
+                <w:lang w:val="fr-FR"/>
+              </w:rPr>
+            </w:pPr>
+            <w:r>
+              <w:rPr>
+                <w:rFonts w:ascii="Roboto" w:hAnsi="Roboto" w:cs="Times New Roman"/>
+                <w:b/>
+                <w:bCs/>
+                <w:color w:val="2E74B5" w:themeColor="accent5" w:themeShade="BF"/>
+                <w:sz w:val="24"/>
+                <w:szCs w:val="24"/>
                 <w:lang w:val="fr-FR"/>
               </w:rPr>
               <w:t xml:space="preserve">Tirant </w:t>
             </w:r>
             <w:r>
               <w:rPr>
-                <w:rFonts w:ascii="Times New Roman" w:hAnsi="Times New Roman" w:cs="Times New Roman"/>
-                <w:color w:val="2E74B5" w:themeColor="accent5" w:themeShade="BF"/>
-                <w:sz w:val="28"/>
-                <w:szCs w:val="28"/>
+                <w:rFonts w:ascii="Roboto" w:hAnsi="Roboto" w:cs="Times New Roman"/>
+                <w:b/>
+                <w:bCs/>
+                <w:color w:val="2E74B5" w:themeColor="accent5" w:themeShade="BF"/>
+                <w:sz w:val="24"/>
+                <w:szCs w:val="24"/>
                 <w:lang w:val="fr-FR"/>
               </w:rPr>
               <w:t>d’eau :</w:t>
@@ -1151,19 +1262,23 @@
             <w:pPr>
               <w:jc w:val="center"/>
               <w:rPr>
-                <w:rFonts w:ascii="Times New Roman" w:hAnsi="Times New Roman" w:cs="Times New Roman"/>
-                <w:color w:val="2E74B5" w:themeColor="accent5" w:themeShade="BF"/>
-                <w:sz w:val="28"/>
-                <w:szCs w:val="28"/>
-                <w:lang w:val="fr-FR"/>
-              </w:rPr>
-            </w:pPr>
-            <w:r>
-              <w:rPr>
-                <w:rFonts w:ascii="Times New Roman" w:hAnsi="Times New Roman" w:cs="Times New Roman"/>
+                <w:rFonts w:ascii="Roboto" w:hAnsi="Roboto" w:cs="Times New Roman"/>
+                <w:b/>
+                <w:bCs/>
+                <w:color w:val="2E74B5" w:themeColor="accent5" w:themeShade="BF"/>
+                <w:sz w:val="24"/>
+                <w:szCs w:val="24"/>
+                <w:lang w:val="fr-FR"/>
+              </w:rPr>
+            </w:pPr>
+            <w:r>
+              <w:rPr>
+                <w:rFonts w:ascii="Roboto" w:hAnsi="Roboto" w:cs="Times New Roman"/>
+                <w:b/>
+                <w:bCs/>
                 <w:color w:val="DEEAF6" w:themeColor="accent5" w:themeTint="33"/>
-                <w:sz w:val="28"/>
-                <w:szCs w:val="28"/>
+                <w:sz w:val="24"/>
+                <w:szCs w:val="24"/>
                 <w:vertAlign w:val="subscript"/>
                 <w:lang w:val="fr-FR"/>
               </w:rPr>
@@ -1188,10 +1303,12 @@
             <w:pPr>
               <w:jc w:val="center"/>
               <w:rPr>
-                <w:rFonts w:ascii="Times New Roman" w:hAnsi="Times New Roman" w:cs="Times New Roman"/>
-                <w:color w:val="2E74B5" w:themeColor="accent5" w:themeShade="BF"/>
-                <w:sz w:val="28"/>
-                <w:szCs w:val="28"/>
+                <w:rFonts w:ascii="Roboto" w:hAnsi="Roboto" w:cs="Times New Roman"/>
+                <w:b/>
+                <w:bCs/>
+                <w:color w:val="2E74B5" w:themeColor="accent5" w:themeShade="BF"/>
+                <w:sz w:val="24"/>
+                <w:szCs w:val="24"/>
                 <w:lang w:val="fr-FR"/>
               </w:rPr>
             </w:pPr>
@@ -1211,10 +1328,12 @@
             <w:pPr>
               <w:jc w:val="center"/>
               <w:rPr>
-                <w:rFonts w:ascii="Times New Roman" w:hAnsi="Times New Roman" w:cs="Times New Roman"/>
-                <w:color w:val="2E74B5" w:themeColor="accent5" w:themeShade="BF"/>
-                <w:sz w:val="28"/>
-                <w:szCs w:val="28"/>
+                <w:rFonts w:ascii="Roboto" w:hAnsi="Roboto" w:cs="Times New Roman"/>
+                <w:b/>
+                <w:bCs/>
+                <w:color w:val="2E74B5" w:themeColor="accent5" w:themeShade="BF"/>
+                <w:sz w:val="24"/>
+                <w:szCs w:val="24"/>
                 <w:lang w:val="fr-FR"/>
               </w:rPr>
             </w:pPr>
@@ -1234,29 +1353,35 @@
             <w:pPr>
               <w:jc w:val="right"/>
               <w:rPr>
-                <w:rFonts w:ascii="Times New Roman" w:hAnsi="Times New Roman" w:cs="Times New Roman"/>
-                <w:color w:val="2E74B5" w:themeColor="accent5" w:themeShade="BF"/>
-                <w:sz w:val="28"/>
-                <w:szCs w:val="28"/>
-                <w:lang w:val="fr-FR"/>
-              </w:rPr>
-            </w:pPr>
-            <w:r>
-              <w:rPr>
-                <w:rFonts w:ascii="Times New Roman" w:hAnsi="Times New Roman" w:cs="Times New Roman"/>
-                <w:color w:val="2E74B5" w:themeColor="accent5" w:themeShade="BF"/>
-                <w:sz w:val="28"/>
-                <w:szCs w:val="28"/>
+                <w:rFonts w:ascii="Roboto" w:hAnsi="Roboto" w:cs="Times New Roman"/>
+                <w:b/>
+                <w:bCs/>
+                <w:color w:val="2E74B5" w:themeColor="accent5" w:themeShade="BF"/>
+                <w:sz w:val="24"/>
+                <w:szCs w:val="24"/>
+                <w:lang w:val="fr-FR"/>
+              </w:rPr>
+            </w:pPr>
+            <w:r>
+              <w:rPr>
+                <w:rFonts w:ascii="Roboto" w:hAnsi="Roboto" w:cs="Times New Roman"/>
+                <w:b/>
+                <w:bCs/>
+                <w:color w:val="2E74B5" w:themeColor="accent5" w:themeShade="BF"/>
+                <w:sz w:val="24"/>
+                <w:szCs w:val="24"/>
                 <w:lang w:val="fr-FR"/>
               </w:rPr>
               <w:t xml:space="preserve">Tirant </w:t>
             </w:r>
             <w:r>
               <w:rPr>
-                <w:rFonts w:ascii="Times New Roman" w:hAnsi="Times New Roman" w:cs="Times New Roman"/>
-                <w:color w:val="2E74B5" w:themeColor="accent5" w:themeShade="BF"/>
-                <w:sz w:val="28"/>
-                <w:szCs w:val="28"/>
+                <w:rFonts w:ascii="Roboto" w:hAnsi="Roboto" w:cs="Times New Roman"/>
+                <w:b/>
+                <w:bCs/>
+                <w:color w:val="2E74B5" w:themeColor="accent5" w:themeShade="BF"/>
+                <w:sz w:val="24"/>
+                <w:szCs w:val="24"/>
                 <w:lang w:val="fr-FR"/>
               </w:rPr>
               <w:t>d’air :</w:t>
@@ -1278,19 +1403,23 @@
             <w:pPr>
               <w:jc w:val="center"/>
               <w:rPr>
-                <w:rFonts w:ascii="Times New Roman" w:hAnsi="Times New Roman" w:cs="Times New Roman"/>
-                <w:color w:val="2E74B5" w:themeColor="accent5" w:themeShade="BF"/>
-                <w:sz w:val="28"/>
-                <w:szCs w:val="28"/>
-                <w:lang w:val="fr-FR"/>
-              </w:rPr>
-            </w:pPr>
-            <w:r>
-              <w:rPr>
-                <w:rFonts w:ascii="Times New Roman" w:hAnsi="Times New Roman" w:cs="Times New Roman"/>
+                <w:rFonts w:ascii="Roboto" w:hAnsi="Roboto" w:cs="Times New Roman"/>
+                <w:b/>
+                <w:bCs/>
+                <w:color w:val="2E74B5" w:themeColor="accent5" w:themeShade="BF"/>
+                <w:sz w:val="24"/>
+                <w:szCs w:val="24"/>
+                <w:lang w:val="fr-FR"/>
+              </w:rPr>
+            </w:pPr>
+            <w:r>
+              <w:rPr>
+                <w:rFonts w:ascii="Roboto" w:hAnsi="Roboto" w:cs="Times New Roman"/>
+                <w:b/>
+                <w:bCs/>
                 <w:color w:val="DEEAF6" w:themeColor="accent5" w:themeTint="33"/>
-                <w:sz w:val="28"/>
-                <w:szCs w:val="28"/>
+                <w:sz w:val="24"/>
+                <w:szCs w:val="24"/>
                 <w:vertAlign w:val="subscript"/>
                 <w:lang w:val="fr-FR"/>
               </w:rPr>
@@ -1304,7 +1433,7 @@
       <w:pPr>
         <w:jc w:val="center"/>
         <w:rPr>
-          <w:rFonts w:ascii="Times New Roman" w:hAnsi="Times New Roman" w:cs="Times New Roman"/>
+          <w:rFonts w:ascii="Roboto" w:hAnsi="Roboto" w:cs="Times New Roman"/>
           <w:color w:val="2E74B5" w:themeColor="accent5" w:themeShade="BF"/>
           <w:lang w:val="fr-FR"/>
         </w:rPr>
@@ -1313,14 +1442,14 @@
     <w:p>
       <w:pPr>
         <w:rPr>
-          <w:rFonts w:ascii="Times New Roman" w:hAnsi="Times New Roman" w:cs="Times New Roman"/>
-          <w:color w:val="2E74B5" w:themeColor="accent5" w:themeShade="BF"/>
-          <w:lang w:val="fr-FR"/>
-        </w:rPr>
-      </w:pPr>
-      <w:r>
-        <w:rPr>
-          <w:rFonts w:ascii="Times New Roman" w:hAnsi="Times New Roman" w:cs="Times New Roman"/>
+          <w:rFonts w:ascii="Roboto" w:hAnsi="Roboto" w:cs="Times New Roman"/>
+          <w:color w:val="2E74B5" w:themeColor="accent5" w:themeShade="BF"/>
+          <w:lang w:val="fr-FR"/>
+        </w:rPr>
+      </w:pPr>
+      <w:r>
+        <w:rPr>
+          <w:rFonts w:ascii="Roboto" w:hAnsi="Roboto" w:cs="Times New Roman"/>
           <w:color w:val="2E74B5" w:themeColor="accent5" w:themeShade="BF"/>
           <w:lang w:val="fr-FR"/>
         </w:rPr>
@@ -1329,24 +1458,23 @@
     </w:p>
     <w:p>
       <w:pPr>
-        <w:ind w:left="90" w:hanging="90"/>
-        <w:jc w:val="center"/>
-        <w:rPr>
-          <w:rFonts w:ascii="Times New Roman" w:hAnsi="Times New Roman" w:cs="Times New Roman"/>
-          <w:color w:val="2E74B5" w:themeColor="accent5" w:themeShade="BF"/>
-          <w:lang w:val="fr-FR"/>
-        </w:rPr>
-      </w:pPr>
-      <w:r>
-        <w:rPr>
+        <w:rPr>
+          <w:rFonts w:ascii="Roboto" w:hAnsi="Roboto" w:cs="Times New Roman"/>
+          <w:color w:val="2E74B5" w:themeColor="accent5" w:themeShade="BF"/>
+          <w:lang w:val="fr-FR"/>
+        </w:rPr>
+      </w:pPr>
+      <w:r>
+        <w:rPr>
+          <w:rFonts w:ascii="Roboto" w:hAnsi="Roboto"/>
           <w:noProof/>
         </w:rPr>
         <w:lastRenderedPageBreak/>
         <w:drawing>
-          <wp:inline distT="0" distB="0" distL="0" distR="0" wp14:anchorId="620A7FB7" wp14:editId="711F92C3">
-            <wp:extent cx="7487920" cy="333375"/>
-            <wp:effectExtent l="0" t="0" r="0" b="9525"/>
-            <wp:docPr id="2" name="Picture 1">
+          <wp:inline distT="0" distB="0" distL="0" distR="0" wp14:anchorId="4E5F74E5" wp14:editId="49994DCC">
+            <wp:extent cx="7217410" cy="321331"/>
+            <wp:effectExtent l="0" t="0" r="2540" b="2540"/>
+            <wp:docPr id="961897715" name="Picture 1">
               <a:extLst xmlns:a="http://schemas.openxmlformats.org/drawingml/2006/main">
                 <a:ext uri="{FF2B5EF4-FFF2-40B4-BE49-F238E27FC236}">
                   <a16:creationId xmlns:a16="http://schemas.microsoft.com/office/drawing/2014/main" id="{2F1D6D53-1699-4292-B7CD-CC8E083F8A96}"/>
@@ -1379,7 +1507,7 @@
                   <pic:spPr bwMode="auto">
                     <a:xfrm>
                       <a:off x="0" y="0"/>
-                      <a:ext cx="7499879" cy="333907"/>
+                      <a:ext cx="7217410" cy="321331"/>
                     </a:xfrm>
                     <a:prstGeom prst="rect">
                       <a:avLst/>
@@ -1402,45 +1530,45 @@
     </w:p>
     <w:tbl>
       <w:tblPr>
-        <w:tblStyle w:val="TableGrid"/>
+        <w:tblStyle w:val="Grilledutableau"/>
         <w:tblW w:w="0" w:type="auto"/>
-        <w:tblInd w:w="90" w:type="dxa"/>
         <w:tblBorders>
-          <w:top w:val="none" w:sz="0" w:space="0" w:color="auto"/>
+          <w:top w:val="dashed" w:sz="4" w:space="0" w:color="4472C4" w:themeColor="accent1"/>
           <w:left w:val="none" w:sz="0" w:space="0" w:color="auto"/>
-          <w:bottom w:val="none" w:sz="0" w:space="0" w:color="auto"/>
+          <w:bottom w:val="dashed" w:sz="4" w:space="0" w:color="4472C4" w:themeColor="accent1"/>
           <w:right w:val="none" w:sz="0" w:space="0" w:color="auto"/>
-          <w:insideH w:val="none" w:sz="0" w:space="0" w:color="auto"/>
-          <w:insideV w:val="none" w:sz="0" w:space="0" w:color="auto"/>
+          <w:insideH w:val="dashed" w:sz="4" w:space="0" w:color="4472C4" w:themeColor="accent1"/>
         </w:tblBorders>
         <w:tblLook w:val="04A0" w:firstRow="1" w:lastRow="0" w:firstColumn="1" w:lastColumn="0" w:noHBand="0" w:noVBand="1"/>
       </w:tblPr>
       <w:tblGrid>
-        <w:gridCol w:w="11276"/>
+        <w:gridCol w:w="1317"/>
+        <w:gridCol w:w="10049"/>
       </w:tblGrid>
       <w:tr>
         <w:tc>
           <w:tcPr>
-            <w:tcW w:w="11690" w:type="dxa"/>
+            <w:tcW w:w="11366" w:type="dxa"/>
+            <w:gridSpan w:val="2"/>
           </w:tcPr>
           <w:p>
             <w:pPr>
-              <w:jc w:val="center"/>
-              <w:rPr>
-                <w:rFonts w:ascii="Times New Roman" w:hAnsi="Times New Roman" w:cs="Times New Roman"/>
-                <w:color w:val="2E74B5" w:themeColor="accent5" w:themeShade="BF"/>
-                <w:lang w:val="fr-FR"/>
-              </w:rPr>
-            </w:pPr>
-            <w:r>
-              <w:rPr>
+              <w:rPr>
+                <w:rFonts w:ascii="Roboto" w:hAnsi="Roboto" w:cs="Times New Roman"/>
+                <w:color w:val="2E74B5" w:themeColor="accent5" w:themeShade="BF"/>
+                <w:lang w:val="fr-FR"/>
+              </w:rPr>
+            </w:pPr>
+            <w:r>
+              <w:rPr>
+                <w:rFonts w:ascii="Roboto" w:hAnsi="Roboto"/>
                 <w:noProof/>
               </w:rPr>
               <w:drawing>
-                <wp:inline distT="0" distB="0" distL="0" distR="0" wp14:anchorId="2FA77235" wp14:editId="3AE90FBB">
-                  <wp:extent cx="6905133" cy="2266134"/>
-                  <wp:effectExtent l="0" t="0" r="0" b="1270"/>
-                  <wp:docPr id="5" name="Picture 1">
+                <wp:inline distT="0" distB="0" distL="0" distR="0" wp14:anchorId="1EE13A99" wp14:editId="4191CCC2">
+                  <wp:extent cx="6903750" cy="1147313"/>
+                  <wp:effectExtent l="0" t="0" r="0" b="0"/>
+                  <wp:docPr id="549213391" name="Picture 1">
                     <a:extLst xmlns:a="http://schemas.openxmlformats.org/drawingml/2006/main">
                       <a:ext uri="{FF2B5EF4-FFF2-40B4-BE49-F238E27FC236}">
                         <a16:creationId xmlns:a16="http://schemas.microsoft.com/office/drawing/2014/main" id="{2F1D6D53-1699-4292-B7CD-CC8E083F8A96}"/>
@@ -1467,13 +1595,15 @@
                         </pic:nvPicPr>
                         <pic:blipFill rotWithShape="1">
                           <a:blip r:embed="rId7"/>
-                          <a:srcRect t="16505"/>
-                          <a:stretch/>
+                          <a:srcRect t="16505" b="41214"/>
+                          <a:stretch>
+                            <a:fillRect/>
+                          </a:stretch>
                         </pic:blipFill>
                         <pic:spPr bwMode="auto">
                           <a:xfrm>
                             <a:off x="0" y="0"/>
-                            <a:ext cx="6940544" cy="2277755"/>
+                            <a:ext cx="6940544" cy="1153428"/>
                           </a:xfrm>
                           <a:prstGeom prst="rect">
                             <a:avLst/>
@@ -1494,41 +1624,514 @@
               </w:drawing>
             </w:r>
           </w:p>
+          <w:p>
+            <w:pPr>
+              <w:rPr>
+                <w:rFonts w:ascii="Roboto" w:hAnsi="Roboto" w:cs="Times New Roman"/>
+                <w:color w:val="2E74B5" w:themeColor="accent5" w:themeShade="BF"/>
+                <w:lang w:val="fr-FR"/>
+              </w:rPr>
+            </w:pPr>
+          </w:p>
         </w:tc>
       </w:tr>
       <w:tr>
         <w:tc>
           <w:tcPr>
-            <w:tcW w:w="11690" w:type="dxa"/>
+            <w:tcW w:w="11366" w:type="dxa"/>
+            <w:gridSpan w:val="2"/>
+            <w:tcBorders>
+              <w:bottom w:val="dashed" w:sz="4" w:space="0" w:color="4472C4" w:themeColor="accent1"/>
+            </w:tcBorders>
           </w:tcPr>
           <w:p>
             <w:pPr>
+              <w:rPr>
+                <w:rFonts w:ascii="Roboto" w:hAnsi="Roboto" w:cs="Times New Roman"/>
+                <w:color w:val="2E74B5" w:themeColor="accent5" w:themeShade="BF"/>
+                <w:lang w:val="fr-FR"/>
+              </w:rPr>
+            </w:pPr>
+            <w:r>
+              <w:rPr>
+                <w:rFonts w:ascii="Roboto" w:hAnsi="Roboto"/>
+                <w:noProof/>
+              </w:rPr>
+              <w:drawing>
+                <wp:inline distT="0" distB="0" distL="0" distR="0" wp14:anchorId="31A90F22" wp14:editId="4FD69858">
+                  <wp:extent cx="6902932" cy="1068019"/>
+                  <wp:effectExtent l="0" t="0" r="0" b="0"/>
+                  <wp:docPr id="1100992507" name="Picture 1">
+                    <a:extLst xmlns:a="http://schemas.openxmlformats.org/drawingml/2006/main">
+                      <a:ext uri="{FF2B5EF4-FFF2-40B4-BE49-F238E27FC236}">
+                        <a16:creationId xmlns:a16="http://schemas.microsoft.com/office/drawing/2014/main" id="{2F1D6D53-1699-4292-B7CD-CC8E083F8A96}"/>
+                      </a:ext>
+                    </a:extLst>
+                  </wp:docPr>
+                  <wp:cNvGraphicFramePr>
+                    <a:graphicFrameLocks xmlns:a="http://schemas.openxmlformats.org/drawingml/2006/main" noChangeAspect="1"/>
+                  </wp:cNvGraphicFramePr>
+                  <a:graphic xmlns:a="http://schemas.openxmlformats.org/drawingml/2006/main">
+                    <a:graphicData uri="http://schemas.openxmlformats.org/drawingml/2006/picture">
+                      <pic:pic xmlns:pic="http://schemas.openxmlformats.org/drawingml/2006/picture">
+                        <pic:nvPicPr>
+                          <pic:cNvPr id="2" name="Picture 1">
+                            <a:extLst>
+                              <a:ext uri="{FF2B5EF4-FFF2-40B4-BE49-F238E27FC236}">
+                                <a16:creationId xmlns:a16="http://schemas.microsoft.com/office/drawing/2014/main" id="{2F1D6D53-1699-4292-B7CD-CC8E083F8A96}"/>
+                              </a:ext>
+                            </a:extLst>
+                          </pic:cNvPr>
+                          <pic:cNvPicPr>
+                            <a:picLocks noChangeAspect="1"/>
+                          </pic:cNvPicPr>
+                        </pic:nvPicPr>
+                        <pic:blipFill rotWithShape="1">
+                          <a:blip r:embed="rId7"/>
+                          <a:srcRect t="62601" b="-1964"/>
+                          <a:stretch>
+                            <a:fillRect/>
+                          </a:stretch>
+                        </pic:blipFill>
+                        <pic:spPr bwMode="auto">
+                          <a:xfrm>
+                            <a:off x="0" y="0"/>
+                            <a:ext cx="6940544" cy="1073838"/>
+                          </a:xfrm>
+                          <a:prstGeom prst="rect">
+                            <a:avLst/>
+                          </a:prstGeom>
+                          <a:ln>
+                            <a:noFill/>
+                          </a:ln>
+                          <a:extLst>
+                            <a:ext uri="{53640926-AAD7-44D8-BBD7-CCE9431645EC}">
+                              <a14:shadowObscured xmlns:a14="http://schemas.microsoft.com/office/drawing/2010/main"/>
+                            </a:ext>
+                          </a:extLst>
+                        </pic:spPr>
+                      </pic:pic>
+                    </a:graphicData>
+                  </a:graphic>
+                </wp:inline>
+              </w:drawing>
+            </w:r>
+          </w:p>
+          <w:p>
+            <w:pPr>
               <w:jc w:val="center"/>
               <w:rPr>
-                <w:rFonts w:ascii="Times New Roman" w:hAnsi="Times New Roman" w:cs="Times New Roman"/>
-                <w:color w:val="2E74B5" w:themeColor="accent5" w:themeShade="BF"/>
-                <w:lang w:val="fr-FR"/>
-              </w:rPr>
-            </w:pPr>
-          </w:p>
-          <w:p>
-            <w:pPr>
-              <w:jc w:val="center"/>
-              <w:rPr>
-                <w:rFonts w:ascii="Times New Roman" w:hAnsi="Times New Roman" w:cs="Times New Roman"/>
-                <w:color w:val="2E74B5" w:themeColor="accent5" w:themeShade="BF"/>
-                <w:lang w:val="fr-FR"/>
-              </w:rPr>
-            </w:pPr>
-            <w:r>
-              <w:rPr>
+                <w:rFonts w:ascii="Roboto" w:hAnsi="Roboto"/>
                 <w:noProof/>
+                <w:color w:val="2F5496" w:themeColor="accent1" w:themeShade="BF"/>
+                <w:lang w:val="fr-FR"/>
+              </w:rPr>
+            </w:pPr>
+            <w:r>
+              <w:rPr>
+                <w:rFonts w:ascii="Roboto" w:hAnsi="Roboto"/>
+                <w:noProof/>
+                <w:color w:val="2F5496" w:themeColor="accent1" w:themeShade="BF"/>
+                <w:lang w:val="fr-FR"/>
+              </w:rPr>
+              <w:t xml:space="preserve">Spi asymetrique  &gt;  gennaker </w:t>
+            </w:r>
+            <w:r>
+              <w:rPr>
+                <w:rFonts w:ascii="Roboto" w:hAnsi="Roboto"/>
+                <w:noProof/>
+                <w:color w:val="2F5496" w:themeColor="accent1" w:themeShade="BF"/>
+                <w:lang w:val="fr-FR"/>
+              </w:rPr>
+              <w:t>(code H)</w:t>
+            </w:r>
+            <w:r>
+              <w:rPr>
+                <w:rFonts w:ascii="Roboto" w:hAnsi="Roboto"/>
+                <w:noProof/>
+                <w:color w:val="2F5496" w:themeColor="accent1" w:themeShade="BF"/>
+                <w:lang w:val="fr-FR"/>
+              </w:rPr>
+              <w:t xml:space="preserve"> &gt; </w:t>
+            </w:r>
+            <w:r>
+              <w:rPr>
+                <w:rFonts w:ascii="Roboto" w:hAnsi="Roboto"/>
+                <w:noProof/>
+                <w:color w:val="2F5496" w:themeColor="accent1" w:themeShade="BF"/>
+                <w:lang w:val="fr-FR"/>
+              </w:rPr>
+              <w:t xml:space="preserve">code 0 &gt; </w:t>
+            </w:r>
+            <w:r>
+              <w:rPr>
+                <w:rFonts w:ascii="Roboto" w:hAnsi="Roboto"/>
+                <w:noProof/>
+                <w:color w:val="2F5496" w:themeColor="accent1" w:themeShade="BF"/>
+                <w:lang w:val="fr-FR"/>
+              </w:rPr>
+              <w:t xml:space="preserve"> reacher  &gt;  génois  &gt;  yankee  &gt;  foc  &gt;  solent  &gt;  tourmentin</w:t>
+            </w:r>
+          </w:p>
+          <w:p>
+            <w:pPr>
+              <w:rPr>
+                <w:rFonts w:ascii="Roboto" w:hAnsi="Roboto" w:cs="Times New Roman"/>
+                <w:color w:val="2E74B5" w:themeColor="accent5" w:themeShade="BF"/>
+                <w:lang w:val="fr-FR"/>
+              </w:rPr>
+            </w:pPr>
+          </w:p>
+        </w:tc>
+      </w:tr>
+      <w:tr>
+        <w:tc>
+          <w:tcPr>
+            <w:tcW w:w="1317" w:type="dxa"/>
+            <w:tcBorders>
+              <w:right w:val="dashed" w:sz="2" w:space="0" w:color="4472C4" w:themeColor="accent1"/>
+            </w:tcBorders>
+          </w:tcPr>
+          <w:p>
+            <w:pPr>
+              <w:rPr>
+                <w:rFonts w:ascii="Roboto" w:hAnsi="Roboto" w:cs="Times New Roman"/>
+                <w:color w:val="2E74B5" w:themeColor="accent5" w:themeShade="BF"/>
+                <w:lang w:val="fr-FR"/>
+              </w:rPr>
+            </w:pPr>
+          </w:p>
+          <w:p>
+            <w:pPr>
+              <w:rPr>
+                <w:rFonts w:ascii="Roboto" w:hAnsi="Roboto" w:cs="Times New Roman"/>
+                <w:color w:val="2E74B5" w:themeColor="accent5" w:themeShade="BF"/>
+                <w:lang w:val="fr-FR"/>
+              </w:rPr>
+            </w:pPr>
+            <w:r>
+              <w:rPr>
+                <w:rFonts w:ascii="Roboto" w:hAnsi="Roboto" w:cs="Times New Roman"/>
+                <w:noProof/>
+                <w:color w:val="2E74B5" w:themeColor="accent5" w:themeShade="BF"/>
+                <w:lang w:val="fr-FR"/>
               </w:rPr>
               <w:drawing>
-                <wp:inline distT="0" distB="0" distL="0" distR="0" wp14:anchorId="33EE4865" wp14:editId="5FCCBC3B">
-                  <wp:extent cx="6922135" cy="2665563"/>
-                  <wp:effectExtent l="0" t="0" r="0" b="1905"/>
-                  <wp:docPr id="3" name="Picture 2">
+                <wp:inline distT="0" distB="0" distL="0" distR="0" wp14:anchorId="6437D491" wp14:editId="4F036302">
+                  <wp:extent cx="658368" cy="163641"/>
+                  <wp:effectExtent l="0" t="0" r="0" b="8255"/>
+                  <wp:docPr id="603481595" name="Image 1"/>
+                  <wp:cNvGraphicFramePr>
+                    <a:graphicFrameLocks xmlns:a="http://schemas.openxmlformats.org/drawingml/2006/main" noChangeAspect="1"/>
+                  </wp:cNvGraphicFramePr>
+                  <a:graphic xmlns:a="http://schemas.openxmlformats.org/drawingml/2006/main">
+                    <a:graphicData uri="http://schemas.openxmlformats.org/drawingml/2006/picture">
+                      <pic:pic xmlns:pic="http://schemas.openxmlformats.org/drawingml/2006/picture">
+                        <pic:nvPicPr>
+                          <pic:cNvPr id="603481595" name=""/>
+                          <pic:cNvPicPr/>
+                        </pic:nvPicPr>
+                        <pic:blipFill>
+                          <a:blip r:embed="rId8"/>
+                          <a:stretch>
+                            <a:fillRect/>
+                          </a:stretch>
+                        </pic:blipFill>
+                        <pic:spPr>
+                          <a:xfrm>
+                            <a:off x="0" y="0"/>
+                            <a:ext cx="827604" cy="205706"/>
+                          </a:xfrm>
+                          <a:prstGeom prst="rect">
+                            <a:avLst/>
+                          </a:prstGeom>
+                        </pic:spPr>
+                      </pic:pic>
+                    </a:graphicData>
+                  </a:graphic>
+                </wp:inline>
+              </w:drawing>
+            </w:r>
+          </w:p>
+          <w:p>
+            <w:pPr>
+              <w:rPr>
+                <w:rFonts w:ascii="Roboto" w:hAnsi="Roboto" w:cs="Times New Roman"/>
+                <w:color w:val="2E74B5" w:themeColor="accent5" w:themeShade="BF"/>
+                <w:lang w:val="fr-FR"/>
+              </w:rPr>
+            </w:pPr>
+            <w:r>
+              <w:rPr>
+                <w:rFonts w:ascii="Roboto" w:hAnsi="Roboto" w:cs="Times New Roman"/>
+                <w:noProof/>
+                <w:color w:val="2E74B5" w:themeColor="accent5" w:themeShade="BF"/>
+                <w:lang w:val="fr-FR"/>
+              </w:rPr>
+              <w:drawing>
+                <wp:inline distT="0" distB="0" distL="0" distR="0" wp14:anchorId="25833D2C" wp14:editId="41088DF9">
+                  <wp:extent cx="709574" cy="230720"/>
+                  <wp:effectExtent l="0" t="0" r="0" b="0"/>
+                  <wp:docPr id="644412935" name="Image 1"/>
+                  <wp:cNvGraphicFramePr>
+                    <a:graphicFrameLocks xmlns:a="http://schemas.openxmlformats.org/drawingml/2006/main" noChangeAspect="1"/>
+                  </wp:cNvGraphicFramePr>
+                  <a:graphic xmlns:a="http://schemas.openxmlformats.org/drawingml/2006/main">
+                    <a:graphicData uri="http://schemas.openxmlformats.org/drawingml/2006/picture">
+                      <pic:pic xmlns:pic="http://schemas.openxmlformats.org/drawingml/2006/picture">
+                        <pic:nvPicPr>
+                          <pic:cNvPr id="644412935" name=""/>
+                          <pic:cNvPicPr/>
+                        </pic:nvPicPr>
+                        <pic:blipFill>
+                          <a:blip r:embed="rId9"/>
+                          <a:stretch>
+                            <a:fillRect/>
+                          </a:stretch>
+                        </pic:blipFill>
+                        <pic:spPr>
+                          <a:xfrm>
+                            <a:off x="0" y="0"/>
+                            <a:ext cx="752659" cy="244729"/>
+                          </a:xfrm>
+                          <a:prstGeom prst="rect">
+                            <a:avLst/>
+                          </a:prstGeom>
+                        </pic:spPr>
+                      </pic:pic>
+                    </a:graphicData>
+                  </a:graphic>
+                </wp:inline>
+              </w:drawing>
+            </w:r>
+          </w:p>
+          <w:p>
+            <w:pPr>
+              <w:rPr>
+                <w:rFonts w:ascii="Roboto" w:hAnsi="Roboto" w:cs="Times New Roman"/>
+                <w:color w:val="2E74B5" w:themeColor="accent5" w:themeShade="BF"/>
+                <w:lang w:val="fr-FR"/>
+              </w:rPr>
+            </w:pPr>
+            <w:r>
+              <w:rPr>
+                <w:rFonts w:ascii="Roboto" w:hAnsi="Roboto" w:cs="Times New Roman"/>
+                <w:noProof/>
+                <w:color w:val="2E74B5" w:themeColor="accent5" w:themeShade="BF"/>
+                <w:lang w:val="fr-FR"/>
+              </w:rPr>
+              <w:drawing>
+                <wp:inline distT="0" distB="0" distL="0" distR="0" wp14:anchorId="6019B12E" wp14:editId="3EAAFDD6">
+                  <wp:extent cx="713537" cy="256699"/>
+                  <wp:effectExtent l="0" t="0" r="0" b="0"/>
+                  <wp:docPr id="1707915679" name="Image 1"/>
+                  <wp:cNvGraphicFramePr>
+                    <a:graphicFrameLocks xmlns:a="http://schemas.openxmlformats.org/drawingml/2006/main" noChangeAspect="1"/>
+                  </wp:cNvGraphicFramePr>
+                  <a:graphic xmlns:a="http://schemas.openxmlformats.org/drawingml/2006/main">
+                    <a:graphicData uri="http://schemas.openxmlformats.org/drawingml/2006/picture">
+                      <pic:pic xmlns:pic="http://schemas.openxmlformats.org/drawingml/2006/picture">
+                        <pic:nvPicPr>
+                          <pic:cNvPr id="1707915679" name=""/>
+                          <pic:cNvPicPr/>
+                        </pic:nvPicPr>
+                        <pic:blipFill>
+                          <a:blip r:embed="rId10"/>
+                          <a:stretch>
+                            <a:fillRect/>
+                          </a:stretch>
+                        </pic:blipFill>
+                        <pic:spPr>
+                          <a:xfrm>
+                            <a:off x="0" y="0"/>
+                            <a:ext cx="753703" cy="271149"/>
+                          </a:xfrm>
+                          <a:prstGeom prst="rect">
+                            <a:avLst/>
+                          </a:prstGeom>
+                        </pic:spPr>
+                      </pic:pic>
+                    </a:graphicData>
+                  </a:graphic>
+                </wp:inline>
+              </w:drawing>
+            </w:r>
+          </w:p>
+          <w:p>
+            <w:pPr>
+              <w:rPr>
+                <w:rFonts w:ascii="Roboto" w:hAnsi="Roboto" w:cs="Times New Roman"/>
+                <w:color w:val="2E74B5" w:themeColor="accent5" w:themeShade="BF"/>
+                <w:lang w:val="fr-FR"/>
+              </w:rPr>
+            </w:pPr>
+            <w:r>
+              <w:rPr>
+                <w:rFonts w:ascii="Roboto" w:hAnsi="Roboto" w:cs="Times New Roman"/>
+                <w:noProof/>
+                <w:color w:val="2E74B5" w:themeColor="accent5" w:themeShade="BF"/>
+                <w:lang w:val="fr-FR"/>
+              </w:rPr>
+              <w:drawing>
+                <wp:inline distT="0" distB="0" distL="0" distR="0" wp14:anchorId="7D7F2EE2" wp14:editId="2DAB0FF9">
+                  <wp:extent cx="672998" cy="260786"/>
+                  <wp:effectExtent l="0" t="0" r="0" b="6350"/>
+                  <wp:docPr id="469373778" name="Image 1"/>
+                  <wp:cNvGraphicFramePr>
+                    <a:graphicFrameLocks xmlns:a="http://schemas.openxmlformats.org/drawingml/2006/main" noChangeAspect="1"/>
+                  </wp:cNvGraphicFramePr>
+                  <a:graphic xmlns:a="http://schemas.openxmlformats.org/drawingml/2006/main">
+                    <a:graphicData uri="http://schemas.openxmlformats.org/drawingml/2006/picture">
+                      <pic:pic xmlns:pic="http://schemas.openxmlformats.org/drawingml/2006/picture">
+                        <pic:nvPicPr>
+                          <pic:cNvPr id="469373778" name=""/>
+                          <pic:cNvPicPr/>
+                        </pic:nvPicPr>
+                        <pic:blipFill>
+                          <a:blip r:embed="rId11"/>
+                          <a:stretch>
+                            <a:fillRect/>
+                          </a:stretch>
+                        </pic:blipFill>
+                        <pic:spPr>
+                          <a:xfrm>
+                            <a:off x="0" y="0"/>
+                            <a:ext cx="700182" cy="271320"/>
+                          </a:xfrm>
+                          <a:prstGeom prst="rect">
+                            <a:avLst/>
+                          </a:prstGeom>
+                        </pic:spPr>
+                      </pic:pic>
+                    </a:graphicData>
+                  </a:graphic>
+                </wp:inline>
+              </w:drawing>
+            </w:r>
+          </w:p>
+          <w:p>
+            <w:pPr>
+              <w:rPr>
+                <w:rFonts w:ascii="Roboto" w:hAnsi="Roboto" w:cs="Times New Roman"/>
+                <w:color w:val="2E74B5" w:themeColor="accent5" w:themeShade="BF"/>
+                <w:lang w:val="fr-FR"/>
+              </w:rPr>
+            </w:pPr>
+          </w:p>
+          <w:p>
+            <w:pPr>
+              <w:rPr>
+                <w:rFonts w:ascii="Roboto" w:hAnsi="Roboto" w:cs="Times New Roman"/>
+                <w:color w:val="2E74B5" w:themeColor="accent5" w:themeShade="BF"/>
+                <w:lang w:val="fr-FR"/>
+              </w:rPr>
+            </w:pPr>
+          </w:p>
+          <w:p>
+            <w:pPr>
+              <w:rPr>
+                <w:rFonts w:ascii="Roboto" w:hAnsi="Roboto" w:cs="Times New Roman"/>
+                <w:color w:val="2E74B5" w:themeColor="accent5" w:themeShade="BF"/>
+                <w:lang w:val="fr-FR"/>
+              </w:rPr>
+            </w:pPr>
+          </w:p>
+          <w:p>
+            <w:pPr>
+              <w:rPr>
+                <w:rFonts w:ascii="Roboto" w:hAnsi="Roboto" w:cs="Times New Roman"/>
+                <w:color w:val="2E74B5" w:themeColor="accent5" w:themeShade="BF"/>
+                <w:lang w:val="fr-FR"/>
+              </w:rPr>
+            </w:pPr>
+          </w:p>
+          <w:p>
+            <w:pPr>
+              <w:rPr>
+                <w:rFonts w:ascii="Roboto" w:hAnsi="Roboto" w:cs="Times New Roman"/>
+                <w:color w:val="2E74B5" w:themeColor="accent5" w:themeShade="BF"/>
+                <w:lang w:val="fr-FR"/>
+              </w:rPr>
+            </w:pPr>
+          </w:p>
+          <w:p>
+            <w:pPr>
+              <w:rPr>
+                <w:rFonts w:ascii="Roboto" w:hAnsi="Roboto" w:cs="Times New Roman"/>
+                <w:color w:val="2E74B5" w:themeColor="accent5" w:themeShade="BF"/>
+                <w:lang w:val="fr-FR"/>
+              </w:rPr>
+            </w:pPr>
+            <w:r>
+              <w:rPr>
+                <w:rFonts w:ascii="Roboto" w:hAnsi="Roboto" w:cs="Times New Roman"/>
+                <w:noProof/>
+                <w:color w:val="2E74B5" w:themeColor="accent5" w:themeShade="BF"/>
+                <w:lang w:val="fr-FR"/>
+              </w:rPr>
+              <w:drawing>
+                <wp:inline distT="0" distB="0" distL="0" distR="0" wp14:anchorId="39EF95F7" wp14:editId="533E6C75">
+                  <wp:extent cx="662178" cy="275191"/>
+                  <wp:effectExtent l="0" t="0" r="5080" b="0"/>
+                  <wp:docPr id="1410777429" name="Image 1"/>
+                  <wp:cNvGraphicFramePr>
+                    <a:graphicFrameLocks xmlns:a="http://schemas.openxmlformats.org/drawingml/2006/main" noChangeAspect="1"/>
+                  </wp:cNvGraphicFramePr>
+                  <a:graphic xmlns:a="http://schemas.openxmlformats.org/drawingml/2006/main">
+                    <a:graphicData uri="http://schemas.openxmlformats.org/drawingml/2006/picture">
+                      <pic:pic xmlns:pic="http://schemas.openxmlformats.org/drawingml/2006/picture">
+                        <pic:nvPicPr>
+                          <pic:cNvPr id="1410777429" name=""/>
+                          <pic:cNvPicPr/>
+                        </pic:nvPicPr>
+                        <pic:blipFill>
+                          <a:blip r:embed="rId12"/>
+                          <a:stretch>
+                            <a:fillRect/>
+                          </a:stretch>
+                        </pic:blipFill>
+                        <pic:spPr>
+                          <a:xfrm>
+                            <a:off x="0" y="0"/>
+                            <a:ext cx="694507" cy="288627"/>
+                          </a:xfrm>
+                          <a:prstGeom prst="rect">
+                            <a:avLst/>
+                          </a:prstGeom>
+                        </pic:spPr>
+                      </pic:pic>
+                    </a:graphicData>
+                  </a:graphic>
+                </wp:inline>
+              </w:drawing>
+            </w:r>
+          </w:p>
+        </w:tc>
+        <w:tc>
+          <w:tcPr>
+            <w:tcW w:w="10049" w:type="dxa"/>
+            <w:tcBorders>
+              <w:left w:val="dashed" w:sz="2" w:space="0" w:color="4472C4" w:themeColor="accent1"/>
+            </w:tcBorders>
+          </w:tcPr>
+          <w:p>
+            <w:pPr>
+              <w:rPr>
+                <w:rFonts w:ascii="Roboto" w:hAnsi="Roboto" w:cs="Times New Roman"/>
+                <w:color w:val="2E74B5" w:themeColor="accent5" w:themeShade="BF"/>
+                <w:lang w:val="fr-FR"/>
+              </w:rPr>
+            </w:pPr>
+            <w:r>
+              <w:rPr>
+                <w:rFonts w:ascii="Roboto" w:hAnsi="Roboto"/>
+                <w:noProof/>
+              </w:rPr>
+              <w:drawing>
+                <wp:inline distT="0" distB="0" distL="0" distR="0" wp14:anchorId="29FACFD5" wp14:editId="75690B7E">
+                  <wp:extent cx="6368415" cy="2531060"/>
+                  <wp:effectExtent l="0" t="0" r="0" b="0"/>
+                  <wp:docPr id="1620573966" name="Picture 2">
                     <a:extLst xmlns:a="http://schemas.openxmlformats.org/drawingml/2006/main">
                       <a:ext uri="{FF2B5EF4-FFF2-40B4-BE49-F238E27FC236}">
                         <a16:creationId xmlns:a16="http://schemas.microsoft.com/office/drawing/2014/main" id="{4B59C9BB-86D9-42BE-9F35-8197D3F79BCC}"/>
@@ -1553,20 +2156,29 @@
                             <a:picLocks noChangeAspect="1"/>
                           </pic:cNvPicPr>
                         </pic:nvPicPr>
-                        <pic:blipFill>
-                          <a:blip r:embed="rId8"/>
+                        <pic:blipFill rotWithShape="1">
+                          <a:blip r:embed="rId13"/>
+                          <a:srcRect b="-3210"/>
                           <a:stretch>
                             <a:fillRect/>
                           </a:stretch>
                         </pic:blipFill>
-                        <pic:spPr>
+                        <pic:spPr bwMode="auto">
                           <a:xfrm>
                             <a:off x="0" y="0"/>
-                            <a:ext cx="6945295" cy="2674482"/>
+                            <a:ext cx="6448353" cy="2562831"/>
                           </a:xfrm>
                           <a:prstGeom prst="rect">
                             <a:avLst/>
                           </a:prstGeom>
+                          <a:ln>
+                            <a:noFill/>
+                          </a:ln>
+                          <a:extLst>
+                            <a:ext uri="{53640926-AAD7-44D8-BBD7-CCE9431645EC}">
+                              <a14:shadowObscured xmlns:a14="http://schemas.microsoft.com/office/drawing/2010/main"/>
+                            </a:ext>
+                          </a:extLst>
                         </pic:spPr>
                       </pic:pic>
                     </a:graphicData>
@@ -1575,41 +2187,41 @@
               </w:drawing>
             </w:r>
           </w:p>
+          <w:p>
+            <w:pPr>
+              <w:rPr>
+                <w:rFonts w:ascii="Roboto" w:hAnsi="Roboto" w:cs="Times New Roman"/>
+                <w:color w:val="2E74B5" w:themeColor="accent5" w:themeShade="BF"/>
+                <w:lang w:val="fr-FR"/>
+              </w:rPr>
+            </w:pPr>
+          </w:p>
         </w:tc>
       </w:tr>
       <w:tr>
         <w:tc>
           <w:tcPr>
-            <w:tcW w:w="11690" w:type="dxa"/>
+            <w:tcW w:w="11366" w:type="dxa"/>
+            <w:gridSpan w:val="2"/>
           </w:tcPr>
           <w:p>
             <w:pPr>
-              <w:jc w:val="center"/>
-              <w:rPr>
-                <w:rFonts w:ascii="Times New Roman" w:hAnsi="Times New Roman" w:cs="Times New Roman"/>
-                <w:color w:val="2E74B5" w:themeColor="accent5" w:themeShade="BF"/>
-                <w:lang w:val="fr-FR"/>
-              </w:rPr>
-            </w:pPr>
-          </w:p>
-          <w:p>
-            <w:pPr>
-              <w:jc w:val="center"/>
-              <w:rPr>
-                <w:rFonts w:ascii="Times New Roman" w:hAnsi="Times New Roman" w:cs="Times New Roman"/>
-                <w:color w:val="2E74B5" w:themeColor="accent5" w:themeShade="BF"/>
-                <w:lang w:val="fr-FR"/>
-              </w:rPr>
-            </w:pPr>
-            <w:r>
-              <w:rPr>
+              <w:rPr>
+                <w:rFonts w:ascii="Roboto" w:hAnsi="Roboto" w:cs="Times New Roman"/>
+                <w:color w:val="2E74B5" w:themeColor="accent5" w:themeShade="BF"/>
+                <w:lang w:val="fr-FR"/>
+              </w:rPr>
+            </w:pPr>
+            <w:r>
+              <w:rPr>
+                <w:rFonts w:ascii="Roboto" w:hAnsi="Roboto"/>
                 <w:noProof/>
               </w:rPr>
               <w:drawing>
-                <wp:inline distT="0" distB="0" distL="0" distR="0" wp14:anchorId="1E249EA1" wp14:editId="43CA1C80">
-                  <wp:extent cx="6678393" cy="3705225"/>
-                  <wp:effectExtent l="0" t="0" r="8255" b="0"/>
-                  <wp:docPr id="4" name="Picture 3">
+                <wp:inline distT="0" distB="0" distL="0" distR="0" wp14:anchorId="0E5C0CF5" wp14:editId="2B51C535">
+                  <wp:extent cx="6675927" cy="1199692"/>
+                  <wp:effectExtent l="0" t="0" r="0" b="635"/>
+                  <wp:docPr id="243210212" name="Picture 3">
                     <a:extLst xmlns:a="http://schemas.openxmlformats.org/drawingml/2006/main">
                       <a:ext uri="{FF2B5EF4-FFF2-40B4-BE49-F238E27FC236}">
                         <a16:creationId xmlns:a16="http://schemas.microsoft.com/office/drawing/2014/main" id="{0DE47A06-2927-46C4-A2FC-B3FAB1A921E1}"/>
@@ -1634,20 +2246,29 @@
                             <a:picLocks noChangeAspect="1"/>
                           </pic:cNvPicPr>
                         </pic:nvPicPr>
-                        <pic:blipFill>
-                          <a:blip r:embed="rId9"/>
+                        <pic:blipFill rotWithShape="1">
+                          <a:blip r:embed="rId14"/>
+                          <a:srcRect b="67610"/>
                           <a:stretch>
                             <a:fillRect/>
                           </a:stretch>
                         </pic:blipFill>
-                        <pic:spPr>
+                        <pic:spPr bwMode="auto">
                           <a:xfrm>
                             <a:off x="0" y="0"/>
-                            <a:ext cx="6748758" cy="3744264"/>
+                            <a:ext cx="6748758" cy="1212780"/>
                           </a:xfrm>
                           <a:prstGeom prst="rect">
                             <a:avLst/>
                           </a:prstGeom>
+                          <a:ln>
+                            <a:noFill/>
+                          </a:ln>
+                          <a:extLst>
+                            <a:ext uri="{53640926-AAD7-44D8-BBD7-CCE9431645EC}">
+                              <a14:shadowObscured xmlns:a14="http://schemas.microsoft.com/office/drawing/2010/main"/>
+                            </a:ext>
+                          </a:extLst>
                         </pic:spPr>
                       </pic:pic>
                     </a:graphicData>
@@ -1656,20 +2277,290 @@
               </w:drawing>
             </w:r>
           </w:p>
+          <w:p>
+            <w:pPr>
+              <w:rPr>
+                <w:rFonts w:ascii="Roboto" w:hAnsi="Roboto" w:cs="Times New Roman"/>
+                <w:color w:val="2E74B5" w:themeColor="accent5" w:themeShade="BF"/>
+                <w:lang w:val="fr-FR"/>
+              </w:rPr>
+            </w:pPr>
+          </w:p>
+        </w:tc>
+      </w:tr>
+      <w:tr>
+        <w:tc>
+          <w:tcPr>
+            <w:tcW w:w="11366" w:type="dxa"/>
+            <w:gridSpan w:val="2"/>
+          </w:tcPr>
+          <w:p>
+            <w:pPr>
+              <w:rPr>
+                <w:rFonts w:ascii="Roboto" w:hAnsi="Roboto" w:cs="Times New Roman"/>
+                <w:color w:val="2E74B5" w:themeColor="accent5" w:themeShade="BF"/>
+                <w:lang w:val="fr-FR"/>
+              </w:rPr>
+            </w:pPr>
+            <w:r>
+              <w:rPr>
+                <w:rFonts w:ascii="Roboto" w:hAnsi="Roboto"/>
+                <w:noProof/>
+              </w:rPr>
+              <w:drawing>
+                <wp:inline distT="0" distB="0" distL="0" distR="0" wp14:anchorId="0E4809AF" wp14:editId="4CF17A2D">
+                  <wp:extent cx="6675111" cy="548640"/>
+                  <wp:effectExtent l="0" t="0" r="0" b="3810"/>
+                  <wp:docPr id="1635837664" name="Picture 3">
+                    <a:extLst xmlns:a="http://schemas.openxmlformats.org/drawingml/2006/main">
+                      <a:ext uri="{FF2B5EF4-FFF2-40B4-BE49-F238E27FC236}">
+                        <a16:creationId xmlns:a16="http://schemas.microsoft.com/office/drawing/2014/main" id="{0DE47A06-2927-46C4-A2FC-B3FAB1A921E1}"/>
+                      </a:ext>
+                    </a:extLst>
+                  </wp:docPr>
+                  <wp:cNvGraphicFramePr>
+                    <a:graphicFrameLocks xmlns:a="http://schemas.openxmlformats.org/drawingml/2006/main" noChangeAspect="1"/>
+                  </wp:cNvGraphicFramePr>
+                  <a:graphic xmlns:a="http://schemas.openxmlformats.org/drawingml/2006/main">
+                    <a:graphicData uri="http://schemas.openxmlformats.org/drawingml/2006/picture">
+                      <pic:pic xmlns:pic="http://schemas.openxmlformats.org/drawingml/2006/picture">
+                        <pic:nvPicPr>
+                          <pic:cNvPr id="4" name="Picture 3">
+                            <a:extLst>
+                              <a:ext uri="{FF2B5EF4-FFF2-40B4-BE49-F238E27FC236}">
+                                <a16:creationId xmlns:a16="http://schemas.microsoft.com/office/drawing/2014/main" id="{0DE47A06-2927-46C4-A2FC-B3FAB1A921E1}"/>
+                              </a:ext>
+                            </a:extLst>
+                          </pic:cNvPr>
+                          <pic:cNvPicPr>
+                            <a:picLocks noChangeAspect="1"/>
+                          </pic:cNvPicPr>
+                        </pic:nvPicPr>
+                        <pic:blipFill rotWithShape="1">
+                          <a:blip r:embed="rId14"/>
+                          <a:srcRect t="34551" b="50635"/>
+                          <a:stretch>
+                            <a:fillRect/>
+                          </a:stretch>
+                        </pic:blipFill>
+                        <pic:spPr bwMode="auto">
+                          <a:xfrm>
+                            <a:off x="0" y="0"/>
+                            <a:ext cx="6748758" cy="554693"/>
+                          </a:xfrm>
+                          <a:prstGeom prst="rect">
+                            <a:avLst/>
+                          </a:prstGeom>
+                          <a:ln>
+                            <a:noFill/>
+                          </a:ln>
+                          <a:extLst>
+                            <a:ext uri="{53640926-AAD7-44D8-BBD7-CCE9431645EC}">
+                              <a14:shadowObscured xmlns:a14="http://schemas.microsoft.com/office/drawing/2010/main"/>
+                            </a:ext>
+                          </a:extLst>
+                        </pic:spPr>
+                      </pic:pic>
+                    </a:graphicData>
+                  </a:graphic>
+                </wp:inline>
+              </w:drawing>
+            </w:r>
+          </w:p>
+          <w:p>
+            <w:pPr>
+              <w:rPr>
+                <w:rFonts w:ascii="Roboto" w:hAnsi="Roboto" w:cs="Times New Roman"/>
+                <w:color w:val="2E74B5" w:themeColor="accent5" w:themeShade="BF"/>
+                <w:lang w:val="fr-FR"/>
+              </w:rPr>
+            </w:pPr>
+          </w:p>
+        </w:tc>
+      </w:tr>
+      <w:tr>
+        <w:tc>
+          <w:tcPr>
+            <w:tcW w:w="11366" w:type="dxa"/>
+            <w:gridSpan w:val="2"/>
+          </w:tcPr>
+          <w:p>
+            <w:pPr>
+              <w:rPr>
+                <w:rFonts w:ascii="Roboto" w:hAnsi="Roboto" w:cs="Times New Roman"/>
+                <w:color w:val="2E74B5" w:themeColor="accent5" w:themeShade="BF"/>
+                <w:lang w:val="fr-FR"/>
+              </w:rPr>
+            </w:pPr>
+            <w:r>
+              <w:rPr>
+                <w:rFonts w:ascii="Roboto" w:hAnsi="Roboto"/>
+                <w:noProof/>
+              </w:rPr>
+              <w:drawing>
+                <wp:inline distT="0" distB="0" distL="0" distR="0" wp14:anchorId="3A3D9F2E" wp14:editId="6A7297DD">
+                  <wp:extent cx="6675755" cy="709574"/>
+                  <wp:effectExtent l="0" t="0" r="0" b="0"/>
+                  <wp:docPr id="1913702586" name="Picture 3">
+                    <a:extLst xmlns:a="http://schemas.openxmlformats.org/drawingml/2006/main">
+                      <a:ext uri="{FF2B5EF4-FFF2-40B4-BE49-F238E27FC236}">
+                        <a16:creationId xmlns:a16="http://schemas.microsoft.com/office/drawing/2014/main" id="{0DE47A06-2927-46C4-A2FC-B3FAB1A921E1}"/>
+                      </a:ext>
+                    </a:extLst>
+                  </wp:docPr>
+                  <wp:cNvGraphicFramePr>
+                    <a:graphicFrameLocks xmlns:a="http://schemas.openxmlformats.org/drawingml/2006/main" noChangeAspect="1"/>
+                  </wp:cNvGraphicFramePr>
+                  <a:graphic xmlns:a="http://schemas.openxmlformats.org/drawingml/2006/main">
+                    <a:graphicData uri="http://schemas.openxmlformats.org/drawingml/2006/picture">
+                      <pic:pic xmlns:pic="http://schemas.openxmlformats.org/drawingml/2006/picture">
+                        <pic:nvPicPr>
+                          <pic:cNvPr id="4" name="Picture 3">
+                            <a:extLst>
+                              <a:ext uri="{FF2B5EF4-FFF2-40B4-BE49-F238E27FC236}">
+                                <a16:creationId xmlns:a16="http://schemas.microsoft.com/office/drawing/2014/main" id="{0DE47A06-2927-46C4-A2FC-B3FAB1A921E1}"/>
+                              </a:ext>
+                            </a:extLst>
+                          </pic:cNvPr>
+                          <pic:cNvPicPr>
+                            <a:picLocks noChangeAspect="1"/>
+                          </pic:cNvPicPr>
+                        </pic:nvPicPr>
+                        <pic:blipFill rotWithShape="1">
+                          <a:blip r:embed="rId14"/>
+                          <a:srcRect t="50147" b="30694"/>
+                          <a:stretch>
+                            <a:fillRect/>
+                          </a:stretch>
+                        </pic:blipFill>
+                        <pic:spPr bwMode="auto">
+                          <a:xfrm>
+                            <a:off x="0" y="0"/>
+                            <a:ext cx="6748758" cy="717334"/>
+                          </a:xfrm>
+                          <a:prstGeom prst="rect">
+                            <a:avLst/>
+                          </a:prstGeom>
+                          <a:ln>
+                            <a:noFill/>
+                          </a:ln>
+                          <a:extLst>
+                            <a:ext uri="{53640926-AAD7-44D8-BBD7-CCE9431645EC}">
+                              <a14:shadowObscured xmlns:a14="http://schemas.microsoft.com/office/drawing/2010/main"/>
+                            </a:ext>
+                          </a:extLst>
+                        </pic:spPr>
+                      </pic:pic>
+                    </a:graphicData>
+                  </a:graphic>
+                </wp:inline>
+              </w:drawing>
+            </w:r>
+          </w:p>
+          <w:p>
+            <w:pPr>
+              <w:rPr>
+                <w:rFonts w:ascii="Roboto" w:hAnsi="Roboto" w:cs="Times New Roman"/>
+                <w:color w:val="2E74B5" w:themeColor="accent5" w:themeShade="BF"/>
+                <w:lang w:val="fr-FR"/>
+              </w:rPr>
+            </w:pPr>
+          </w:p>
+        </w:tc>
+      </w:tr>
+      <w:tr>
+        <w:tc>
+          <w:tcPr>
+            <w:tcW w:w="11366" w:type="dxa"/>
+            <w:gridSpan w:val="2"/>
+          </w:tcPr>
+          <w:p>
+            <w:pPr>
+              <w:rPr>
+                <w:rFonts w:ascii="Roboto" w:hAnsi="Roboto" w:cs="Times New Roman"/>
+                <w:color w:val="2E74B5" w:themeColor="accent5" w:themeShade="BF"/>
+                <w:lang w:val="fr-FR"/>
+              </w:rPr>
+            </w:pPr>
+            <w:r>
+              <w:rPr>
+                <w:rFonts w:ascii="Roboto" w:hAnsi="Roboto"/>
+                <w:noProof/>
+              </w:rPr>
+              <w:drawing>
+                <wp:inline distT="0" distB="0" distL="0" distR="0" wp14:anchorId="36C2A83C" wp14:editId="67E6B471">
+                  <wp:extent cx="6676956" cy="1236269"/>
+                  <wp:effectExtent l="0" t="0" r="0" b="0"/>
+                  <wp:docPr id="1316961098" name="Picture 3">
+                    <a:extLst xmlns:a="http://schemas.openxmlformats.org/drawingml/2006/main">
+                      <a:ext uri="{FF2B5EF4-FFF2-40B4-BE49-F238E27FC236}">
+                        <a16:creationId xmlns:a16="http://schemas.microsoft.com/office/drawing/2014/main" id="{0DE47A06-2927-46C4-A2FC-B3FAB1A921E1}"/>
+                      </a:ext>
+                    </a:extLst>
+                  </wp:docPr>
+                  <wp:cNvGraphicFramePr>
+                    <a:graphicFrameLocks xmlns:a="http://schemas.openxmlformats.org/drawingml/2006/main" noChangeAspect="1"/>
+                  </wp:cNvGraphicFramePr>
+                  <a:graphic xmlns:a="http://schemas.openxmlformats.org/drawingml/2006/main">
+                    <a:graphicData uri="http://schemas.openxmlformats.org/drawingml/2006/picture">
+                      <pic:pic xmlns:pic="http://schemas.openxmlformats.org/drawingml/2006/picture">
+                        <pic:nvPicPr>
+                          <pic:cNvPr id="4" name="Picture 3">
+                            <a:extLst>
+                              <a:ext uri="{FF2B5EF4-FFF2-40B4-BE49-F238E27FC236}">
+                                <a16:creationId xmlns:a16="http://schemas.microsoft.com/office/drawing/2014/main" id="{0DE47A06-2927-46C4-A2FC-B3FAB1A921E1}"/>
+                              </a:ext>
+                            </a:extLst>
+                          </pic:cNvPr>
+                          <pic:cNvPicPr>
+                            <a:picLocks noChangeAspect="1"/>
+                          </pic:cNvPicPr>
+                        </pic:nvPicPr>
+                        <pic:blipFill rotWithShape="1">
+                          <a:blip r:embed="rId14"/>
+                          <a:srcRect t="69693" b="-3066"/>
+                          <a:stretch>
+                            <a:fillRect/>
+                          </a:stretch>
+                        </pic:blipFill>
+                        <pic:spPr bwMode="auto">
+                          <a:xfrm>
+                            <a:off x="0" y="0"/>
+                            <a:ext cx="6748758" cy="1249564"/>
+                          </a:xfrm>
+                          <a:prstGeom prst="rect">
+                            <a:avLst/>
+                          </a:prstGeom>
+                          <a:ln>
+                            <a:noFill/>
+                          </a:ln>
+                          <a:extLst>
+                            <a:ext uri="{53640926-AAD7-44D8-BBD7-CCE9431645EC}">
+                              <a14:shadowObscured xmlns:a14="http://schemas.microsoft.com/office/drawing/2010/main"/>
+                            </a:ext>
+                          </a:extLst>
+                        </pic:spPr>
+                      </pic:pic>
+                    </a:graphicData>
+                  </a:graphic>
+                </wp:inline>
+              </w:drawing>
+            </w:r>
+          </w:p>
         </w:tc>
       </w:tr>
     </w:tbl>
     <w:p>
       <w:pPr>
         <w:rPr>
-          <w:rFonts w:ascii="Times New Roman" w:hAnsi="Times New Roman" w:cs="Times New Roman"/>
-          <w:color w:val="2E74B5" w:themeColor="accent5" w:themeShade="BF"/>
-          <w:lang w:val="fr-FR"/>
-        </w:rPr>
-      </w:pPr>
-      <w:r>
-        <w:rPr>
-          <w:rFonts w:ascii="Times New Roman" w:hAnsi="Times New Roman" w:cs="Times New Roman"/>
+          <w:rFonts w:ascii="Roboto" w:hAnsi="Roboto" w:cs="Times New Roman"/>
+          <w:color w:val="2E74B5" w:themeColor="accent5" w:themeShade="BF"/>
+          <w:lang w:val="fr-FR"/>
+        </w:rPr>
+      </w:pPr>
+      <w:r>
+        <w:rPr>
+          <w:rFonts w:ascii="Roboto" w:hAnsi="Roboto" w:cs="Times New Roman"/>
           <w:color w:val="2E74B5" w:themeColor="accent5" w:themeShade="BF"/>
           <w:lang w:val="fr-FR"/>
         </w:rPr>
@@ -1678,29 +2569,55 @@
     </w:p>
     <w:p>
       <w:pPr>
-        <w:jc w:val="center"/>
-        <w:rPr>
-          <w:rFonts w:ascii="Times New Roman" w:hAnsi="Times New Roman" w:cs="Times New Roman"/>
-          <w:color w:val="2E74B5" w:themeColor="accent5" w:themeShade="BF"/>
-          <w:lang w:val="fr-FR"/>
-        </w:rPr>
-      </w:pPr>
+        <w:rPr>
+          <w:rFonts w:ascii="Roboto" w:hAnsi="Roboto" w:cs="Times New Roman"/>
+          <w:color w:val="2E74B5" w:themeColor="accent5" w:themeShade="BF"/>
+          <w:lang w:val="fr-FR"/>
+        </w:rPr>
+      </w:pPr>
+      <w:r>
+        <w:rPr>
+          <w:rFonts w:ascii="Roboto" w:hAnsi="Roboto" w:cs="Times New Roman"/>
+          <w:color w:val="2E74B5" w:themeColor="accent5" w:themeShade="BF"/>
+          <w:lang w:val="fr-FR"/>
+        </w:rPr>
+        <w:lastRenderedPageBreak/>
+        <w:t>Contrats</w:t>
+      </w:r>
     </w:p>
     <w:p>
       <w:pPr>
-        <w:jc w:val="center"/>
-        <w:rPr>
-          <w:rFonts w:ascii="Times New Roman" w:hAnsi="Times New Roman" w:cs="Times New Roman"/>
-          <w:color w:val="2E74B5" w:themeColor="accent5" w:themeShade="BF"/>
-          <w:lang w:val="fr-FR"/>
-        </w:rPr>
-      </w:pPr>
+        <w:pStyle w:val="Paragraphedeliste"/>
+        <w:numPr>
+          <w:ilvl w:val="0"/>
+          <w:numId w:val="3"/>
+        </w:numPr>
+        <w:tabs>
+          <w:tab w:val="left" w:pos="851"/>
+        </w:tabs>
+        <w:rPr>
+          <w:rFonts w:ascii="Roboto" w:hAnsi="Roboto" w:cs="Times New Roman"/>
+          <w:color w:val="2E74B5" w:themeColor="accent5" w:themeShade="BF"/>
+          <w:lang w:val="fr-FR"/>
+        </w:rPr>
+      </w:pPr>
+      <w:r>
+        <w:rPr>
+          <w:rFonts w:ascii="Roboto" w:hAnsi="Roboto" w:cs="Times New Roman"/>
+          <w:color w:val="2E74B5" w:themeColor="accent5" w:themeShade="BF"/>
+          <w:lang w:val="fr-FR"/>
+        </w:rPr>
+        <w:t>Location</w:t>
+      </w:r>
     </w:p>
     <w:p>
       <w:pPr>
-        <w:jc w:val="center"/>
-        <w:rPr>
-          <w:rFonts w:ascii="Times New Roman" w:hAnsi="Times New Roman" w:cs="Times New Roman"/>
+        <w:pStyle w:val="Paragraphedeliste"/>
+        <w:tabs>
+          <w:tab w:val="left" w:pos="851"/>
+        </w:tabs>
+        <w:rPr>
+          <w:rFonts w:ascii="Roboto" w:hAnsi="Roboto" w:cs="Times New Roman"/>
           <w:color w:val="2E74B5" w:themeColor="accent5" w:themeShade="BF"/>
           <w:lang w:val="fr-FR"/>
         </w:rPr>
@@ -1708,23 +2625,1064 @@
     </w:p>
     <w:p>
       <w:pPr>
-        <w:jc w:val="center"/>
-        <w:rPr>
-          <w:rFonts w:ascii="Times New Roman" w:hAnsi="Times New Roman" w:cs="Times New Roman"/>
-          <w:color w:val="2E74B5" w:themeColor="accent5" w:themeShade="BF"/>
-          <w:lang w:val="fr-FR"/>
-        </w:rPr>
-      </w:pPr>
+        <w:pStyle w:val="Paragraphedeliste"/>
+        <w:numPr>
+          <w:ilvl w:val="0"/>
+          <w:numId w:val="3"/>
+        </w:numPr>
+        <w:tabs>
+          <w:tab w:val="left" w:pos="851"/>
+        </w:tabs>
+        <w:rPr>
+          <w:rFonts w:ascii="Roboto" w:hAnsi="Roboto" w:cs="Times New Roman"/>
+          <w:color w:val="2E74B5" w:themeColor="accent5" w:themeShade="BF"/>
+          <w:lang w:val="fr-FR"/>
+        </w:rPr>
+      </w:pPr>
+      <w:r>
+        <w:rPr>
+          <w:rFonts w:ascii="Roboto" w:hAnsi="Roboto" w:cs="Times New Roman"/>
+          <w:color w:val="2E74B5" w:themeColor="accent5" w:themeShade="BF"/>
+          <w:lang w:val="fr-FR"/>
+        </w:rPr>
+        <w:t>Assurance</w:t>
+      </w:r>
     </w:p>
     <w:p>
       <w:pPr>
+        <w:pStyle w:val="Paragraphedeliste"/>
+        <w:numPr>
+          <w:ilvl w:val="0"/>
+          <w:numId w:val="3"/>
+        </w:numPr>
+        <w:tabs>
+          <w:tab w:val="left" w:pos="851"/>
+        </w:tabs>
+        <w:rPr>
+          <w:rFonts w:ascii="Roboto" w:hAnsi="Roboto" w:cs="Times New Roman"/>
+          <w:color w:val="2E74B5" w:themeColor="accent5" w:themeShade="BF"/>
+          <w:lang w:val="fr-FR"/>
+        </w:rPr>
+      </w:pPr>
+      <w:r>
+        <w:rPr>
+          <w:rFonts w:ascii="Roboto" w:hAnsi="Roboto" w:cs="Times New Roman"/>
+          <w:color w:val="2E74B5" w:themeColor="accent5" w:themeShade="BF"/>
+          <w:lang w:val="fr-FR"/>
+        </w:rPr>
+        <w:t>Entretien</w:t>
+      </w:r>
+    </w:p>
+    <w:p>
+      <w:pPr>
+        <w:pStyle w:val="Paragraphedeliste"/>
+        <w:numPr>
+          <w:ilvl w:val="0"/>
+          <w:numId w:val="3"/>
+        </w:numPr>
+        <w:tabs>
+          <w:tab w:val="left" w:pos="851"/>
+        </w:tabs>
+        <w:rPr>
+          <w:rFonts w:ascii="Roboto" w:hAnsi="Roboto" w:cs="Times New Roman"/>
+          <w:color w:val="2E74B5" w:themeColor="accent5" w:themeShade="BF"/>
+          <w:lang w:val="fr-FR"/>
+        </w:rPr>
+      </w:pPr>
+      <w:r>
+        <w:rPr>
+          <w:rFonts w:ascii="Roboto" w:hAnsi="Roboto" w:cs="Times New Roman"/>
+          <w:color w:val="2E74B5" w:themeColor="accent5" w:themeShade="BF"/>
+          <w:lang w:val="fr-FR"/>
+        </w:rPr>
+        <w:t>ANFR</w:t>
+      </w:r>
+    </w:p>
+    <w:p>
+      <w:pPr>
+        <w:pStyle w:val="Paragraphedeliste"/>
+        <w:numPr>
+          <w:ilvl w:val="0"/>
+          <w:numId w:val="3"/>
+        </w:numPr>
+        <w:tabs>
+          <w:tab w:val="left" w:pos="851"/>
+        </w:tabs>
+        <w:rPr>
+          <w:rFonts w:ascii="Roboto" w:hAnsi="Roboto" w:cs="Times New Roman"/>
+          <w:color w:val="2E74B5" w:themeColor="accent5" w:themeShade="BF"/>
+          <w:lang w:val="fr-FR"/>
+        </w:rPr>
+      </w:pPr>
+      <w:r>
+        <w:rPr>
+          <w:rFonts w:ascii="Roboto" w:hAnsi="Roboto" w:cs="Times New Roman"/>
+          <w:color w:val="2E74B5" w:themeColor="accent5" w:themeShade="BF"/>
+          <w:lang w:val="fr-FR"/>
+        </w:rPr>
+        <w:t>Moteur, cale, port, …</w:t>
+      </w:r>
+    </w:p>
+    <w:p>
+      <w:pPr>
+        <w:rPr>
+          <w:rFonts w:ascii="Roboto" w:hAnsi="Roboto" w:cs="Times New Roman"/>
+          <w:color w:val="2E74B5" w:themeColor="accent5" w:themeShade="BF"/>
+          <w:lang w:val="fr-FR"/>
+        </w:rPr>
+      </w:pPr>
+      <w:r>
+        <w:rPr>
+          <w:rFonts w:ascii="Roboto" w:hAnsi="Roboto" w:cs="Times New Roman"/>
+          <w:color w:val="2E74B5" w:themeColor="accent5" w:themeShade="BF"/>
+          <w:lang w:val="fr-FR"/>
+        </w:rPr>
+        <w:br w:type="page"/>
+      </w:r>
+    </w:p>
+    <w:p>
+      <w:pPr>
+        <w:tabs>
+          <w:tab w:val="left" w:pos="851"/>
+        </w:tabs>
+        <w:rPr>
+          <w:rFonts w:ascii="Roboto" w:hAnsi="Roboto" w:cs="Times New Roman"/>
+          <w:color w:val="2E74B5" w:themeColor="accent5" w:themeShade="BF"/>
+          <w:lang w:val="fr-FR"/>
+        </w:rPr>
+      </w:pPr>
+      <w:r>
+        <w:rPr>
+          <w:rFonts w:ascii="Roboto" w:hAnsi="Roboto" w:cs="Times New Roman"/>
+          <w:color w:val="2E74B5" w:themeColor="accent5" w:themeShade="BF"/>
+          <w:lang w:val="fr-FR"/>
+        </w:rPr>
+        <w:lastRenderedPageBreak/>
+        <w:t>Voiles</w:t>
+      </w:r>
+    </w:p>
+    <w:p>
+      <w:pPr>
+        <w:pStyle w:val="Paragraphedeliste"/>
+        <w:numPr>
+          <w:ilvl w:val="0"/>
+          <w:numId w:val="4"/>
+        </w:numPr>
+        <w:tabs>
+          <w:tab w:val="left" w:pos="851"/>
+        </w:tabs>
+        <w:rPr>
+          <w:rFonts w:ascii="Roboto" w:hAnsi="Roboto" w:cs="Times New Roman"/>
+          <w:color w:val="2E74B5" w:themeColor="accent5" w:themeShade="BF"/>
+          <w:lang w:val="fr-FR"/>
+        </w:rPr>
+      </w:pPr>
+      <w:r>
+        <w:rPr>
+          <w:rFonts w:ascii="Roboto" w:hAnsi="Roboto" w:cs="Times New Roman"/>
+          <w:color w:val="2E74B5" w:themeColor="accent5" w:themeShade="BF"/>
+          <w:lang w:val="fr-FR"/>
+        </w:rPr>
+        <w:t xml:space="preserve">Taille </w:t>
+      </w:r>
+      <w:proofErr w:type="spellStart"/>
+      <w:r>
+        <w:rPr>
+          <w:rFonts w:ascii="Roboto" w:hAnsi="Roboto" w:cs="Times New Roman"/>
+          <w:color w:val="2E74B5" w:themeColor="accent5" w:themeShade="BF"/>
+          <w:lang w:val="fr-FR"/>
+        </w:rPr>
+        <w:t>patara</w:t>
+      </w:r>
+      <w:proofErr w:type="spellEnd"/>
+      <w:r>
+        <w:rPr>
+          <w:rFonts w:ascii="Roboto" w:hAnsi="Roboto" w:cs="Times New Roman"/>
+          <w:color w:val="2E74B5" w:themeColor="accent5" w:themeShade="BF"/>
+          <w:lang w:val="fr-FR"/>
+        </w:rPr>
+        <w:t xml:space="preserve">, </w:t>
+      </w:r>
+      <w:proofErr w:type="spellStart"/>
+      <w:r>
+        <w:rPr>
+          <w:rFonts w:ascii="Roboto" w:hAnsi="Roboto" w:cs="Times New Roman"/>
+          <w:color w:val="2E74B5" w:themeColor="accent5" w:themeShade="BF"/>
+          <w:lang w:val="fr-FR"/>
+        </w:rPr>
+        <w:t>etai</w:t>
+      </w:r>
+      <w:proofErr w:type="spellEnd"/>
+      <w:r>
+        <w:rPr>
+          <w:rFonts w:ascii="Roboto" w:hAnsi="Roboto" w:cs="Times New Roman"/>
+          <w:color w:val="2E74B5" w:themeColor="accent5" w:themeShade="BF"/>
+          <w:lang w:val="fr-FR"/>
+        </w:rPr>
+        <w:t xml:space="preserve"> pour les voiles</w:t>
+      </w:r>
+    </w:p>
+    <w:p>
+      <w:pPr>
+        <w:pStyle w:val="Paragraphedeliste"/>
+        <w:numPr>
+          <w:ilvl w:val="0"/>
+          <w:numId w:val="4"/>
+        </w:numPr>
+        <w:tabs>
+          <w:tab w:val="left" w:pos="851"/>
+        </w:tabs>
+        <w:rPr>
+          <w:rFonts w:ascii="Roboto" w:hAnsi="Roboto" w:cs="Times New Roman"/>
+          <w:color w:val="2E74B5" w:themeColor="accent5" w:themeShade="BF"/>
+          <w:lang w:val="fr-FR"/>
+        </w:rPr>
+      </w:pPr>
+      <w:r>
+        <w:rPr>
+          <w:rFonts w:ascii="Roboto" w:hAnsi="Roboto" w:cs="Times New Roman"/>
+          <w:color w:val="2E74B5" w:themeColor="accent5" w:themeShade="BF"/>
+          <w:lang w:val="fr-FR"/>
+        </w:rPr>
+        <w:t xml:space="preserve">GV </w:t>
+      </w:r>
+      <w:r>
+        <w:rPr>
+          <w:rFonts w:ascii="Roboto" w:hAnsi="Roboto" w:cs="Times New Roman"/>
+          <w:color w:val="2E74B5" w:themeColor="accent5" w:themeShade="BF"/>
+          <w:lang w:val="fr-FR"/>
+        </w:rPr>
+        <w:tab/>
+      </w:r>
+      <w:r>
+        <w:rPr>
+          <w:rFonts w:ascii="Roboto" w:hAnsi="Roboto" w:cs="Times New Roman"/>
+          <w:color w:val="2E74B5" w:themeColor="accent5" w:themeShade="BF"/>
+          <w:lang w:val="fr-FR"/>
+        </w:rPr>
+        <w:tab/>
+        <w:t>34</w:t>
+      </w:r>
+      <w:r>
+        <w:rPr>
+          <w:rFonts w:ascii="Roboto" w:hAnsi="Roboto" w:cs="Times New Roman"/>
+          <w:color w:val="2E74B5" w:themeColor="accent5" w:themeShade="BF"/>
+          <w:lang w:val="fr-FR"/>
+        </w:rPr>
+        <w:t xml:space="preserve"> </w:t>
+      </w:r>
+      <w:r>
+        <w:rPr>
+          <w:rFonts w:ascii="Roboto" w:hAnsi="Roboto" w:cs="Times New Roman"/>
+          <w:color w:val="2E74B5" w:themeColor="accent5" w:themeShade="BF"/>
+          <w:lang w:val="fr-FR"/>
+        </w:rPr>
+        <w:t>m</w:t>
+      </w:r>
+      <w:r>
+        <w:rPr>
+          <w:rFonts w:ascii="Roboto" w:hAnsi="Roboto" w:cs="Times New Roman"/>
+          <w:color w:val="2E74B5" w:themeColor="accent5" w:themeShade="BF"/>
+          <w:vertAlign w:val="superscript"/>
+          <w:lang w:val="fr-FR"/>
+        </w:rPr>
+        <w:t>2</w:t>
+      </w:r>
+    </w:p>
+    <w:p>
+      <w:pPr>
+        <w:pStyle w:val="Paragraphedeliste"/>
+        <w:numPr>
+          <w:ilvl w:val="0"/>
+          <w:numId w:val="4"/>
+        </w:numPr>
+        <w:tabs>
+          <w:tab w:val="left" w:pos="851"/>
+        </w:tabs>
+        <w:rPr>
+          <w:rFonts w:ascii="Roboto" w:hAnsi="Roboto" w:cs="Times New Roman"/>
+          <w:color w:val="2E74B5" w:themeColor="accent5" w:themeShade="BF"/>
+          <w:lang w:val="fr-FR"/>
+        </w:rPr>
+      </w:pPr>
+      <w:r>
+        <w:rPr>
+          <w:rFonts w:ascii="Roboto" w:hAnsi="Roboto" w:cs="Times New Roman"/>
+          <w:color w:val="2E74B5" w:themeColor="accent5" w:themeShade="BF"/>
+          <w:lang w:val="fr-FR"/>
+        </w:rPr>
+        <w:t xml:space="preserve">Spi </w:t>
+      </w:r>
+      <w:r>
+        <w:rPr>
+          <w:rFonts w:ascii="Roboto" w:hAnsi="Roboto" w:cs="Times New Roman"/>
+          <w:color w:val="2E74B5" w:themeColor="accent5" w:themeShade="BF"/>
+          <w:lang w:val="fr-FR"/>
+        </w:rPr>
+        <w:tab/>
+      </w:r>
+      <w:r>
+        <w:rPr>
+          <w:rFonts w:ascii="Roboto" w:hAnsi="Roboto" w:cs="Times New Roman"/>
+          <w:color w:val="2E74B5" w:themeColor="accent5" w:themeShade="BF"/>
+          <w:lang w:val="fr-FR"/>
+        </w:rPr>
+        <w:tab/>
+        <w:t xml:space="preserve">95 </w:t>
+      </w:r>
+      <w:r>
+        <w:rPr>
+          <w:rFonts w:ascii="Roboto" w:hAnsi="Roboto" w:cs="Times New Roman"/>
+          <w:color w:val="2E74B5" w:themeColor="accent5" w:themeShade="BF"/>
+          <w:lang w:val="fr-FR"/>
+        </w:rPr>
+        <w:t>m</w:t>
+      </w:r>
+      <w:r>
+        <w:rPr>
+          <w:rFonts w:ascii="Roboto" w:hAnsi="Roboto" w:cs="Times New Roman"/>
+          <w:color w:val="2E74B5" w:themeColor="accent5" w:themeShade="BF"/>
+          <w:vertAlign w:val="superscript"/>
+          <w:lang w:val="fr-FR"/>
+        </w:rPr>
+        <w:t>2</w:t>
+      </w:r>
+    </w:p>
+    <w:p>
+      <w:pPr>
+        <w:pStyle w:val="Paragraphedeliste"/>
+        <w:numPr>
+          <w:ilvl w:val="0"/>
+          <w:numId w:val="4"/>
+        </w:numPr>
+        <w:tabs>
+          <w:tab w:val="left" w:pos="851"/>
+        </w:tabs>
+        <w:rPr>
+          <w:rFonts w:ascii="Roboto" w:hAnsi="Roboto" w:cs="Times New Roman"/>
+          <w:color w:val="2E74B5" w:themeColor="accent5" w:themeShade="BF"/>
+          <w:lang w:val="fr-FR"/>
+        </w:rPr>
+      </w:pPr>
+      <w:r>
+        <w:rPr>
+          <w:rFonts w:ascii="Roboto" w:hAnsi="Roboto" w:cs="Times New Roman"/>
+          <w:color w:val="2E74B5" w:themeColor="accent5" w:themeShade="BF"/>
+          <w:lang w:val="fr-FR"/>
+        </w:rPr>
+        <w:t xml:space="preserve">Code 0 </w:t>
+      </w:r>
+      <w:r>
+        <w:rPr>
+          <w:rFonts w:ascii="Roboto" w:hAnsi="Roboto" w:cs="Times New Roman"/>
+          <w:color w:val="2E74B5" w:themeColor="accent5" w:themeShade="BF"/>
+          <w:lang w:val="fr-FR"/>
+        </w:rPr>
+        <w:tab/>
+      </w:r>
+      <w:r>
+        <w:rPr>
+          <w:rFonts w:ascii="Roboto" w:hAnsi="Roboto" w:cs="Times New Roman"/>
+          <w:color w:val="2E74B5" w:themeColor="accent5" w:themeShade="BF"/>
+          <w:lang w:val="fr-FR"/>
+        </w:rPr>
+        <w:t>m</w:t>
+      </w:r>
+      <w:r>
+        <w:rPr>
+          <w:rFonts w:ascii="Roboto" w:hAnsi="Roboto" w:cs="Times New Roman"/>
+          <w:color w:val="2E74B5" w:themeColor="accent5" w:themeShade="BF"/>
+          <w:vertAlign w:val="superscript"/>
+          <w:lang w:val="fr-FR"/>
+        </w:rPr>
+        <w:t>2</w:t>
+      </w:r>
+    </w:p>
+    <w:p>
+      <w:pPr>
+        <w:pStyle w:val="Paragraphedeliste"/>
+        <w:numPr>
+          <w:ilvl w:val="0"/>
+          <w:numId w:val="4"/>
+        </w:numPr>
+        <w:tabs>
+          <w:tab w:val="left" w:pos="851"/>
+        </w:tabs>
+        <w:rPr>
+          <w:rFonts w:ascii="Roboto" w:hAnsi="Roboto" w:cs="Times New Roman"/>
+          <w:color w:val="2E74B5" w:themeColor="accent5" w:themeShade="BF"/>
+          <w:lang w:val="fr-FR"/>
+        </w:rPr>
+      </w:pPr>
+      <w:r>
+        <w:rPr>
+          <w:rFonts w:ascii="Roboto" w:hAnsi="Roboto" w:cs="Times New Roman"/>
+          <w:color w:val="2E74B5" w:themeColor="accent5" w:themeShade="BF"/>
+          <w:lang w:val="fr-FR"/>
+        </w:rPr>
+        <w:t xml:space="preserve">Tourmentin </w:t>
+      </w:r>
+      <w:r>
+        <w:rPr>
+          <w:rFonts w:ascii="Roboto" w:hAnsi="Roboto" w:cs="Times New Roman"/>
+          <w:color w:val="2E74B5" w:themeColor="accent5" w:themeShade="BF"/>
+          <w:lang w:val="fr-FR"/>
+        </w:rPr>
+        <w:tab/>
+      </w:r>
+      <w:r>
+        <w:rPr>
+          <w:rFonts w:ascii="Roboto" w:hAnsi="Roboto" w:cs="Times New Roman"/>
+          <w:color w:val="2E74B5" w:themeColor="accent5" w:themeShade="BF"/>
+          <w:lang w:val="fr-FR"/>
+        </w:rPr>
+        <w:t>m</w:t>
+      </w:r>
+      <w:r>
+        <w:rPr>
+          <w:rFonts w:ascii="Roboto" w:hAnsi="Roboto" w:cs="Times New Roman"/>
+          <w:color w:val="2E74B5" w:themeColor="accent5" w:themeShade="BF"/>
+          <w:vertAlign w:val="superscript"/>
+          <w:lang w:val="fr-FR"/>
+        </w:rPr>
+        <w:t>2</w:t>
+      </w:r>
+    </w:p>
+    <w:p>
+      <w:pPr>
+        <w:pStyle w:val="Paragraphedeliste"/>
+        <w:tabs>
+          <w:tab w:val="left" w:pos="851"/>
+        </w:tabs>
+        <w:rPr>
+          <w:rFonts w:ascii="Roboto" w:hAnsi="Roboto" w:cs="Times New Roman"/>
+          <w:color w:val="2E74B5" w:themeColor="accent5" w:themeShade="BF"/>
+          <w:lang w:val="fr-FR"/>
+        </w:rPr>
+      </w:pPr>
+      <w:r>
+        <w:rPr>
+          <w:rFonts w:ascii="Roboto" w:hAnsi="Roboto" w:cs="Times New Roman"/>
+          <w:color w:val="2E74B5" w:themeColor="accent5" w:themeShade="BF"/>
+          <w:lang w:val="fr-FR"/>
+        </w:rPr>
+        <w:tab/>
+      </w:r>
+      <w:r>
+        <w:rPr>
+          <w:rFonts w:ascii="Roboto" w:hAnsi="Roboto" w:cs="Times New Roman"/>
+          <w:color w:val="2E74B5" w:themeColor="accent5" w:themeShade="BF"/>
+          <w:lang w:val="fr-FR"/>
+        </w:rPr>
+        <w:tab/>
+        <w:t>Taille</w:t>
+      </w:r>
+    </w:p>
+    <w:p>
+      <w:pPr>
+        <w:pStyle w:val="Paragraphedeliste"/>
+        <w:numPr>
+          <w:ilvl w:val="0"/>
+          <w:numId w:val="4"/>
+        </w:numPr>
+        <w:tabs>
+          <w:tab w:val="left" w:pos="851"/>
+        </w:tabs>
+        <w:rPr>
+          <w:rFonts w:ascii="Roboto" w:hAnsi="Roboto" w:cs="Times New Roman"/>
+          <w:color w:val="2E74B5" w:themeColor="accent5" w:themeShade="BF"/>
+          <w:lang w:val="fr-FR"/>
+        </w:rPr>
+      </w:pPr>
+      <w:r>
+        <w:rPr>
+          <w:rFonts w:ascii="Roboto" w:hAnsi="Roboto" w:cs="Times New Roman"/>
+          <w:color w:val="2E74B5" w:themeColor="accent5" w:themeShade="BF"/>
+          <w:lang w:val="fr-FR"/>
+        </w:rPr>
+        <w:t xml:space="preserve">Trinquette </w:t>
+      </w:r>
+      <w:r>
+        <w:rPr>
+          <w:rFonts w:ascii="Roboto" w:hAnsi="Roboto" w:cs="Times New Roman"/>
+          <w:color w:val="2E74B5" w:themeColor="accent5" w:themeShade="BF"/>
+          <w:lang w:val="fr-FR"/>
+        </w:rPr>
+        <w:tab/>
+        <w:t xml:space="preserve">16 </w:t>
+      </w:r>
+      <w:r>
+        <w:rPr>
+          <w:rFonts w:ascii="Roboto" w:hAnsi="Roboto" w:cs="Times New Roman"/>
+          <w:color w:val="2E74B5" w:themeColor="accent5" w:themeShade="BF"/>
+          <w:lang w:val="fr-FR"/>
+        </w:rPr>
+        <w:t>m</w:t>
+      </w:r>
+      <w:r>
+        <w:rPr>
+          <w:rFonts w:ascii="Roboto" w:hAnsi="Roboto" w:cs="Times New Roman"/>
+          <w:color w:val="2E74B5" w:themeColor="accent5" w:themeShade="BF"/>
+          <w:vertAlign w:val="superscript"/>
+          <w:lang w:val="fr-FR"/>
+        </w:rPr>
+        <w:t>2</w:t>
+      </w:r>
+    </w:p>
+    <w:p>
+      <w:pPr>
+        <w:pStyle w:val="Paragraphedeliste"/>
+        <w:numPr>
+          <w:ilvl w:val="0"/>
+          <w:numId w:val="4"/>
+        </w:numPr>
+        <w:tabs>
+          <w:tab w:val="left" w:pos="851"/>
+        </w:tabs>
+        <w:rPr>
+          <w:rFonts w:ascii="Roboto" w:hAnsi="Roboto" w:cs="Times New Roman"/>
+          <w:color w:val="2E74B5" w:themeColor="accent5" w:themeShade="BF"/>
+          <w:lang w:val="fr-FR"/>
+        </w:rPr>
+      </w:pPr>
+      <w:proofErr w:type="spellStart"/>
+      <w:r>
+        <w:rPr>
+          <w:rFonts w:ascii="Roboto" w:hAnsi="Roboto" w:cs="Times New Roman"/>
+          <w:color w:val="2E74B5" w:themeColor="accent5" w:themeShade="BF"/>
+          <w:lang w:val="fr-FR"/>
+        </w:rPr>
+        <w:t>Genois</w:t>
+      </w:r>
+      <w:proofErr w:type="spellEnd"/>
+      <w:r>
+        <w:rPr>
+          <w:rFonts w:ascii="Roboto" w:hAnsi="Roboto" w:cs="Times New Roman"/>
+          <w:color w:val="2E74B5" w:themeColor="accent5" w:themeShade="BF"/>
+          <w:lang w:val="fr-FR"/>
+        </w:rPr>
+        <w:t xml:space="preserve"> </w:t>
+      </w:r>
+      <w:r>
+        <w:rPr>
+          <w:rFonts w:ascii="Roboto" w:hAnsi="Roboto" w:cs="Times New Roman"/>
+          <w:color w:val="2E74B5" w:themeColor="accent5" w:themeShade="BF"/>
+          <w:lang w:val="fr-FR"/>
+        </w:rPr>
+        <w:tab/>
+        <w:t>38 m</w:t>
+      </w:r>
+      <w:r>
+        <w:rPr>
+          <w:rFonts w:ascii="Roboto" w:hAnsi="Roboto" w:cs="Times New Roman"/>
+          <w:color w:val="2E74B5" w:themeColor="accent5" w:themeShade="BF"/>
+          <w:vertAlign w:val="superscript"/>
+          <w:lang w:val="fr-FR"/>
+        </w:rPr>
+        <w:t>2</w:t>
+      </w:r>
+    </w:p>
+    <w:p>
+      <w:pPr>
+        <w:pStyle w:val="Paragraphedeliste"/>
+        <w:numPr>
+          <w:ilvl w:val="0"/>
+          <w:numId w:val="4"/>
+        </w:numPr>
+        <w:tabs>
+          <w:tab w:val="left" w:pos="851"/>
+        </w:tabs>
+        <w:rPr>
+          <w:rFonts w:ascii="Roboto" w:hAnsi="Roboto" w:cs="Times New Roman"/>
+          <w:color w:val="2E74B5" w:themeColor="accent5" w:themeShade="BF"/>
+          <w:lang w:val="fr-FR"/>
+        </w:rPr>
+      </w:pPr>
+      <w:proofErr w:type="spellStart"/>
+      <w:r>
+        <w:rPr>
+          <w:rFonts w:ascii="Roboto" w:hAnsi="Roboto" w:cs="Times New Roman"/>
+          <w:color w:val="2E74B5" w:themeColor="accent5" w:themeShade="BF"/>
+          <w:lang w:val="fr-FR"/>
+        </w:rPr>
+        <w:t>Suedoise</w:t>
+      </w:r>
+      <w:proofErr w:type="spellEnd"/>
+      <w:r>
+        <w:rPr>
+          <w:rFonts w:ascii="Roboto" w:hAnsi="Roboto" w:cs="Times New Roman"/>
+          <w:color w:val="2E74B5" w:themeColor="accent5" w:themeShade="BF"/>
+          <w:lang w:val="fr-FR"/>
+        </w:rPr>
+        <w:t xml:space="preserve"> </w:t>
+      </w:r>
+      <w:r>
+        <w:rPr>
+          <w:rFonts w:ascii="Roboto" w:hAnsi="Roboto" w:cs="Times New Roman"/>
+          <w:color w:val="2E74B5" w:themeColor="accent5" w:themeShade="BF"/>
+          <w:lang w:val="fr-FR"/>
+        </w:rPr>
+        <w:tab/>
+      </w:r>
+      <w:r>
+        <w:rPr>
+          <w:rFonts w:ascii="Roboto" w:hAnsi="Roboto" w:cs="Times New Roman"/>
+          <w:color w:val="2E74B5" w:themeColor="accent5" w:themeShade="BF"/>
+          <w:lang w:val="fr-FR"/>
+        </w:rPr>
+        <w:t>m</w:t>
+      </w:r>
+      <w:r>
+        <w:rPr>
+          <w:rFonts w:ascii="Roboto" w:hAnsi="Roboto" w:cs="Times New Roman"/>
+          <w:color w:val="2E74B5" w:themeColor="accent5" w:themeShade="BF"/>
+          <w:vertAlign w:val="superscript"/>
+          <w:lang w:val="fr-FR"/>
+        </w:rPr>
+        <w:t>2</w:t>
+      </w:r>
+    </w:p>
+    <w:p>
+      <w:pPr>
+        <w:pStyle w:val="Paragraphedeliste"/>
+        <w:numPr>
+          <w:ilvl w:val="1"/>
+          <w:numId w:val="4"/>
+        </w:numPr>
+        <w:tabs>
+          <w:tab w:val="left" w:pos="851"/>
+        </w:tabs>
+        <w:rPr>
+          <w:rFonts w:ascii="Roboto" w:hAnsi="Roboto" w:cs="Times New Roman"/>
+          <w:color w:val="2E74B5" w:themeColor="accent5" w:themeShade="BF"/>
+          <w:lang w:val="fr-FR"/>
+        </w:rPr>
+      </w:pPr>
+      <w:r>
+        <w:rPr>
+          <w:rFonts w:ascii="Roboto" w:hAnsi="Roboto" w:cs="Times New Roman"/>
+          <w:color w:val="2E74B5" w:themeColor="accent5" w:themeShade="BF"/>
+          <w:lang w:val="fr-FR"/>
+        </w:rPr>
+        <w:t>Taille</w:t>
+      </w:r>
+    </w:p>
+    <w:p>
+      <w:pPr>
+        <w:rPr>
+          <w:rFonts w:ascii="Roboto" w:hAnsi="Roboto" w:cs="Times New Roman"/>
+          <w:color w:val="2E74B5" w:themeColor="accent5" w:themeShade="BF"/>
+          <w:lang w:val="fr-FR"/>
+        </w:rPr>
+      </w:pPr>
+      <w:r>
+        <w:rPr>
+          <w:rFonts w:ascii="Roboto" w:hAnsi="Roboto" w:cs="Times New Roman"/>
+          <w:color w:val="2E74B5" w:themeColor="accent5" w:themeShade="BF"/>
+          <w:lang w:val="fr-FR"/>
+        </w:rPr>
+        <w:br w:type="page"/>
+      </w:r>
+    </w:p>
+    <w:p>
+      <w:pPr>
+        <w:rPr>
+          <w:rFonts w:ascii="Roboto" w:hAnsi="Roboto" w:cs="Times New Roman"/>
+          <w:color w:val="2E74B5" w:themeColor="accent5" w:themeShade="BF"/>
+          <w:lang w:val="fr-FR"/>
+        </w:rPr>
+      </w:pPr>
+      <w:r>
+        <w:rPr>
+          <w:rFonts w:ascii="Roboto" w:hAnsi="Roboto" w:cs="Times New Roman"/>
+          <w:noProof/>
+          <w:color w:val="2E74B5" w:themeColor="accent5" w:themeShade="BF"/>
+        </w:rPr>
+        <w:lastRenderedPageBreak/>
+        <w:drawing>
+          <wp:inline distT="0" distB="0" distL="0" distR="0" wp14:anchorId="190F3E18" wp14:editId="49E8861F">
+            <wp:extent cx="3582777" cy="5010912"/>
+            <wp:effectExtent l="0" t="0" r="0" b="0"/>
+            <wp:docPr id="29" name="Image 28">
+              <a:extLst xmlns:a="http://schemas.openxmlformats.org/drawingml/2006/main">
+                <a:ext uri="{FF2B5EF4-FFF2-40B4-BE49-F238E27FC236}">
+                  <a16:creationId xmlns:a16="http://schemas.microsoft.com/office/drawing/2014/main" id="{9985ED1A-B706-58FB-AD95-955CD0E6FC9E}"/>
+                </a:ext>
+              </a:extLst>
+            </wp:docPr>
+            <wp:cNvGraphicFramePr>
+              <a:graphicFrameLocks xmlns:a="http://schemas.openxmlformats.org/drawingml/2006/main" noChangeAspect="1"/>
+            </wp:cNvGraphicFramePr>
+            <a:graphic xmlns:a="http://schemas.openxmlformats.org/drawingml/2006/main">
+              <a:graphicData uri="http://schemas.openxmlformats.org/drawingml/2006/picture">
+                <pic:pic xmlns:pic="http://schemas.openxmlformats.org/drawingml/2006/picture">
+                  <pic:nvPicPr>
+                    <pic:cNvPr id="29" name="Image 28">
+                      <a:extLst>
+                        <a:ext uri="{FF2B5EF4-FFF2-40B4-BE49-F238E27FC236}">
+                          <a16:creationId xmlns:a16="http://schemas.microsoft.com/office/drawing/2014/main" id="{9985ED1A-B706-58FB-AD95-955CD0E6FC9E}"/>
+                        </a:ext>
+                      </a:extLst>
+                    </pic:cNvPr>
+                    <pic:cNvPicPr>
+                      <a:picLocks noChangeAspect="1"/>
+                    </pic:cNvPicPr>
+                  </pic:nvPicPr>
+                  <pic:blipFill>
+                    <a:blip r:embed="rId15">
+                      <a:extLst>
+                        <a:ext uri="{28A0092B-C50C-407E-A947-70E740481C1C}">
+                          <a14:useLocalDpi xmlns:a14="http://schemas.microsoft.com/office/drawing/2010/main" val="0"/>
+                        </a:ext>
+                      </a:extLst>
+                    </a:blip>
+                    <a:stretch>
+                      <a:fillRect/>
+                    </a:stretch>
+                  </pic:blipFill>
+                  <pic:spPr>
+                    <a:xfrm>
+                      <a:off x="0" y="0"/>
+                      <a:ext cx="3595688" cy="5028970"/>
+                    </a:xfrm>
+                    <a:prstGeom prst="rect">
+                      <a:avLst/>
+                    </a:prstGeom>
+                  </pic:spPr>
+                </pic:pic>
+              </a:graphicData>
+            </a:graphic>
+          </wp:inline>
+        </w:drawing>
+      </w:r>
+      <w:r>
+        <w:rPr>
+          <w:rFonts w:ascii="Roboto" w:hAnsi="Roboto" w:cs="Times New Roman"/>
+          <w:noProof/>
+          <w:color w:val="2E74B5" w:themeColor="accent5" w:themeShade="BF"/>
+        </w:rPr>
+        <w:drawing>
+          <wp:inline distT="0" distB="0" distL="0" distR="0" wp14:anchorId="1B83AAE5" wp14:editId="253FE52A">
+            <wp:extent cx="3610503" cy="4351338"/>
+            <wp:effectExtent l="0" t="0" r="9525" b="0"/>
+            <wp:docPr id="5" name="Espace réservé du contenu 4">
+              <a:extLst xmlns:a="http://schemas.openxmlformats.org/drawingml/2006/main">
+                <a:ext uri="{FF2B5EF4-FFF2-40B4-BE49-F238E27FC236}">
+                  <a16:creationId xmlns:a16="http://schemas.microsoft.com/office/drawing/2014/main" id="{DA7A405D-E357-21AB-C964-99C8CD857514}"/>
+                </a:ext>
+              </a:extLst>
+            </wp:docPr>
+            <wp:cNvGraphicFramePr>
+              <a:graphicFrameLocks xmlns:a="http://schemas.openxmlformats.org/drawingml/2006/main" noGrp="1" noChangeAspect="1"/>
+            </wp:cNvGraphicFramePr>
+            <a:graphic xmlns:a="http://schemas.openxmlformats.org/drawingml/2006/main">
+              <a:graphicData uri="http://schemas.openxmlformats.org/drawingml/2006/picture">
+                <pic:pic xmlns:pic="http://schemas.openxmlformats.org/drawingml/2006/picture">
+                  <pic:nvPicPr>
+                    <pic:cNvPr id="5" name="Espace réservé du contenu 4">
+                      <a:extLst>
+                        <a:ext uri="{FF2B5EF4-FFF2-40B4-BE49-F238E27FC236}">
+                          <a16:creationId xmlns:a16="http://schemas.microsoft.com/office/drawing/2014/main" id="{DA7A405D-E357-21AB-C964-99C8CD857514}"/>
+                        </a:ext>
+                      </a:extLst>
+                    </pic:cNvPr>
+                    <pic:cNvPicPr>
+                      <a:picLocks noGrp="1" noChangeAspect="1"/>
+                    </pic:cNvPicPr>
+                  </pic:nvPicPr>
+                  <pic:blipFill>
+                    <a:blip r:embed="rId16">
+                      <a:extLst>
+                        <a:ext uri="{28A0092B-C50C-407E-A947-70E740481C1C}">
+                          <a14:useLocalDpi xmlns:a14="http://schemas.microsoft.com/office/drawing/2010/main" val="0"/>
+                        </a:ext>
+                      </a:extLst>
+                    </a:blip>
+                    <a:stretch>
+                      <a:fillRect/>
+                    </a:stretch>
+                  </pic:blipFill>
+                  <pic:spPr>
+                    <a:xfrm>
+                      <a:off x="0" y="0"/>
+                      <a:ext cx="3610503" cy="4351338"/>
+                    </a:xfrm>
+                    <a:prstGeom prst="rect">
+                      <a:avLst/>
+                    </a:prstGeom>
+                  </pic:spPr>
+                </pic:pic>
+              </a:graphicData>
+            </a:graphic>
+          </wp:inline>
+        </w:drawing>
+      </w:r>
+    </w:p>
+    <w:p>
+      <w:pPr>
+        <w:rPr>
+          <w:rFonts w:ascii="Roboto" w:hAnsi="Roboto" w:cs="Times New Roman"/>
+          <w:color w:val="2E74B5" w:themeColor="accent5" w:themeShade="BF"/>
+          <w:lang w:val="fr-FR"/>
+        </w:rPr>
+      </w:pPr>
+      <w:r>
+        <w:rPr>
+          <w:rFonts w:ascii="Roboto" w:hAnsi="Roboto" w:cs="Times New Roman"/>
+          <w:noProof/>
+          <w:color w:val="2E74B5" w:themeColor="accent5" w:themeShade="BF"/>
+        </w:rPr>
+        <w:drawing>
+          <wp:inline distT="0" distB="0" distL="0" distR="0" wp14:anchorId="085663AD" wp14:editId="471BFC26">
+            <wp:extent cx="3330854" cy="4351020"/>
+            <wp:effectExtent l="0" t="0" r="3175" b="0"/>
+            <wp:docPr id="1792992690" name="Espace réservé du contenu 4">
+              <a:extLst xmlns:a="http://schemas.openxmlformats.org/drawingml/2006/main">
+                <a:ext uri="{FF2B5EF4-FFF2-40B4-BE49-F238E27FC236}">
+                  <a16:creationId xmlns:a16="http://schemas.microsoft.com/office/drawing/2014/main" id="{01AEB4E4-DF89-871A-A7BC-8987DB245134}"/>
+                </a:ext>
+              </a:extLst>
+            </wp:docPr>
+            <wp:cNvGraphicFramePr>
+              <a:graphicFrameLocks xmlns:a="http://schemas.openxmlformats.org/drawingml/2006/main" noGrp="1" noChangeAspect="1"/>
+            </wp:cNvGraphicFramePr>
+            <a:graphic xmlns:a="http://schemas.openxmlformats.org/drawingml/2006/main">
+              <a:graphicData uri="http://schemas.openxmlformats.org/drawingml/2006/picture">
+                <pic:pic xmlns:pic="http://schemas.openxmlformats.org/drawingml/2006/picture">
+                  <pic:nvPicPr>
+                    <pic:cNvPr id="5" name="Espace réservé du contenu 4">
+                      <a:extLst>
+                        <a:ext uri="{FF2B5EF4-FFF2-40B4-BE49-F238E27FC236}">
+                          <a16:creationId xmlns:a16="http://schemas.microsoft.com/office/drawing/2014/main" id="{01AEB4E4-DF89-871A-A7BC-8987DB245134}"/>
+                        </a:ext>
+                      </a:extLst>
+                    </pic:cNvPr>
+                    <pic:cNvPicPr>
+                      <a:picLocks noGrp="1" noChangeAspect="1"/>
+                    </pic:cNvPicPr>
+                  </pic:nvPicPr>
+                  <pic:blipFill rotWithShape="1">
+                    <a:blip r:embed="rId17">
+                      <a:extLst>
+                        <a:ext uri="{28A0092B-C50C-407E-A947-70E740481C1C}">
+                          <a14:useLocalDpi xmlns:a14="http://schemas.microsoft.com/office/drawing/2010/main" val="0"/>
+                        </a:ext>
+                      </a:extLst>
+                    </a:blip>
+                    <a:srcRect l="40193"/>
+                    <a:stretch>
+                      <a:fillRect/>
+                    </a:stretch>
+                  </pic:blipFill>
+                  <pic:spPr bwMode="auto">
+                    <a:xfrm>
+                      <a:off x="0" y="0"/>
+                      <a:ext cx="3331097" cy="4351338"/>
+                    </a:xfrm>
+                    <a:prstGeom prst="rect">
+                      <a:avLst/>
+                    </a:prstGeom>
+                    <a:ln>
+                      <a:noFill/>
+                    </a:ln>
+                    <a:extLst>
+                      <a:ext uri="{53640926-AAD7-44D8-BBD7-CCE9431645EC}">
+                        <a14:shadowObscured xmlns:a14="http://schemas.microsoft.com/office/drawing/2010/main"/>
+                      </a:ext>
+                    </a:extLst>
+                  </pic:spPr>
+                </pic:pic>
+              </a:graphicData>
+            </a:graphic>
+          </wp:inline>
+        </w:drawing>
+      </w:r>
+      <w:r>
+        <w:rPr>
+          <w:rFonts w:ascii="Roboto" w:hAnsi="Roboto" w:cs="Times New Roman"/>
+          <w:color w:val="2E74B5" w:themeColor="accent5" w:themeShade="BF"/>
+          <w:lang w:val="fr-FR"/>
+        </w:rPr>
+        <w:t xml:space="preserve">       </w:t>
+      </w:r>
+      <w:r>
+        <w:rPr>
+          <w:rFonts w:ascii="Roboto" w:hAnsi="Roboto" w:cs="Times New Roman"/>
+          <w:noProof/>
+          <w:color w:val="2E74B5" w:themeColor="accent5" w:themeShade="BF"/>
+          <w:lang w:val="fr-FR"/>
+        </w:rPr>
+        <w:drawing>
+          <wp:inline distT="0" distB="0" distL="0" distR="0" wp14:anchorId="42D14901" wp14:editId="7C21CFBF">
+            <wp:extent cx="3481527" cy="4096279"/>
+            <wp:effectExtent l="0" t="0" r="5080" b="0"/>
+            <wp:docPr id="396435471" name="Image 1"/>
+            <wp:cNvGraphicFramePr>
+              <a:graphicFrameLocks xmlns:a="http://schemas.openxmlformats.org/drawingml/2006/main" noChangeAspect="1"/>
+            </wp:cNvGraphicFramePr>
+            <a:graphic xmlns:a="http://schemas.openxmlformats.org/drawingml/2006/main">
+              <a:graphicData uri="http://schemas.openxmlformats.org/drawingml/2006/picture">
+                <pic:pic xmlns:pic="http://schemas.openxmlformats.org/drawingml/2006/picture">
+                  <pic:nvPicPr>
+                    <pic:cNvPr id="0" name="Picture 1"/>
+                    <pic:cNvPicPr>
+                      <a:picLocks noChangeAspect="1" noChangeArrowheads="1"/>
+                    </pic:cNvPicPr>
+                  </pic:nvPicPr>
+                  <pic:blipFill rotWithShape="1">
+                    <a:blip r:embed="rId18">
+                      <a:extLst>
+                        <a:ext uri="{28A0092B-C50C-407E-A947-70E740481C1C}">
+                          <a14:useLocalDpi xmlns:a14="http://schemas.microsoft.com/office/drawing/2010/main" val="0"/>
+                        </a:ext>
+                      </a:extLst>
+                    </a:blip>
+                    <a:srcRect l="33430" b="60141"/>
+                    <a:stretch>
+                      <a:fillRect/>
+                    </a:stretch>
+                  </pic:blipFill>
+                  <pic:spPr bwMode="auto">
+                    <a:xfrm>
+                      <a:off x="0" y="0"/>
+                      <a:ext cx="3481950" cy="4096776"/>
+                    </a:xfrm>
+                    <a:prstGeom prst="rect">
+                      <a:avLst/>
+                    </a:prstGeom>
+                    <a:noFill/>
+                    <a:ln>
+                      <a:noFill/>
+                    </a:ln>
+                    <a:extLst>
+                      <a:ext uri="{53640926-AAD7-44D8-BBD7-CCE9431645EC}">
+                        <a14:shadowObscured xmlns:a14="http://schemas.microsoft.com/office/drawing/2010/main"/>
+                      </a:ext>
+                    </a:extLst>
+                  </pic:spPr>
+                </pic:pic>
+              </a:graphicData>
+            </a:graphic>
+          </wp:inline>
+        </w:drawing>
+      </w:r>
+    </w:p>
+    <w:p>
+      <w:pPr>
+        <w:rPr>
+          <w:rFonts w:ascii="Roboto" w:hAnsi="Roboto" w:cs="Times New Roman"/>
+          <w:color w:val="2E74B5" w:themeColor="accent5" w:themeShade="BF"/>
+          <w:lang w:val="fr-FR"/>
+        </w:rPr>
+      </w:pPr>
+      <w:r>
+        <w:rPr>
+          <w:rFonts w:ascii="Roboto" w:hAnsi="Roboto" w:cs="Times New Roman"/>
+          <w:color w:val="2E74B5" w:themeColor="accent5" w:themeShade="BF"/>
+          <w:lang w:val="fr-FR"/>
+        </w:rPr>
+        <w:br w:type="page"/>
+      </w:r>
+    </w:p>
+    <w:p>
+      <w:pPr>
+        <w:rPr>
+          <w:rFonts w:ascii="Roboto" w:hAnsi="Roboto" w:cs="Times New Roman"/>
+          <w:color w:val="2E74B5" w:themeColor="accent5" w:themeShade="BF"/>
+          <w:lang w:val="fr-FR"/>
+        </w:rPr>
+      </w:pPr>
+      <w:r>
+        <w:rPr>
+          <w:rFonts w:ascii="Roboto" w:hAnsi="Roboto" w:cs="Times New Roman"/>
+          <w:color w:val="2E74B5" w:themeColor="accent5" w:themeShade="BF"/>
+          <w:lang w:val="fr-FR"/>
+        </w:rPr>
+        <w:object w:dxaOrig="12630" w:dyaOrig="8925" w14:anchorId="1A03006D">
+          <v:shapetype id="_x0000_t75" coordsize="21600,21600" o:spt="75" o:preferrelative="t" path="m@4@5l@4@11@9@11@9@5xe" filled="f" stroked="f">
+            <v:stroke joinstyle="miter"/>
+            <v:formulas>
+              <v:f eqn="if lineDrawn pixelLineWidth 0"/>
+              <v:f eqn="sum @0 1 0"/>
+              <v:f eqn="sum 0 0 @1"/>
+              <v:f eqn="prod @2 1 2"/>
+              <v:f eqn="prod @3 21600 pixelWidth"/>
+              <v:f eqn="prod @3 21600 pixelHeight"/>
+              <v:f eqn="sum @0 0 1"/>
+              <v:f eqn="prod @6 1 2"/>
+              <v:f eqn="prod @7 21600 pixelWidth"/>
+              <v:f eqn="sum @8 21600 0"/>
+              <v:f eqn="prod @7 21600 pixelHeight"/>
+              <v:f eqn="sum @10 21600 0"/>
+            </v:formulas>
+            <v:path o:extrusionok="f" gradientshapeok="t" o:connecttype="rect"/>
+            <o:lock v:ext="edit" aspectratio="t"/>
+          </v:shapetype>
+          <v:shape id="_x0000_i1025" type="#_x0000_t75" style="width:631.3pt;height:446.4pt" o:ole="">
+            <v:imagedata r:id="rId19" o:title=""/>
+          </v:shape>
+          <o:OLEObject Type="Embed" ProgID="Acrobat.Document.DC" ShapeID="_x0000_i1025" DrawAspect="Content" ObjectID="_1812138897" r:id="rId20"/>
+        </w:object>
+      </w:r>
+      <w:r>
+        <w:rPr>
+          <w:rFonts w:ascii="Roboto" w:hAnsi="Roboto" w:cs="Times New Roman"/>
+          <w:color w:val="2E74B5" w:themeColor="accent5" w:themeShade="BF"/>
+          <w:lang w:val="fr-FR"/>
+        </w:rPr>
+        <w:br w:type="page"/>
+      </w:r>
+    </w:p>
+    <w:p>
+      <w:pPr>
+        <w:rPr>
+          <w:rFonts w:ascii="Roboto" w:hAnsi="Roboto" w:cs="Times New Roman"/>
+          <w:color w:val="2E74B5" w:themeColor="accent5" w:themeShade="BF"/>
+          <w:lang w:val="fr-FR"/>
+        </w:rPr>
+      </w:pPr>
+    </w:p>
+    <w:p>
+      <w:pPr>
         <w:jc w:val="center"/>
         <w:rPr>
-          <w:lang w:val="fr-FR"/>
-        </w:rPr>
-      </w:pPr>
-      <w:r>
-        <w:rPr>
+          <w:rFonts w:ascii="Roboto" w:hAnsi="Roboto" w:cs="Times New Roman"/>
+          <w:color w:val="2E74B5" w:themeColor="accent5" w:themeShade="BF"/>
+          <w:lang w:val="fr-FR"/>
+        </w:rPr>
+      </w:pPr>
+    </w:p>
+    <w:p>
+      <w:pPr>
+        <w:jc w:val="center"/>
+        <w:rPr>
+          <w:rFonts w:ascii="Roboto" w:hAnsi="Roboto" w:cs="Times New Roman"/>
+          <w:color w:val="2E74B5" w:themeColor="accent5" w:themeShade="BF"/>
+          <w:lang w:val="fr-FR"/>
+        </w:rPr>
+      </w:pPr>
+    </w:p>
+    <w:p>
+      <w:pPr>
+        <w:jc w:val="center"/>
+        <w:rPr>
+          <w:rFonts w:ascii="Roboto" w:hAnsi="Roboto" w:cs="Times New Roman"/>
+          <w:color w:val="2E74B5" w:themeColor="accent5" w:themeShade="BF"/>
+          <w:lang w:val="fr-FR"/>
+        </w:rPr>
+      </w:pPr>
+    </w:p>
+    <w:p>
+      <w:pPr>
+        <w:jc w:val="center"/>
+        <w:rPr>
+          <w:rFonts w:ascii="Roboto" w:hAnsi="Roboto"/>
+          <w:lang w:val="fr-FR"/>
+        </w:rPr>
+      </w:pPr>
+      <w:r>
+        <w:rPr>
+          <w:rFonts w:ascii="Roboto" w:hAnsi="Roboto"/>
           <w:noProof/>
           <w:lang w:val="fr-FR"/>
         </w:rPr>
@@ -1782,13 +3740,14 @@
       <w:pPr>
         <w:jc w:val="center"/>
         <w:rPr>
+          <w:rFonts w:ascii="Roboto" w:hAnsi="Roboto"/>
           <w:lang w:val="fr-FR"/>
         </w:rPr>
       </w:pPr>
     </w:p>
     <w:tbl>
       <w:tblPr>
-        <w:tblStyle w:val="TableGrid"/>
+        <w:tblStyle w:val="Grilledutableau"/>
         <w:tblW w:w="11074" w:type="dxa"/>
         <w:tblLook w:val="04A0" w:firstRow="1" w:lastRow="0" w:firstColumn="1" w:lastColumn="0" w:noHBand="0" w:noVBand="1"/>
       </w:tblPr>
@@ -1810,6 +3769,7 @@
             <w:pPr>
               <w:jc w:val="center"/>
               <w:rPr>
+                <w:rFonts w:ascii="Roboto" w:hAnsi="Roboto"/>
                 <w:b/>
                 <w:bCs/>
                 <w:color w:val="2E74B5" w:themeColor="accent5" w:themeShade="BF"/>
@@ -1820,6 +3780,7 @@
             </w:pPr>
             <w:r>
               <w:rPr>
+                <w:rFonts w:ascii="Roboto" w:hAnsi="Roboto"/>
                 <w:b/>
                 <w:bCs/>
                 <w:color w:val="2E74B5" w:themeColor="accent5" w:themeShade="BF"/>
@@ -1834,6 +3795,7 @@
             <w:pPr>
               <w:jc w:val="center"/>
               <w:rPr>
+                <w:rFonts w:ascii="Roboto" w:hAnsi="Roboto"/>
                 <w:b/>
                 <w:bCs/>
                 <w:color w:val="2E74B5" w:themeColor="accent5" w:themeShade="BF"/>
@@ -1847,6 +3809,7 @@
             <w:pPr>
               <w:jc w:val="center"/>
               <w:rPr>
+                <w:rFonts w:ascii="Roboto" w:hAnsi="Roboto"/>
                 <w:b/>
                 <w:bCs/>
                 <w:color w:val="2E74B5" w:themeColor="accent5" w:themeShade="BF"/>
@@ -1860,6 +3823,7 @@
             <w:pPr>
               <w:jc w:val="center"/>
               <w:rPr>
+                <w:rFonts w:ascii="Roboto" w:hAnsi="Roboto"/>
                 <w:b/>
                 <w:bCs/>
                 <w:color w:val="2E74B5" w:themeColor="accent5" w:themeShade="BF"/>
@@ -1873,6 +3837,7 @@
             <w:pPr>
               <w:jc w:val="center"/>
               <w:rPr>
+                <w:rFonts w:ascii="Roboto" w:hAnsi="Roboto"/>
                 <w:b/>
                 <w:bCs/>
                 <w:color w:val="2E74B5" w:themeColor="accent5" w:themeShade="BF"/>
@@ -1883,6 +3848,7 @@
             </w:pPr>
             <w:r>
               <w:rPr>
+                <w:rFonts w:ascii="Roboto" w:hAnsi="Roboto"/>
                 <w:b/>
                 <w:bCs/>
                 <w:color w:val="2E74B5" w:themeColor="accent5" w:themeShade="BF"/>
@@ -1896,6 +3862,7 @@
           <w:p>
             <w:pPr>
               <w:rPr>
+                <w:rFonts w:ascii="Roboto" w:hAnsi="Roboto"/>
                 <w:b/>
                 <w:bCs/>
                 <w:lang w:val="fr-FR"/>
@@ -1908,7 +3875,7 @@
     <w:p>
       <w:pPr>
         <w:rPr>
-          <w:rFonts w:ascii="Times New Roman" w:hAnsi="Times New Roman" w:cs="Times New Roman"/>
+          <w:rFonts w:ascii="Roboto" w:hAnsi="Roboto" w:cs="Times New Roman"/>
           <w:color w:val="2E74B5" w:themeColor="accent5" w:themeShade="BF"/>
           <w:lang w:val="fr-FR"/>
         </w:rPr>
@@ -1925,8 +3892,121 @@
 </file>
 
 <file path=word/numbering.xml><?xml version="1.0" encoding="utf-8"?>
-<w:numbering xmlns:wpc="http://schemas.microsoft.com/office/word/2010/wordprocessingCanvas" xmlns:cx="http://schemas.microsoft.com/office/drawing/2014/chartex" xmlns:cx1="http://schemas.microsoft.com/office/drawing/2015/9/8/chartex" xmlns:cx2="http://schemas.microsoft.com/office/drawing/2015/10/21/chartex" xmlns:cx3="http://schemas.microsoft.com/office/drawing/2016/5/9/chartex" xmlns:cx4="http://schemas.microsoft.com/office/drawing/2016/5/10/chartex" xmlns:cx5="http://schemas.microsoft.com/office/drawing/2016/5/11/chartex" xmlns:cx6="http://schemas.microsoft.com/office/drawing/2016/5/12/chartex" xmlns:cx7="http://schemas.microsoft.com/office/drawing/2016/5/13/chartex" xmlns:cx8="http://schemas.microsoft.com/office/drawing/2016/5/14/chartex" xmlns:mc="http://schemas.openxmlformats.org/markup-compatibility/2006" xmlns:aink="http://schemas.microsoft.com/office/drawing/2016/ink" xmlns:am3d="http://schemas.microsoft.com/office/drawing/2017/model3d" xmlns:o="urn:schemas-microsoft-com:office:office" xmlns:r="http://schemas.openxmlformats.org/officeDocument/2006/relationships" xmlns:m="http://schemas.openxmlformats.org/officeDocument/2006/math" xmlns:v="urn:schemas-microsoft-com:vml" xmlns:wp14="http://schemas.microsoft.com/office/word/2010/wordprocessingDrawing" xmlns:wp="http://schemas.openxmlformats.org/drawingml/2006/wordprocessingDrawing" xmlns:w10="urn:schemas-microsoft-com:office:word" xmlns:w="http://schemas.openxmlformats.org/wordprocessingml/2006/main" xmlns:w14="http://schemas.microsoft.com/office/word/2010/wordml" xmlns:w15="http://schemas.microsoft.com/office/word/2012/wordml" xmlns:w16cex="http://schemas.microsoft.com/office/word/2018/wordml/cex" xmlns:w16cid="http://schemas.microsoft.com/office/word/2016/wordml/cid" xmlns:w16="http://schemas.microsoft.com/office/word/2018/wordml" xmlns:w16sdtdh="http://schemas.microsoft.com/office/word/2020/wordml/sdtdatahash" xmlns:w16se="http://schemas.microsoft.com/office/word/2015/wordml/symex" xmlns:wpg="http://schemas.microsoft.com/office/word/2010/wordprocessingGroup" xmlns:wpi="http://schemas.microsoft.com/office/word/2010/wordprocessingInk" xmlns:wne="http://schemas.microsoft.com/office/word/2006/wordml" xmlns:wps="http://schemas.microsoft.com/office/word/2010/wordprocessingShape" mc:Ignorable="w14 w15 w16se w16cid w16 w16cex w16sdtdh wp14">
+<w:numbering xmlns:wpc="http://schemas.microsoft.com/office/word/2010/wordprocessingCanvas" xmlns:cx="http://schemas.microsoft.com/office/drawing/2014/chartex" xmlns:cx1="http://schemas.microsoft.com/office/drawing/2015/9/8/chartex" xmlns:cx2="http://schemas.microsoft.com/office/drawing/2015/10/21/chartex" xmlns:cx3="http://schemas.microsoft.com/office/drawing/2016/5/9/chartex" xmlns:cx4="http://schemas.microsoft.com/office/drawing/2016/5/10/chartex" xmlns:cx5="http://schemas.microsoft.com/office/drawing/2016/5/11/chartex" xmlns:cx6="http://schemas.microsoft.com/office/drawing/2016/5/12/chartex" xmlns:cx7="http://schemas.microsoft.com/office/drawing/2016/5/13/chartex" xmlns:cx8="http://schemas.microsoft.com/office/drawing/2016/5/14/chartex" xmlns:mc="http://schemas.openxmlformats.org/markup-compatibility/2006" xmlns:aink="http://schemas.microsoft.com/office/drawing/2016/ink" xmlns:am3d="http://schemas.microsoft.com/office/drawing/2017/model3d" xmlns:o="urn:schemas-microsoft-com:office:office" xmlns:oel="http://schemas.microsoft.com/office/2019/extlst" xmlns:r="http://schemas.openxmlformats.org/officeDocument/2006/relationships" xmlns:m="http://schemas.openxmlformats.org/officeDocument/2006/math" xmlns:v="urn:schemas-microsoft-com:vml" xmlns:wp14="http://schemas.microsoft.com/office/word/2010/wordprocessingDrawing" xmlns:wp="http://schemas.openxmlformats.org/drawingml/2006/wordprocessingDrawing" xmlns:w10="urn:schemas-microsoft-com:office:word" xmlns:w="http://schemas.openxmlformats.org/wordprocessingml/2006/main" xmlns:w14="http://schemas.microsoft.com/office/word/2010/wordml" xmlns:w15="http://schemas.microsoft.com/office/word/2012/wordml" xmlns:w16cex="http://schemas.microsoft.com/office/word/2018/wordml/cex" xmlns:w16cid="http://schemas.microsoft.com/office/word/2016/wordml/cid" xmlns:w16="http://schemas.microsoft.com/office/word/2018/wordml" xmlns:w16du="http://schemas.microsoft.com/office/word/2023/wordml/word16du" xmlns:w16sdtdh="http://schemas.microsoft.com/office/word/2020/wordml/sdtdatahash" xmlns:w16sdtfl="http://schemas.microsoft.com/office/word/2024/wordml/sdtformatlock" xmlns:w16se="http://schemas.microsoft.com/office/word/2015/wordml/symex" xmlns:wpg="http://schemas.microsoft.com/office/word/2010/wordprocessingGroup" xmlns:wpi="http://schemas.microsoft.com/office/word/2010/wordprocessingInk" xmlns:wne="http://schemas.microsoft.com/office/word/2006/wordml" xmlns:wps="http://schemas.microsoft.com/office/word/2010/wordprocessingShape" mc:Ignorable="w14 w15 w16se w16cid w16 w16cex w16sdtdh w16sdtfl w16du wp14">
   <w:abstractNum w:abstractNumId="0" w15:restartNumberingAfterBreak="0">
+    <w:nsid w:val="158831BF"/>
+    <w:multiLevelType w:val="hybridMultilevel"/>
+    <w:tmpl w:val="3B5811E4"/>
+    <w:lvl w:ilvl="0" w:tplc="040C0001">
+      <w:start w:val="1"/>
+      <w:numFmt w:val="bullet"/>
+      <w:lvlText w:val=""/>
+      <w:lvlJc w:val="left"/>
+      <w:pPr>
+        <w:ind w:left="720" w:hanging="360"/>
+      </w:pPr>
+      <w:rPr>
+        <w:rFonts w:ascii="Symbol" w:hAnsi="Symbol" w:hint="default"/>
+      </w:rPr>
+    </w:lvl>
+    <w:lvl w:ilvl="1" w:tplc="040C0003" w:tentative="1">
+      <w:start w:val="1"/>
+      <w:numFmt w:val="bullet"/>
+      <w:lvlText w:val="o"/>
+      <w:lvlJc w:val="left"/>
+      <w:pPr>
+        <w:ind w:left="1440" w:hanging="360"/>
+      </w:pPr>
+      <w:rPr>
+        <w:rFonts w:ascii="Courier New" w:hAnsi="Courier New" w:cs="Courier New" w:hint="default"/>
+      </w:rPr>
+    </w:lvl>
+    <w:lvl w:ilvl="2" w:tplc="040C0005" w:tentative="1">
+      <w:start w:val="1"/>
+      <w:numFmt w:val="bullet"/>
+      <w:lvlText w:val=""/>
+      <w:lvlJc w:val="left"/>
+      <w:pPr>
+        <w:ind w:left="2160" w:hanging="360"/>
+      </w:pPr>
+      <w:rPr>
+        <w:rFonts w:ascii="Wingdings" w:hAnsi="Wingdings" w:hint="default"/>
+      </w:rPr>
+    </w:lvl>
+    <w:lvl w:ilvl="3" w:tplc="040C0001" w:tentative="1">
+      <w:start w:val="1"/>
+      <w:numFmt w:val="bullet"/>
+      <w:lvlText w:val=""/>
+      <w:lvlJc w:val="left"/>
+      <w:pPr>
+        <w:ind w:left="2880" w:hanging="360"/>
+      </w:pPr>
+      <w:rPr>
+        <w:rFonts w:ascii="Symbol" w:hAnsi="Symbol" w:hint="default"/>
+      </w:rPr>
+    </w:lvl>
+    <w:lvl w:ilvl="4" w:tplc="040C0003" w:tentative="1">
+      <w:start w:val="1"/>
+      <w:numFmt w:val="bullet"/>
+      <w:lvlText w:val="o"/>
+      <w:lvlJc w:val="left"/>
+      <w:pPr>
+        <w:ind w:left="3600" w:hanging="360"/>
+      </w:pPr>
+      <w:rPr>
+        <w:rFonts w:ascii="Courier New" w:hAnsi="Courier New" w:cs="Courier New" w:hint="default"/>
+      </w:rPr>
+    </w:lvl>
+    <w:lvl w:ilvl="5" w:tplc="040C0005" w:tentative="1">
+      <w:start w:val="1"/>
+      <w:numFmt w:val="bullet"/>
+      <w:lvlText w:val=""/>
+      <w:lvlJc w:val="left"/>
+      <w:pPr>
+        <w:ind w:left="4320" w:hanging="360"/>
+      </w:pPr>
+      <w:rPr>
+        <w:rFonts w:ascii="Wingdings" w:hAnsi="Wingdings" w:hint="default"/>
+      </w:rPr>
+    </w:lvl>
+    <w:lvl w:ilvl="6" w:tplc="040C0001" w:tentative="1">
+      <w:start w:val="1"/>
+      <w:numFmt w:val="bullet"/>
+      <w:lvlText w:val=""/>
+      <w:lvlJc w:val="left"/>
+      <w:pPr>
+        <w:ind w:left="5040" w:hanging="360"/>
+      </w:pPr>
+      <w:rPr>
+        <w:rFonts w:ascii="Symbol" w:hAnsi="Symbol" w:hint="default"/>
+      </w:rPr>
+    </w:lvl>
+    <w:lvl w:ilvl="7" w:tplc="040C0003" w:tentative="1">
+      <w:start w:val="1"/>
+      <w:numFmt w:val="bullet"/>
+      <w:lvlText w:val="o"/>
+      <w:lvlJc w:val="left"/>
+      <w:pPr>
+        <w:ind w:left="5760" w:hanging="360"/>
+      </w:pPr>
+      <w:rPr>
+        <w:rFonts w:ascii="Courier New" w:hAnsi="Courier New" w:cs="Courier New" w:hint="default"/>
+      </w:rPr>
+    </w:lvl>
+    <w:lvl w:ilvl="8" w:tplc="040C0005" w:tentative="1">
+      <w:start w:val="1"/>
+      <w:numFmt w:val="bullet"/>
+      <w:lvlText w:val=""/>
+      <w:lvlJc w:val="left"/>
+      <w:pPr>
+        <w:ind w:left="6480" w:hanging="360"/>
+      </w:pPr>
+      <w:rPr>
+        <w:rFonts w:ascii="Wingdings" w:hAnsi="Wingdings" w:hint="default"/>
+      </w:rPr>
+    </w:lvl>
+  </w:abstractNum>
+  <w:abstractNum w:abstractNumId="1" w15:restartNumberingAfterBreak="0">
     <w:nsid w:val="4FDD2421"/>
     <w:multiLevelType w:val="hybridMultilevel"/>
     <w:tmpl w:val="B930E406"/>
@@ -2038,14 +4118,249 @@
       </w:rPr>
     </w:lvl>
   </w:abstractNum>
-  <w:num w:numId="1">
+  <w:abstractNum w:abstractNumId="2" w15:restartNumberingAfterBreak="0">
+    <w:nsid w:val="737A4ED3"/>
+    <w:multiLevelType w:val="hybridMultilevel"/>
+    <w:tmpl w:val="6738660E"/>
+    <w:lvl w:ilvl="0" w:tplc="040C0001">
+      <w:start w:val="1"/>
+      <w:numFmt w:val="bullet"/>
+      <w:lvlText w:val=""/>
+      <w:lvlJc w:val="left"/>
+      <w:pPr>
+        <w:ind w:left="3600" w:hanging="360"/>
+      </w:pPr>
+      <w:rPr>
+        <w:rFonts w:ascii="Symbol" w:hAnsi="Symbol" w:hint="default"/>
+      </w:rPr>
+    </w:lvl>
+    <w:lvl w:ilvl="1" w:tplc="040C0003" w:tentative="1">
+      <w:start w:val="1"/>
+      <w:numFmt w:val="bullet"/>
+      <w:lvlText w:val="o"/>
+      <w:lvlJc w:val="left"/>
+      <w:pPr>
+        <w:ind w:left="4320" w:hanging="360"/>
+      </w:pPr>
+      <w:rPr>
+        <w:rFonts w:ascii="Courier New" w:hAnsi="Courier New" w:cs="Courier New" w:hint="default"/>
+      </w:rPr>
+    </w:lvl>
+    <w:lvl w:ilvl="2" w:tplc="040C0005" w:tentative="1">
+      <w:start w:val="1"/>
+      <w:numFmt w:val="bullet"/>
+      <w:lvlText w:val=""/>
+      <w:lvlJc w:val="left"/>
+      <w:pPr>
+        <w:ind w:left="5040" w:hanging="360"/>
+      </w:pPr>
+      <w:rPr>
+        <w:rFonts w:ascii="Wingdings" w:hAnsi="Wingdings" w:hint="default"/>
+      </w:rPr>
+    </w:lvl>
+    <w:lvl w:ilvl="3" w:tplc="040C0001" w:tentative="1">
+      <w:start w:val="1"/>
+      <w:numFmt w:val="bullet"/>
+      <w:lvlText w:val=""/>
+      <w:lvlJc w:val="left"/>
+      <w:pPr>
+        <w:ind w:left="5760" w:hanging="360"/>
+      </w:pPr>
+      <w:rPr>
+        <w:rFonts w:ascii="Symbol" w:hAnsi="Symbol" w:hint="default"/>
+      </w:rPr>
+    </w:lvl>
+    <w:lvl w:ilvl="4" w:tplc="040C0003" w:tentative="1">
+      <w:start w:val="1"/>
+      <w:numFmt w:val="bullet"/>
+      <w:lvlText w:val="o"/>
+      <w:lvlJc w:val="left"/>
+      <w:pPr>
+        <w:ind w:left="6480" w:hanging="360"/>
+      </w:pPr>
+      <w:rPr>
+        <w:rFonts w:ascii="Courier New" w:hAnsi="Courier New" w:cs="Courier New" w:hint="default"/>
+      </w:rPr>
+    </w:lvl>
+    <w:lvl w:ilvl="5" w:tplc="040C0005" w:tentative="1">
+      <w:start w:val="1"/>
+      <w:numFmt w:val="bullet"/>
+      <w:lvlText w:val=""/>
+      <w:lvlJc w:val="left"/>
+      <w:pPr>
+        <w:ind w:left="7200" w:hanging="360"/>
+      </w:pPr>
+      <w:rPr>
+        <w:rFonts w:ascii="Wingdings" w:hAnsi="Wingdings" w:hint="default"/>
+      </w:rPr>
+    </w:lvl>
+    <w:lvl w:ilvl="6" w:tplc="040C0001" w:tentative="1">
+      <w:start w:val="1"/>
+      <w:numFmt w:val="bullet"/>
+      <w:lvlText w:val=""/>
+      <w:lvlJc w:val="left"/>
+      <w:pPr>
+        <w:ind w:left="7920" w:hanging="360"/>
+      </w:pPr>
+      <w:rPr>
+        <w:rFonts w:ascii="Symbol" w:hAnsi="Symbol" w:hint="default"/>
+      </w:rPr>
+    </w:lvl>
+    <w:lvl w:ilvl="7" w:tplc="040C0003" w:tentative="1">
+      <w:start w:val="1"/>
+      <w:numFmt w:val="bullet"/>
+      <w:lvlText w:val="o"/>
+      <w:lvlJc w:val="left"/>
+      <w:pPr>
+        <w:ind w:left="8640" w:hanging="360"/>
+      </w:pPr>
+      <w:rPr>
+        <w:rFonts w:ascii="Courier New" w:hAnsi="Courier New" w:cs="Courier New" w:hint="default"/>
+      </w:rPr>
+    </w:lvl>
+    <w:lvl w:ilvl="8" w:tplc="040C0005" w:tentative="1">
+      <w:start w:val="1"/>
+      <w:numFmt w:val="bullet"/>
+      <w:lvlText w:val=""/>
+      <w:lvlJc w:val="left"/>
+      <w:pPr>
+        <w:ind w:left="9360" w:hanging="360"/>
+      </w:pPr>
+      <w:rPr>
+        <w:rFonts w:ascii="Wingdings" w:hAnsi="Wingdings" w:hint="default"/>
+      </w:rPr>
+    </w:lvl>
+  </w:abstractNum>
+  <w:abstractNum w:abstractNumId="3" w15:restartNumberingAfterBreak="0">
+    <w:nsid w:val="7F9A16D7"/>
+    <w:multiLevelType w:val="hybridMultilevel"/>
+    <w:tmpl w:val="BD529744"/>
+    <w:lvl w:ilvl="0" w:tplc="040C0001">
+      <w:start w:val="1"/>
+      <w:numFmt w:val="bullet"/>
+      <w:lvlText w:val=""/>
+      <w:lvlJc w:val="left"/>
+      <w:pPr>
+        <w:ind w:left="720" w:hanging="360"/>
+      </w:pPr>
+      <w:rPr>
+        <w:rFonts w:ascii="Symbol" w:hAnsi="Symbol" w:hint="default"/>
+      </w:rPr>
+    </w:lvl>
+    <w:lvl w:ilvl="1" w:tplc="040C0003">
+      <w:start w:val="1"/>
+      <w:numFmt w:val="bullet"/>
+      <w:lvlText w:val="o"/>
+      <w:lvlJc w:val="left"/>
+      <w:pPr>
+        <w:ind w:left="1440" w:hanging="360"/>
+      </w:pPr>
+      <w:rPr>
+        <w:rFonts w:ascii="Courier New" w:hAnsi="Courier New" w:cs="Courier New" w:hint="default"/>
+      </w:rPr>
+    </w:lvl>
+    <w:lvl w:ilvl="2" w:tplc="040C0005" w:tentative="1">
+      <w:start w:val="1"/>
+      <w:numFmt w:val="bullet"/>
+      <w:lvlText w:val=""/>
+      <w:lvlJc w:val="left"/>
+      <w:pPr>
+        <w:ind w:left="2160" w:hanging="360"/>
+      </w:pPr>
+      <w:rPr>
+        <w:rFonts w:ascii="Wingdings" w:hAnsi="Wingdings" w:hint="default"/>
+      </w:rPr>
+    </w:lvl>
+    <w:lvl w:ilvl="3" w:tplc="040C0001" w:tentative="1">
+      <w:start w:val="1"/>
+      <w:numFmt w:val="bullet"/>
+      <w:lvlText w:val=""/>
+      <w:lvlJc w:val="left"/>
+      <w:pPr>
+        <w:ind w:left="2880" w:hanging="360"/>
+      </w:pPr>
+      <w:rPr>
+        <w:rFonts w:ascii="Symbol" w:hAnsi="Symbol" w:hint="default"/>
+      </w:rPr>
+    </w:lvl>
+    <w:lvl w:ilvl="4" w:tplc="040C0003" w:tentative="1">
+      <w:start w:val="1"/>
+      <w:numFmt w:val="bullet"/>
+      <w:lvlText w:val="o"/>
+      <w:lvlJc w:val="left"/>
+      <w:pPr>
+        <w:ind w:left="3600" w:hanging="360"/>
+      </w:pPr>
+      <w:rPr>
+        <w:rFonts w:ascii="Courier New" w:hAnsi="Courier New" w:cs="Courier New" w:hint="default"/>
+      </w:rPr>
+    </w:lvl>
+    <w:lvl w:ilvl="5" w:tplc="040C0005" w:tentative="1">
+      <w:start w:val="1"/>
+      <w:numFmt w:val="bullet"/>
+      <w:lvlText w:val=""/>
+      <w:lvlJc w:val="left"/>
+      <w:pPr>
+        <w:ind w:left="4320" w:hanging="360"/>
+      </w:pPr>
+      <w:rPr>
+        <w:rFonts w:ascii="Wingdings" w:hAnsi="Wingdings" w:hint="default"/>
+      </w:rPr>
+    </w:lvl>
+    <w:lvl w:ilvl="6" w:tplc="040C0001" w:tentative="1">
+      <w:start w:val="1"/>
+      <w:numFmt w:val="bullet"/>
+      <w:lvlText w:val=""/>
+      <w:lvlJc w:val="left"/>
+      <w:pPr>
+        <w:ind w:left="5040" w:hanging="360"/>
+      </w:pPr>
+      <w:rPr>
+        <w:rFonts w:ascii="Symbol" w:hAnsi="Symbol" w:hint="default"/>
+      </w:rPr>
+    </w:lvl>
+    <w:lvl w:ilvl="7" w:tplc="040C0003" w:tentative="1">
+      <w:start w:val="1"/>
+      <w:numFmt w:val="bullet"/>
+      <w:lvlText w:val="o"/>
+      <w:lvlJc w:val="left"/>
+      <w:pPr>
+        <w:ind w:left="5760" w:hanging="360"/>
+      </w:pPr>
+      <w:rPr>
+        <w:rFonts w:ascii="Courier New" w:hAnsi="Courier New" w:cs="Courier New" w:hint="default"/>
+      </w:rPr>
+    </w:lvl>
+    <w:lvl w:ilvl="8" w:tplc="040C0005" w:tentative="1">
+      <w:start w:val="1"/>
+      <w:numFmt w:val="bullet"/>
+      <w:lvlText w:val=""/>
+      <w:lvlJc w:val="left"/>
+      <w:pPr>
+        <w:ind w:left="6480" w:hanging="360"/>
+      </w:pPr>
+      <w:rPr>
+        <w:rFonts w:ascii="Wingdings" w:hAnsi="Wingdings" w:hint="default"/>
+      </w:rPr>
+    </w:lvl>
+  </w:abstractNum>
+  <w:num w:numId="1" w16cid:durableId="1827821009">
+    <w:abstractNumId w:val="1"/>
+  </w:num>
+  <w:num w:numId="2" w16cid:durableId="1426074025">
+    <w:abstractNumId w:val="2"/>
+  </w:num>
+  <w:num w:numId="3" w16cid:durableId="169639814">
     <w:abstractNumId w:val="0"/>
+  </w:num>
+  <w:num w:numId="4" w16cid:durableId="483933651">
+    <w:abstractNumId w:val="3"/>
   </w:num>
 </w:numbering>
 </file>
 
 <file path=word/styles.xml><?xml version="1.0" encoding="utf-8"?>
-<w:styles xmlns:mc="http://schemas.openxmlformats.org/markup-compatibility/2006" xmlns:r="http://schemas.openxmlformats.org/officeDocument/2006/relationships" xmlns:w="http://schemas.openxmlformats.org/wordprocessingml/2006/main" xmlns:w14="http://schemas.microsoft.com/office/word/2010/wordml" xmlns:w15="http://schemas.microsoft.com/office/word/2012/wordml" xmlns:w16cex="http://schemas.microsoft.com/office/word/2018/wordml/cex" xmlns:w16cid="http://schemas.microsoft.com/office/word/2016/wordml/cid" xmlns:w16="http://schemas.microsoft.com/office/word/2018/wordml" xmlns:w16sdtdh="http://schemas.microsoft.com/office/word/2020/wordml/sdtdatahash" xmlns:w16se="http://schemas.microsoft.com/office/word/2015/wordml/symex" mc:Ignorable="w14 w15 w16se w16cid w16 w16cex w16sdtdh">
+<w:styles xmlns:mc="http://schemas.openxmlformats.org/markup-compatibility/2006" xmlns:r="http://schemas.openxmlformats.org/officeDocument/2006/relationships" xmlns:w="http://schemas.openxmlformats.org/wordprocessingml/2006/main" xmlns:w14="http://schemas.microsoft.com/office/word/2010/wordml" xmlns:w15="http://schemas.microsoft.com/office/word/2012/wordml" xmlns:w16cex="http://schemas.microsoft.com/office/word/2018/wordml/cex" xmlns:w16cid="http://schemas.microsoft.com/office/word/2016/wordml/cid" xmlns:w16="http://schemas.microsoft.com/office/word/2018/wordml" xmlns:w16du="http://schemas.microsoft.com/office/word/2023/wordml/word16du" xmlns:w16sdtdh="http://schemas.microsoft.com/office/word/2020/wordml/sdtdatahash" xmlns:w16sdtfl="http://schemas.microsoft.com/office/word/2024/wordml/sdtformatlock" xmlns:w16se="http://schemas.microsoft.com/office/word/2015/wordml/symex" mc:Ignorable="w14 w15 w16se w16cid w16 w16cex w16sdtdh w16sdtfl w16du">
   <w:docDefaults>
     <w:rPrDefault>
       <w:rPr>
@@ -2443,13 +4758,13 @@
     <w:name w:val="Normal"/>
     <w:qFormat/>
   </w:style>
-  <w:style w:type="character" w:default="1" w:styleId="DefaultParagraphFont">
+  <w:style w:type="character" w:default="1" w:styleId="Policepardfaut">
     <w:name w:val="Default Paragraph Font"/>
     <w:uiPriority w:val="1"/>
     <w:semiHidden/>
     <w:unhideWhenUsed/>
   </w:style>
-  <w:style w:type="table" w:default="1" w:styleId="TableNormal">
+  <w:style w:type="table" w:default="1" w:styleId="TableauNormal">
     <w:name w:val="Normal Table"/>
     <w:uiPriority w:val="99"/>
     <w:semiHidden/>
@@ -2464,15 +4779,15 @@
       </w:tblCellMar>
     </w:tblPr>
   </w:style>
-  <w:style w:type="numbering" w:default="1" w:styleId="NoList">
+  <w:style w:type="numbering" w:default="1" w:styleId="Aucuneliste">
     <w:name w:val="No List"/>
     <w:uiPriority w:val="99"/>
     <w:semiHidden/>
     <w:unhideWhenUsed/>
   </w:style>
-  <w:style w:type="table" w:styleId="TableGrid">
+  <w:style w:type="table" w:styleId="Grilledutableau">
     <w:name w:val="Table Grid"/>
-    <w:basedOn w:val="TableNormal"/>
+    <w:basedOn w:val="TableauNormal"/>
     <w:uiPriority w:val="39"/>
     <w:rsid w:val="00262165"/>
     <w:pPr>
@@ -2489,7 +4804,7 @@
       </w:tblBorders>
     </w:tblPr>
   </w:style>
-  <w:style w:type="paragraph" w:styleId="ListParagraph">
+  <w:style w:type="paragraph" w:styleId="Paragraphedeliste">
     <w:name w:val="List Paragraph"/>
     <w:basedOn w:val="Normal"/>
     <w:uiPriority w:val="34"/>

</xml_diff>